<commit_message>
Adding Changes to the report
</commit_message>
<xml_diff>
--- a/Portfolio Optimization Report.docx
+++ b/Portfolio Optimization Report.docx
@@ -308,7 +308,7 @@
             </w:rPr>
             <w:fldChar w:fldCharType="separate"/>
           </w:r>
-          <w:hyperlink w:anchor="_Toc226495500" w:history="1">
+          <w:hyperlink w:anchor="_Toc226757931" w:history="1">
             <w:r>
               <w:rPr>
                 <w:rStyle w:val="Hyperlink"/>
@@ -355,7 +355,7 @@
                 <w:noProof/>
                 <w:webHidden/>
               </w:rPr>
-              <w:instrText xml:space="preserve"> PAGEREF _Toc226495500 \h </w:instrText>
+              <w:instrText xml:space="preserve"> PAGEREF _Toc226757931 \h </w:instrText>
             </w:r>
             <w:r>
               <w:rPr>
@@ -404,7 +404,7 @@
               <w14:ligatures w14:val="standardContextual"/>
             </w:rPr>
           </w:pPr>
-          <w:hyperlink w:anchor="_Toc226495501" w:history="1">
+          <w:hyperlink w:anchor="_Toc226757932" w:history="1">
             <w:r>
               <w:rPr>
                 <w:rStyle w:val="Hyperlink"/>
@@ -423,24 +423,24 @@
                 <w:lang w:eastAsia="en-US"/>
                 <w14:ligatures w14:val="standardContextual"/>
               </w:rPr>
+              <w:t xml:space="preserve"> </w:t>
+            </w:r>
+            <w:r>
+              <w:rPr>
+                <w:rStyle w:val="Hyperlink"/>
+                <w:noProof/>
+              </w:rPr>
+              <w:t>The Sri Lankan Investment Landscape</w:t>
+            </w:r>
+            <w:r>
+              <w:rPr>
+                <w:noProof/>
+                <w:webHidden/>
+              </w:rPr>
               <w:tab/>
             </w:r>
             <w:r>
               <w:rPr>
-                <w:rStyle w:val="Hyperlink"/>
-                <w:noProof/>
-              </w:rPr>
-              <w:t>The Sri Lankan Investment Landscape</w:t>
-            </w:r>
-            <w:r>
-              <w:rPr>
-                <w:noProof/>
-                <w:webHidden/>
-              </w:rPr>
-              <w:tab/>
-            </w:r>
-            <w:r>
-              <w:rPr>
                 <w:noProof/>
                 <w:webHidden/>
               </w:rPr>
@@ -451,7 +451,7 @@
                 <w:noProof/>
                 <w:webHidden/>
               </w:rPr>
-              <w:instrText xml:space="preserve"> PAGEREF _Toc226495501 \h </w:instrText>
+              <w:instrText xml:space="preserve"> PAGEREF _Toc226757932 \h </w:instrText>
             </w:r>
             <w:r>
               <w:rPr>
@@ -499,7 +499,7 @@
               <w14:ligatures w14:val="standardContextual"/>
             </w:rPr>
           </w:pPr>
-          <w:hyperlink w:anchor="_Toc226495502" w:history="1">
+          <w:hyperlink w:anchor="_Toc226757933" w:history="1">
             <w:r>
               <w:rPr>
                 <w:rStyle w:val="Hyperlink"/>
@@ -526,7 +526,7 @@
                 <w:noProof/>
                 <w:webHidden/>
               </w:rPr>
-              <w:instrText xml:space="preserve"> PAGEREF _Toc226495502 \h </w:instrText>
+              <w:instrText xml:space="preserve"> PAGEREF _Toc226757933 \h </w:instrText>
             </w:r>
             <w:r>
               <w:rPr>
@@ -574,7 +574,7 @@
               <w14:ligatures w14:val="standardContextual"/>
             </w:rPr>
           </w:pPr>
-          <w:hyperlink w:anchor="_Toc226495503" w:history="1">
+          <w:hyperlink w:anchor="_Toc226757934" w:history="1">
             <w:r>
               <w:rPr>
                 <w:rStyle w:val="Hyperlink"/>
@@ -601,7 +601,7 @@
                 <w:noProof/>
                 <w:webHidden/>
               </w:rPr>
-              <w:instrText xml:space="preserve"> PAGEREF _Toc226495503 \h </w:instrText>
+              <w:instrText xml:space="preserve"> PAGEREF _Toc226757934 \h </w:instrText>
             </w:r>
             <w:r>
               <w:rPr>
@@ -650,7 +650,7 @@
               <w14:ligatures w14:val="standardContextual"/>
             </w:rPr>
           </w:pPr>
-          <w:hyperlink w:anchor="_Toc226495504" w:history="1">
+          <w:hyperlink w:anchor="_Toc226757935" w:history="1">
             <w:r>
               <w:rPr>
                 <w:rStyle w:val="Hyperlink"/>
@@ -697,7 +697,7 @@
                 <w:noProof/>
                 <w:webHidden/>
               </w:rPr>
-              <w:instrText xml:space="preserve"> PAGEREF _Toc226495504 \h </w:instrText>
+              <w:instrText xml:space="preserve"> PAGEREF _Toc226757935 \h </w:instrText>
             </w:r>
             <w:r>
               <w:rPr>
@@ -746,7 +746,7 @@
               <w14:ligatures w14:val="standardContextual"/>
             </w:rPr>
           </w:pPr>
-          <w:hyperlink w:anchor="_Toc226495505" w:history="1">
+          <w:hyperlink w:anchor="_Toc226757936" w:history="1">
             <w:r>
               <w:rPr>
                 <w:rStyle w:val="Hyperlink"/>
@@ -765,24 +765,24 @@
                 <w:lang w:eastAsia="en-US"/>
                 <w14:ligatures w14:val="standardContextual"/>
               </w:rPr>
+              <w:t xml:space="preserve"> </w:t>
+            </w:r>
+            <w:r>
+              <w:rPr>
+                <w:rStyle w:val="Hyperlink"/>
+                <w:noProof/>
+              </w:rPr>
+              <w:t>Problem Context and Formal Statement</w:t>
+            </w:r>
+            <w:r>
+              <w:rPr>
+                <w:noProof/>
+                <w:webHidden/>
+              </w:rPr>
               <w:tab/>
             </w:r>
             <w:r>
               <w:rPr>
-                <w:rStyle w:val="Hyperlink"/>
-                <w:noProof/>
-              </w:rPr>
-              <w:t>Problem Context and Formal Statement</w:t>
-            </w:r>
-            <w:r>
-              <w:rPr>
-                <w:noProof/>
-                <w:webHidden/>
-              </w:rPr>
-              <w:tab/>
-            </w:r>
-            <w:r>
-              <w:rPr>
                 <w:noProof/>
                 <w:webHidden/>
               </w:rPr>
@@ -793,7 +793,7 @@
                 <w:noProof/>
                 <w:webHidden/>
               </w:rPr>
-              <w:instrText xml:space="preserve"> PAGEREF _Toc226495505 \h </w:instrText>
+              <w:instrText xml:space="preserve"> PAGEREF _Toc226757936 \h </w:instrText>
             </w:r>
             <w:r>
               <w:rPr>
@@ -841,7 +841,7 @@
               <w14:ligatures w14:val="standardContextual"/>
             </w:rPr>
           </w:pPr>
-          <w:hyperlink w:anchor="_Toc226495506" w:history="1">
+          <w:hyperlink w:anchor="_Toc226757937" w:history="1">
             <w:r>
               <w:rPr>
                 <w:rStyle w:val="Hyperlink"/>
@@ -868,7 +868,7 @@
                 <w:noProof/>
                 <w:webHidden/>
               </w:rPr>
-              <w:instrText xml:space="preserve"> PAGEREF _Toc226495506 \h </w:instrText>
+              <w:instrText xml:space="preserve"> PAGEREF _Toc226757937 \h </w:instrText>
             </w:r>
             <w:r>
               <w:rPr>
@@ -916,7 +916,7 @@
               <w14:ligatures w14:val="standardContextual"/>
             </w:rPr>
           </w:pPr>
-          <w:hyperlink w:anchor="_Toc226495507" w:history="1">
+          <w:hyperlink w:anchor="_Toc226757938" w:history="1">
             <w:r>
               <w:rPr>
                 <w:rStyle w:val="Hyperlink"/>
@@ -943,7 +943,7 @@
                 <w:noProof/>
                 <w:webHidden/>
               </w:rPr>
-              <w:instrText xml:space="preserve"> PAGEREF _Toc226495507 \h </w:instrText>
+              <w:instrText xml:space="preserve"> PAGEREF _Toc226757938 \h </w:instrText>
             </w:r>
             <w:r>
               <w:rPr>
@@ -991,7 +991,7 @@
               <w14:ligatures w14:val="standardContextual"/>
             </w:rPr>
           </w:pPr>
-          <w:hyperlink w:anchor="_Toc226495508" w:history="1">
+          <w:hyperlink w:anchor="_Toc226757939" w:history="1">
             <w:r>
               <w:rPr>
                 <w:rStyle w:val="Hyperlink"/>
@@ -1018,7 +1018,7 @@
                 <w:noProof/>
                 <w:webHidden/>
               </w:rPr>
-              <w:instrText xml:space="preserve"> PAGEREF _Toc226495508 \h </w:instrText>
+              <w:instrText xml:space="preserve"> PAGEREF _Toc226757939 \h </w:instrText>
             </w:r>
             <w:r>
               <w:rPr>
@@ -1066,7 +1066,7 @@
               <w14:ligatures w14:val="standardContextual"/>
             </w:rPr>
           </w:pPr>
-          <w:hyperlink w:anchor="_Toc226495509" w:history="1">
+          <w:hyperlink w:anchor="_Toc226757940" w:history="1">
             <w:r>
               <w:rPr>
                 <w:rStyle w:val="Hyperlink"/>
@@ -1093,7 +1093,7 @@
                 <w:noProof/>
                 <w:webHidden/>
               </w:rPr>
-              <w:instrText xml:space="preserve"> PAGEREF _Toc226495509 \h </w:instrText>
+              <w:instrText xml:space="preserve"> PAGEREF _Toc226757940 \h </w:instrText>
             </w:r>
             <w:r>
               <w:rPr>
@@ -1142,7 +1142,7 @@
               <w14:ligatures w14:val="standardContextual"/>
             </w:rPr>
           </w:pPr>
-          <w:hyperlink w:anchor="_Toc226495510" w:history="1">
+          <w:hyperlink w:anchor="_Toc226757941" w:history="1">
             <w:r>
               <w:rPr>
                 <w:rStyle w:val="Hyperlink"/>
@@ -1189,7 +1189,7 @@
                 <w:noProof/>
                 <w:webHidden/>
               </w:rPr>
-              <w:instrText xml:space="preserve"> PAGEREF _Toc226495510 \h </w:instrText>
+              <w:instrText xml:space="preserve"> PAGEREF _Toc226757941 \h </w:instrText>
             </w:r>
             <w:r>
               <w:rPr>
@@ -1237,7 +1237,7 @@
               <w14:ligatures w14:val="standardContextual"/>
             </w:rPr>
           </w:pPr>
-          <w:hyperlink w:anchor="_Toc226495511" w:history="1">
+          <w:hyperlink w:anchor="_Toc226757942" w:history="1">
             <w:r>
               <w:rPr>
                 <w:rStyle w:val="Hyperlink"/>
@@ -1264,7 +1264,7 @@
                 <w:noProof/>
                 <w:webHidden/>
               </w:rPr>
-              <w:instrText xml:space="preserve"> PAGEREF _Toc226495511 \h </w:instrText>
+              <w:instrText xml:space="preserve"> PAGEREF _Toc226757942 \h </w:instrText>
             </w:r>
             <w:r>
               <w:rPr>
@@ -1312,7 +1312,7 @@
               <w14:ligatures w14:val="standardContextual"/>
             </w:rPr>
           </w:pPr>
-          <w:hyperlink w:anchor="_Toc226495512" w:history="1">
+          <w:hyperlink w:anchor="_Toc226757943" w:history="1">
             <w:r>
               <w:rPr>
                 <w:rStyle w:val="Hyperlink"/>
@@ -1339,7 +1339,7 @@
                 <w:noProof/>
                 <w:webHidden/>
               </w:rPr>
-              <w:instrText xml:space="preserve"> PAGEREF _Toc226495512 \h </w:instrText>
+              <w:instrText xml:space="preserve"> PAGEREF _Toc226757943 \h </w:instrText>
             </w:r>
             <w:r>
               <w:rPr>
@@ -1387,7 +1387,7 @@
               <w14:ligatures w14:val="standardContextual"/>
             </w:rPr>
           </w:pPr>
-          <w:hyperlink w:anchor="_Toc226495513" w:history="1">
+          <w:hyperlink w:anchor="_Toc226757944" w:history="1">
             <w:r>
               <w:rPr>
                 <w:rStyle w:val="Hyperlink"/>
@@ -1414,7 +1414,7 @@
                 <w:noProof/>
                 <w:webHidden/>
               </w:rPr>
-              <w:instrText xml:space="preserve"> PAGEREF _Toc226495513 \h </w:instrText>
+              <w:instrText xml:space="preserve"> PAGEREF _Toc226757944 \h </w:instrText>
             </w:r>
             <w:r>
               <w:rPr>
@@ -1463,7 +1463,7 @@
               <w14:ligatures w14:val="standardContextual"/>
             </w:rPr>
           </w:pPr>
-          <w:hyperlink w:anchor="_Toc226495514" w:history="1">
+          <w:hyperlink w:anchor="_Toc226757945" w:history="1">
             <w:r>
               <w:rPr>
                 <w:rStyle w:val="Hyperlink"/>
@@ -1482,24 +1482,24 @@
                 <w:lang w:eastAsia="en-US"/>
                 <w14:ligatures w14:val="standardContextual"/>
               </w:rPr>
+              <w:t xml:space="preserve"> </w:t>
+            </w:r>
+            <w:r>
+              <w:rPr>
+                <w:rStyle w:val="Hyperlink"/>
+                <w:noProof/>
+              </w:rPr>
+              <w:t>Equivalent Reformulation for the Exact Method</w:t>
+            </w:r>
+            <w:r>
+              <w:rPr>
+                <w:noProof/>
+                <w:webHidden/>
+              </w:rPr>
               <w:tab/>
             </w:r>
             <w:r>
               <w:rPr>
-                <w:rStyle w:val="Hyperlink"/>
-                <w:noProof/>
-              </w:rPr>
-              <w:t>Equivalent Reformulation for the Exact Method</w:t>
-            </w:r>
-            <w:r>
-              <w:rPr>
-                <w:noProof/>
-                <w:webHidden/>
-              </w:rPr>
-              <w:tab/>
-            </w:r>
-            <w:r>
-              <w:rPr>
                 <w:noProof/>
                 <w:webHidden/>
               </w:rPr>
@@ -1510,7 +1510,7 @@
                 <w:noProof/>
                 <w:webHidden/>
               </w:rPr>
-              <w:instrText xml:space="preserve"> PAGEREF _Toc226495514 \h </w:instrText>
+              <w:instrText xml:space="preserve"> PAGEREF _Toc226757945 \h </w:instrText>
             </w:r>
             <w:r>
               <w:rPr>
@@ -1559,7 +1559,7 @@
               <w14:ligatures w14:val="standardContextual"/>
             </w:rPr>
           </w:pPr>
-          <w:hyperlink w:anchor="_Toc226495515" w:history="1">
+          <w:hyperlink w:anchor="_Toc226757946" w:history="1">
             <w:r>
               <w:rPr>
                 <w:rStyle w:val="Hyperlink"/>
@@ -1578,24 +1578,24 @@
                 <w:lang w:eastAsia="en-US"/>
                 <w14:ligatures w14:val="standardContextual"/>
               </w:rPr>
+              <w:t xml:space="preserve"> </w:t>
+            </w:r>
+            <w:r>
+              <w:rPr>
+                <w:rStyle w:val="Hyperlink"/>
+                <w:noProof/>
+              </w:rPr>
+              <w:t>NP-Hardness and Motivation for Heuristics</w:t>
+            </w:r>
+            <w:r>
+              <w:rPr>
+                <w:noProof/>
+                <w:webHidden/>
+              </w:rPr>
               <w:tab/>
             </w:r>
             <w:r>
               <w:rPr>
-                <w:rStyle w:val="Hyperlink"/>
-                <w:noProof/>
-              </w:rPr>
-              <w:t>NP-Hardness and Motivation for Heuristics</w:t>
-            </w:r>
-            <w:r>
-              <w:rPr>
-                <w:noProof/>
-                <w:webHidden/>
-              </w:rPr>
-              <w:tab/>
-            </w:r>
-            <w:r>
-              <w:rPr>
                 <w:noProof/>
                 <w:webHidden/>
               </w:rPr>
@@ -1606,7 +1606,7 @@
                 <w:noProof/>
                 <w:webHidden/>
               </w:rPr>
-              <w:instrText xml:space="preserve"> PAGEREF _Toc226495515 \h </w:instrText>
+              <w:instrText xml:space="preserve"> PAGEREF _Toc226757946 \h </w:instrText>
             </w:r>
             <w:r>
               <w:rPr>
@@ -1655,7 +1655,7 @@
               <w14:ligatures w14:val="standardContextual"/>
             </w:rPr>
           </w:pPr>
-          <w:hyperlink w:anchor="_Toc226495516" w:history="1">
+          <w:hyperlink w:anchor="_Toc226757947" w:history="1">
             <w:r>
               <w:rPr>
                 <w:rStyle w:val="Hyperlink"/>
@@ -1702,7 +1702,7 @@
                 <w:noProof/>
                 <w:webHidden/>
               </w:rPr>
-              <w:instrText xml:space="preserve"> PAGEREF _Toc226495516 \h </w:instrText>
+              <w:instrText xml:space="preserve"> PAGEREF _Toc226757947 \h </w:instrText>
             </w:r>
             <w:r>
               <w:rPr>
@@ -1751,7 +1751,7 @@
               <w14:ligatures w14:val="standardContextual"/>
             </w:rPr>
           </w:pPr>
-          <w:hyperlink w:anchor="_Toc226495517" w:history="1">
+          <w:hyperlink w:anchor="_Toc226757948" w:history="1">
             <w:r>
               <w:rPr>
                 <w:rStyle w:val="Hyperlink"/>
@@ -1770,24 +1770,24 @@
                 <w:lang w:eastAsia="en-US"/>
                 <w14:ligatures w14:val="standardContextual"/>
               </w:rPr>
+              <w:t xml:space="preserve"> </w:t>
+            </w:r>
+            <w:r>
+              <w:rPr>
+                <w:rStyle w:val="Hyperlink"/>
+                <w:noProof/>
+              </w:rPr>
+              <w:t>Method 1 — Branch and Bound (Exact)</w:t>
+            </w:r>
+            <w:r>
+              <w:rPr>
+                <w:noProof/>
+                <w:webHidden/>
+              </w:rPr>
               <w:tab/>
             </w:r>
             <w:r>
               <w:rPr>
-                <w:rStyle w:val="Hyperlink"/>
-                <w:noProof/>
-              </w:rPr>
-              <w:t>Method 1 — Branch and Bound (Exact)</w:t>
-            </w:r>
-            <w:r>
-              <w:rPr>
-                <w:noProof/>
-                <w:webHidden/>
-              </w:rPr>
-              <w:tab/>
-            </w:r>
-            <w:r>
-              <w:rPr>
                 <w:noProof/>
                 <w:webHidden/>
               </w:rPr>
@@ -1798,7 +1798,7 @@
                 <w:noProof/>
                 <w:webHidden/>
               </w:rPr>
-              <w:instrText xml:space="preserve"> PAGEREF _Toc226495517 \h </w:instrText>
+              <w:instrText xml:space="preserve"> PAGEREF _Toc226757948 \h </w:instrText>
             </w:r>
             <w:r>
               <w:rPr>
@@ -1847,7 +1847,7 @@
               <w14:ligatures w14:val="standardContextual"/>
             </w:rPr>
           </w:pPr>
-          <w:hyperlink w:anchor="_Toc226495518" w:history="1">
+          <w:hyperlink w:anchor="_Toc226757949" w:history="1">
             <w:r>
               <w:rPr>
                 <w:rStyle w:val="Hyperlink"/>
@@ -1866,24 +1866,24 @@
                 <w:lang w:eastAsia="en-US"/>
                 <w14:ligatures w14:val="standardContextual"/>
               </w:rPr>
+              <w:t xml:space="preserve"> </w:t>
+            </w:r>
+            <w:r>
+              <w:rPr>
+                <w:rStyle w:val="Hyperlink"/>
+                <w:noProof/>
+              </w:rPr>
+              <w:t>Method 2 — Genetic Algorithm (Metaheuristic)</w:t>
+            </w:r>
+            <w:r>
+              <w:rPr>
+                <w:noProof/>
+                <w:webHidden/>
+              </w:rPr>
               <w:tab/>
             </w:r>
             <w:r>
               <w:rPr>
-                <w:rStyle w:val="Hyperlink"/>
-                <w:noProof/>
-              </w:rPr>
-              <w:t>Method 2 — Genetic Algorithm (Metaheuristic)</w:t>
-            </w:r>
-            <w:r>
-              <w:rPr>
-                <w:noProof/>
-                <w:webHidden/>
-              </w:rPr>
-              <w:tab/>
-            </w:r>
-            <w:r>
-              <w:rPr>
                 <w:noProof/>
                 <w:webHidden/>
               </w:rPr>
@@ -1894,7 +1894,7 @@
                 <w:noProof/>
                 <w:webHidden/>
               </w:rPr>
-              <w:instrText xml:space="preserve"> PAGEREF _Toc226495518 \h </w:instrText>
+              <w:instrText xml:space="preserve"> PAGEREF _Toc226757949 \h </w:instrText>
             </w:r>
             <w:r>
               <w:rPr>
@@ -1943,7 +1943,7 @@
               <w14:ligatures w14:val="standardContextual"/>
             </w:rPr>
           </w:pPr>
-          <w:hyperlink w:anchor="_Toc226495519" w:history="1">
+          <w:hyperlink w:anchor="_Toc226757950" w:history="1">
             <w:r>
               <w:rPr>
                 <w:rStyle w:val="Hyperlink"/>
@@ -1962,24 +1962,24 @@
                 <w:lang w:eastAsia="en-US"/>
                 <w14:ligatures w14:val="standardContextual"/>
               </w:rPr>
+              <w:t xml:space="preserve"> </w:t>
+            </w:r>
+            <w:r>
+              <w:rPr>
+                <w:rStyle w:val="Hyperlink"/>
+                <w:noProof/>
+              </w:rPr>
+              <w:t>Complementarity of the Two Methods</w:t>
+            </w:r>
+            <w:r>
+              <w:rPr>
+                <w:noProof/>
+                <w:webHidden/>
+              </w:rPr>
               <w:tab/>
             </w:r>
             <w:r>
               <w:rPr>
-                <w:rStyle w:val="Hyperlink"/>
-                <w:noProof/>
-              </w:rPr>
-              <w:t>Complementarity of the Two Methods</w:t>
-            </w:r>
-            <w:r>
-              <w:rPr>
-                <w:noProof/>
-                <w:webHidden/>
-              </w:rPr>
-              <w:tab/>
-            </w:r>
-            <w:r>
-              <w:rPr>
                 <w:noProof/>
                 <w:webHidden/>
               </w:rPr>
@@ -1990,7 +1990,7 @@
                 <w:noProof/>
                 <w:webHidden/>
               </w:rPr>
-              <w:instrText xml:space="preserve"> PAGEREF _Toc226495519 \h </w:instrText>
+              <w:instrText xml:space="preserve"> PAGEREF _Toc226757950 \h </w:instrText>
             </w:r>
             <w:r>
               <w:rPr>
@@ -2039,7 +2039,7 @@
               <w14:ligatures w14:val="standardContextual"/>
             </w:rPr>
           </w:pPr>
-          <w:hyperlink w:anchor="_Toc226495520" w:history="1">
+          <w:hyperlink w:anchor="_Toc226757951" w:history="1">
             <w:r>
               <w:rPr>
                 <w:rStyle w:val="Hyperlink"/>
@@ -2086,7 +2086,7 @@
                 <w:noProof/>
                 <w:webHidden/>
               </w:rPr>
-              <w:instrText xml:space="preserve"> PAGEREF _Toc226495520 \h </w:instrText>
+              <w:instrText xml:space="preserve"> PAGEREF _Toc226757951 \h </w:instrText>
             </w:r>
             <w:r>
               <w:rPr>
@@ -2135,7 +2135,7 @@
               <w14:ligatures w14:val="standardContextual"/>
             </w:rPr>
           </w:pPr>
-          <w:hyperlink w:anchor="_Toc226495521" w:history="1">
+          <w:hyperlink w:anchor="_Toc226757952" w:history="1">
             <w:r>
               <w:rPr>
                 <w:rStyle w:val="Hyperlink"/>
@@ -2154,24 +2154,24 @@
                 <w:lang w:eastAsia="en-US"/>
                 <w14:ligatures w14:val="standardContextual"/>
               </w:rPr>
+              <w:t xml:space="preserve"> </w:t>
+            </w:r>
+            <w:r>
+              <w:rPr>
+                <w:rStyle w:val="Hyperlink"/>
+                <w:noProof/>
+              </w:rPr>
+              <w:t>Environment and Dependencies</w:t>
+            </w:r>
+            <w:r>
+              <w:rPr>
+                <w:noProof/>
+                <w:webHidden/>
+              </w:rPr>
               <w:tab/>
             </w:r>
             <w:r>
               <w:rPr>
-                <w:rStyle w:val="Hyperlink"/>
-                <w:noProof/>
-              </w:rPr>
-              <w:t>Environment and Dependencies</w:t>
-            </w:r>
-            <w:r>
-              <w:rPr>
-                <w:noProof/>
-                <w:webHidden/>
-              </w:rPr>
-              <w:tab/>
-            </w:r>
-            <w:r>
-              <w:rPr>
                 <w:noProof/>
                 <w:webHidden/>
               </w:rPr>
@@ -2182,7 +2182,7 @@
                 <w:noProof/>
                 <w:webHidden/>
               </w:rPr>
-              <w:instrText xml:space="preserve"> PAGEREF _Toc226495521 \h </w:instrText>
+              <w:instrText xml:space="preserve"> PAGEREF _Toc226757952 \h </w:instrText>
             </w:r>
             <w:r>
               <w:rPr>
@@ -2231,7 +2231,7 @@
               <w14:ligatures w14:val="standardContextual"/>
             </w:rPr>
           </w:pPr>
-          <w:hyperlink w:anchor="_Toc226495522" w:history="1">
+          <w:hyperlink w:anchor="_Toc226757953" w:history="1">
             <w:r>
               <w:rPr>
                 <w:rStyle w:val="Hyperlink"/>
@@ -2250,24 +2250,24 @@
                 <w:lang w:eastAsia="en-US"/>
                 <w14:ligatures w14:val="standardContextual"/>
               </w:rPr>
+              <w:t xml:space="preserve"> </w:t>
+            </w:r>
+            <w:r>
+              <w:rPr>
+                <w:rStyle w:val="Hyperlink"/>
+                <w:noProof/>
+              </w:rPr>
+              <w:t>Data Pipeline Implementation notebook</w:t>
+            </w:r>
+            <w:r>
+              <w:rPr>
+                <w:noProof/>
+                <w:webHidden/>
+              </w:rPr>
               <w:tab/>
             </w:r>
             <w:r>
               <w:rPr>
-                <w:rStyle w:val="Hyperlink"/>
-                <w:noProof/>
-              </w:rPr>
-              <w:t>Data Pipeline Implementation notebook</w:t>
-            </w:r>
-            <w:r>
-              <w:rPr>
-                <w:noProof/>
-                <w:webHidden/>
-              </w:rPr>
-              <w:tab/>
-            </w:r>
-            <w:r>
-              <w:rPr>
                 <w:noProof/>
                 <w:webHidden/>
               </w:rPr>
@@ -2278,7 +2278,7 @@
                 <w:noProof/>
                 <w:webHidden/>
               </w:rPr>
-              <w:instrText xml:space="preserve"> PAGEREF _Toc226495522 \h </w:instrText>
+              <w:instrText xml:space="preserve"> PAGEREF _Toc226757953 \h </w:instrText>
             </w:r>
             <w:r>
               <w:rPr>
@@ -2327,7 +2327,7 @@
               <w14:ligatures w14:val="standardContextual"/>
             </w:rPr>
           </w:pPr>
-          <w:hyperlink w:anchor="_Toc226495523" w:history="1">
+          <w:hyperlink w:anchor="_Toc226757954" w:history="1">
             <w:r>
               <w:rPr>
                 <w:rStyle w:val="Hyperlink"/>
@@ -2337,33 +2337,27 @@
             </w:r>
             <w:r>
               <w:rPr>
-                <w:rFonts w:asciiTheme="minorHAnsi" w:eastAsiaTheme="minorEastAsia" w:hAnsiTheme="minorHAnsi"/>
-                <w:noProof/>
-                <w:color w:val="auto"/>
-                <w:kern w:val="2"/>
-                <w:sz w:val="24"/>
-                <w:szCs w:val="24"/>
-                <w:lang w:eastAsia="en-US"/>
-                <w14:ligatures w14:val="standardContextual"/>
+                <w:rStyle w:val="Hyperlink"/>
+                <w:noProof/>
+              </w:rPr>
+              <w:t xml:space="preserve"> </w:t>
+            </w:r>
+            <w:r>
+              <w:rPr>
+                <w:rStyle w:val="Hyperlink"/>
+                <w:noProof/>
+              </w:rPr>
+              <w:t>Branch and Bound — Key Implementation Details</w:t>
+            </w:r>
+            <w:r>
+              <w:rPr>
+                <w:noProof/>
+                <w:webHidden/>
               </w:rPr>
               <w:tab/>
             </w:r>
             <w:r>
               <w:rPr>
-                <w:rStyle w:val="Hyperlink"/>
-                <w:noProof/>
-              </w:rPr>
-              <w:t>Branch and Bound — Key Implementation Details</w:t>
-            </w:r>
-            <w:r>
-              <w:rPr>
-                <w:noProof/>
-                <w:webHidden/>
-              </w:rPr>
-              <w:tab/>
-            </w:r>
-            <w:r>
-              <w:rPr>
                 <w:noProof/>
                 <w:webHidden/>
               </w:rPr>
@@ -2374,7 +2368,7 @@
                 <w:noProof/>
                 <w:webHidden/>
               </w:rPr>
-              <w:instrText xml:space="preserve"> PAGEREF _Toc226495523 \h </w:instrText>
+              <w:instrText xml:space="preserve"> PAGEREF _Toc226757954 \h </w:instrText>
             </w:r>
             <w:r>
               <w:rPr>
@@ -2423,7 +2417,7 @@
               <w14:ligatures w14:val="standardContextual"/>
             </w:rPr>
           </w:pPr>
-          <w:hyperlink w:anchor="_Toc226495524" w:history="1">
+          <w:hyperlink w:anchor="_Toc226757955" w:history="1">
             <w:r>
               <w:rPr>
                 <w:rStyle w:val="Hyperlink"/>
@@ -2433,33 +2427,27 @@
             </w:r>
             <w:r>
               <w:rPr>
-                <w:rFonts w:asciiTheme="minorHAnsi" w:eastAsiaTheme="minorEastAsia" w:hAnsiTheme="minorHAnsi"/>
-                <w:noProof/>
-                <w:color w:val="auto"/>
-                <w:kern w:val="2"/>
-                <w:sz w:val="24"/>
-                <w:szCs w:val="24"/>
-                <w:lang w:eastAsia="en-US"/>
-                <w14:ligatures w14:val="standardContextual"/>
+                <w:rStyle w:val="Hyperlink"/>
+                <w:noProof/>
+              </w:rPr>
+              <w:t xml:space="preserve"> </w:t>
+            </w:r>
+            <w:r>
+              <w:rPr>
+                <w:rStyle w:val="Hyperlink"/>
+                <w:noProof/>
+              </w:rPr>
+              <w:t>Genetic Algorithm — Key Implementation Details</w:t>
+            </w:r>
+            <w:r>
+              <w:rPr>
+                <w:noProof/>
+                <w:webHidden/>
               </w:rPr>
               <w:tab/>
             </w:r>
             <w:r>
               <w:rPr>
-                <w:rStyle w:val="Hyperlink"/>
-                <w:noProof/>
-              </w:rPr>
-              <w:t>Genetic Algorithm — Key Implementation Details</w:t>
-            </w:r>
-            <w:r>
-              <w:rPr>
-                <w:noProof/>
-                <w:webHidden/>
-              </w:rPr>
-              <w:tab/>
-            </w:r>
-            <w:r>
-              <w:rPr>
                 <w:noProof/>
                 <w:webHidden/>
               </w:rPr>
@@ -2470,7 +2458,7 @@
                 <w:noProof/>
                 <w:webHidden/>
               </w:rPr>
-              <w:instrText xml:space="preserve"> PAGEREF _Toc226495524 \h </w:instrText>
+              <w:instrText xml:space="preserve"> PAGEREF _Toc226757955 \h </w:instrText>
             </w:r>
             <w:r>
               <w:rPr>
@@ -2519,7 +2507,7 @@
               <w14:ligatures w14:val="standardContextual"/>
             </w:rPr>
           </w:pPr>
-          <w:hyperlink w:anchor="_Toc226495525" w:history="1">
+          <w:hyperlink w:anchor="_Toc226757956" w:history="1">
             <w:r>
               <w:rPr>
                 <w:rStyle w:val="Hyperlink"/>
@@ -2566,7 +2554,7 @@
                 <w:noProof/>
                 <w:webHidden/>
               </w:rPr>
-              <w:instrText xml:space="preserve"> PAGEREF _Toc226495525 \h </w:instrText>
+              <w:instrText xml:space="preserve"> PAGEREF _Toc226757956 \h </w:instrText>
             </w:r>
             <w:r>
               <w:rPr>
@@ -2614,7 +2602,7 @@
               <w14:ligatures w14:val="standardContextual"/>
             </w:rPr>
           </w:pPr>
-          <w:hyperlink w:anchor="_Toc226495526" w:history="1">
+          <w:hyperlink w:anchor="_Toc226757957" w:history="1">
             <w:r>
               <w:rPr>
                 <w:rStyle w:val="Hyperlink"/>
@@ -2641,7 +2629,7 @@
                 <w:noProof/>
                 <w:webHidden/>
               </w:rPr>
-              <w:instrText xml:space="preserve"> PAGEREF _Toc226495526 \h </w:instrText>
+              <w:instrText xml:space="preserve"> PAGEREF _Toc226757957 \h </w:instrText>
             </w:r>
             <w:r>
               <w:rPr>
@@ -2689,7 +2677,7 @@
               <w14:ligatures w14:val="standardContextual"/>
             </w:rPr>
           </w:pPr>
-          <w:hyperlink w:anchor="_Toc226495527" w:history="1">
+          <w:hyperlink w:anchor="_Toc226757958" w:history="1">
             <w:r>
               <w:rPr>
                 <w:rStyle w:val="Hyperlink"/>
@@ -2716,7 +2704,7 @@
                 <w:noProof/>
                 <w:webHidden/>
               </w:rPr>
-              <w:instrText xml:space="preserve"> PAGEREF _Toc226495527 \h </w:instrText>
+              <w:instrText xml:space="preserve"> PAGEREF _Toc226757958 \h </w:instrText>
             </w:r>
             <w:r>
               <w:rPr>
@@ -2764,7 +2752,7 @@
               <w14:ligatures w14:val="standardContextual"/>
             </w:rPr>
           </w:pPr>
-          <w:hyperlink w:anchor="_Toc226495528" w:history="1">
+          <w:hyperlink w:anchor="_Toc226757959" w:history="1">
             <w:r>
               <w:rPr>
                 <w:rStyle w:val="Hyperlink"/>
@@ -2791,7 +2779,7 @@
                 <w:noProof/>
                 <w:webHidden/>
               </w:rPr>
-              <w:instrText xml:space="preserve"> PAGEREF _Toc226495528 \h </w:instrText>
+              <w:instrText xml:space="preserve"> PAGEREF _Toc226757959 \h </w:instrText>
             </w:r>
             <w:r>
               <w:rPr>
@@ -2840,7 +2828,7 @@
               <w14:ligatures w14:val="standardContextual"/>
             </w:rPr>
           </w:pPr>
-          <w:hyperlink w:anchor="_Toc226495529" w:history="1">
+          <w:hyperlink w:anchor="_Toc226757960" w:history="1">
             <w:r>
               <w:rPr>
                 <w:rStyle w:val="Hyperlink"/>
@@ -2850,33 +2838,27 @@
             </w:r>
             <w:r>
               <w:rPr>
-                <w:rFonts w:asciiTheme="minorHAnsi" w:eastAsiaTheme="minorEastAsia" w:hAnsiTheme="minorHAnsi"/>
-                <w:noProof/>
-                <w:color w:val="auto"/>
-                <w:kern w:val="2"/>
-                <w:sz w:val="24"/>
-                <w:szCs w:val="24"/>
-                <w:lang w:eastAsia="en-US"/>
-                <w14:ligatures w14:val="standardContextual"/>
+                <w:rStyle w:val="Hyperlink"/>
+                <w:noProof/>
+              </w:rPr>
+              <w:t xml:space="preserve"> </w:t>
+            </w:r>
+            <w:r>
+              <w:rPr>
+                <w:rStyle w:val="Hyperlink"/>
+                <w:noProof/>
+              </w:rPr>
+              <w:t>Scalability Analysis</w:t>
+            </w:r>
+            <w:r>
+              <w:rPr>
+                <w:noProof/>
+                <w:webHidden/>
               </w:rPr>
               <w:tab/>
             </w:r>
             <w:r>
               <w:rPr>
-                <w:rStyle w:val="Hyperlink"/>
-                <w:noProof/>
-              </w:rPr>
-              <w:t>Scalability Analysis</w:t>
-            </w:r>
-            <w:r>
-              <w:rPr>
-                <w:noProof/>
-                <w:webHidden/>
-              </w:rPr>
-              <w:tab/>
-            </w:r>
-            <w:r>
-              <w:rPr>
                 <w:noProof/>
                 <w:webHidden/>
               </w:rPr>
@@ -2887,7 +2869,7 @@
                 <w:noProof/>
                 <w:webHidden/>
               </w:rPr>
-              <w:instrText xml:space="preserve"> PAGEREF _Toc226495529 \h </w:instrText>
+              <w:instrText xml:space="preserve"> PAGEREF _Toc226757960 \h </w:instrText>
             </w:r>
             <w:r>
               <w:rPr>
@@ -2907,7 +2889,7 @@
                 <w:noProof/>
                 <w:webHidden/>
               </w:rPr>
-              <w:t>16</w:t>
+              <w:t>17</w:t>
             </w:r>
             <w:r>
               <w:rPr>
@@ -2936,7 +2918,7 @@
               <w14:ligatures w14:val="standardContextual"/>
             </w:rPr>
           </w:pPr>
-          <w:hyperlink w:anchor="_Toc226495530" w:history="1">
+          <w:hyperlink w:anchor="_Toc226757961" w:history="1">
             <w:r>
               <w:rPr>
                 <w:rStyle w:val="Hyperlink"/>
@@ -2983,7 +2965,7 @@
                 <w:noProof/>
                 <w:webHidden/>
               </w:rPr>
-              <w:instrText xml:space="preserve"> PAGEREF _Toc226495530 \h </w:instrText>
+              <w:instrText xml:space="preserve"> PAGEREF _Toc226757961 \h </w:instrText>
             </w:r>
             <w:r>
               <w:rPr>
@@ -3003,7 +2985,7 @@
                 <w:noProof/>
                 <w:webHidden/>
               </w:rPr>
-              <w:t>16</w:t>
+              <w:t>18</w:t>
             </w:r>
             <w:r>
               <w:rPr>
@@ -3031,7 +3013,7 @@
               <w14:ligatures w14:val="standardContextual"/>
             </w:rPr>
           </w:pPr>
-          <w:hyperlink w:anchor="_Toc226495531" w:history="1">
+          <w:hyperlink w:anchor="_Toc226757962" w:history="1">
             <w:r>
               <w:rPr>
                 <w:rStyle w:val="Hyperlink"/>
@@ -3058,7 +3040,7 @@
                 <w:noProof/>
                 <w:webHidden/>
               </w:rPr>
-              <w:instrText xml:space="preserve"> PAGEREF _Toc226495531 \h </w:instrText>
+              <w:instrText xml:space="preserve"> PAGEREF _Toc226757962 \h </w:instrText>
             </w:r>
             <w:r>
               <w:rPr>
@@ -3078,7 +3060,7 @@
                 <w:noProof/>
                 <w:webHidden/>
               </w:rPr>
-              <w:t>16</w:t>
+              <w:t>18</w:t>
             </w:r>
             <w:r>
               <w:rPr>
@@ -3106,7 +3088,7 @@
               <w14:ligatures w14:val="standardContextual"/>
             </w:rPr>
           </w:pPr>
-          <w:hyperlink w:anchor="_Toc226495532" w:history="1">
+          <w:hyperlink w:anchor="_Toc226757963" w:history="1">
             <w:r>
               <w:rPr>
                 <w:rStyle w:val="Hyperlink"/>
@@ -3133,7 +3115,7 @@
                 <w:noProof/>
                 <w:webHidden/>
               </w:rPr>
-              <w:instrText xml:space="preserve"> PAGEREF _Toc226495532 \h </w:instrText>
+              <w:instrText xml:space="preserve"> PAGEREF _Toc226757963 \h </w:instrText>
             </w:r>
             <w:r>
               <w:rPr>
@@ -3153,7 +3135,7 @@
                 <w:noProof/>
                 <w:webHidden/>
               </w:rPr>
-              <w:t>17</w:t>
+              <w:t>18</w:t>
             </w:r>
             <w:r>
               <w:rPr>
@@ -3182,7 +3164,7 @@
               <w14:ligatures w14:val="standardContextual"/>
             </w:rPr>
           </w:pPr>
-          <w:hyperlink w:anchor="_Toc226495533" w:history="1">
+          <w:hyperlink w:anchor="_Toc226757964" w:history="1">
             <w:r>
               <w:rPr>
                 <w:rStyle w:val="Hyperlink"/>
@@ -3192,33 +3174,27 @@
             </w:r>
             <w:r>
               <w:rPr>
-                <w:rFonts w:asciiTheme="minorHAnsi" w:eastAsiaTheme="minorEastAsia" w:hAnsiTheme="minorHAnsi"/>
-                <w:noProof/>
-                <w:color w:val="auto"/>
-                <w:kern w:val="2"/>
-                <w:sz w:val="24"/>
-                <w:szCs w:val="24"/>
-                <w:lang w:eastAsia="en-US"/>
-                <w14:ligatures w14:val="standardContextual"/>
+                <w:rStyle w:val="Hyperlink"/>
+                <w:noProof/>
+              </w:rPr>
+              <w:t xml:space="preserve"> </w:t>
+            </w:r>
+            <w:r>
+              <w:rPr>
+                <w:rStyle w:val="Hyperlink"/>
+                <w:noProof/>
+              </w:rPr>
+              <w:t>Future Directions</w:t>
+            </w:r>
+            <w:r>
+              <w:rPr>
+                <w:noProof/>
+                <w:webHidden/>
               </w:rPr>
               <w:tab/>
             </w:r>
             <w:r>
               <w:rPr>
-                <w:rStyle w:val="Hyperlink"/>
-                <w:noProof/>
-              </w:rPr>
-              <w:t>Future Directions</w:t>
-            </w:r>
-            <w:r>
-              <w:rPr>
-                <w:noProof/>
-                <w:webHidden/>
-              </w:rPr>
-              <w:tab/>
-            </w:r>
-            <w:r>
-              <w:rPr>
                 <w:noProof/>
                 <w:webHidden/>
               </w:rPr>
@@ -3229,7 +3205,7 @@
                 <w:noProof/>
                 <w:webHidden/>
               </w:rPr>
-              <w:instrText xml:space="preserve"> PAGEREF _Toc226495533 \h </w:instrText>
+              <w:instrText xml:space="preserve"> PAGEREF _Toc226757964 \h </w:instrText>
             </w:r>
             <w:r>
               <w:rPr>
@@ -3249,7 +3225,7 @@
                 <w:noProof/>
                 <w:webHidden/>
               </w:rPr>
-              <w:t>17</w:t>
+              <w:t>19</w:t>
             </w:r>
             <w:r>
               <w:rPr>
@@ -3278,7 +3254,7 @@
               <w14:ligatures w14:val="standardContextual"/>
             </w:rPr>
           </w:pPr>
-          <w:hyperlink w:anchor="_Toc226495534" w:history="1">
+          <w:hyperlink w:anchor="_Toc226757965" w:history="1">
             <w:r>
               <w:rPr>
                 <w:rStyle w:val="Hyperlink"/>
@@ -3304,7 +3280,7 @@
                 <w:rStyle w:val="Hyperlink"/>
                 <w:noProof/>
               </w:rPr>
-              <w:t>Contribution</w:t>
+              <w:t>Contribution &amp; Git Repository</w:t>
             </w:r>
             <w:r>
               <w:rPr>
@@ -3325,7 +3301,7 @@
                 <w:noProof/>
                 <w:webHidden/>
               </w:rPr>
-              <w:instrText xml:space="preserve"> PAGEREF _Toc226495534 \h </w:instrText>
+              <w:instrText xml:space="preserve"> PAGEREF _Toc226757965 \h </w:instrText>
             </w:r>
             <w:r>
               <w:rPr>
@@ -3345,7 +3321,7 @@
                 <w:noProof/>
                 <w:webHidden/>
               </w:rPr>
-              <w:t>18</w:t>
+              <w:t>20</w:t>
             </w:r>
             <w:r>
               <w:rPr>
@@ -3403,7 +3379,7 @@
       <w:pPr>
         <w:pStyle w:val="Heading1"/>
       </w:pPr>
-      <w:bookmarkStart w:id="0" w:name="_Toc226495500"/>
+      <w:bookmarkStart w:id="0" w:name="_Toc226757931"/>
       <w:r>
         <w:lastRenderedPageBreak/>
         <w:t>Problem Selection &amp; Motivation</w:t>
@@ -3418,7 +3394,7 @@
           <w:numId w:val="31"/>
         </w:numPr>
       </w:pPr>
-      <w:bookmarkStart w:id="1" w:name="_Toc226495501"/>
+      <w:bookmarkStart w:id="1" w:name="_Toc226757932"/>
       <w:r>
         <w:t>The Sri Lankan Investment Landscape</w:t>
       </w:r>
@@ -3497,7 +3473,7 @@
         </w:tabs>
         <w:ind w:left="720" w:hanging="720"/>
       </w:pPr>
-      <w:bookmarkStart w:id="2" w:name="_Toc226495502"/>
+      <w:bookmarkStart w:id="2" w:name="_Toc226757933"/>
       <w:r>
         <w:t xml:space="preserve">1.2 </w:t>
       </w:r>
@@ -3615,7 +3591,7 @@
         </w:numPr>
         <w:ind w:left="360" w:hanging="360"/>
       </w:pPr>
-      <w:bookmarkStart w:id="3" w:name="_Toc226495503"/>
+      <w:bookmarkStart w:id="3" w:name="_Toc226757934"/>
       <w:r>
         <w:t xml:space="preserve">1.3 </w:t>
       </w:r>
@@ -3728,7 +3704,7 @@
       <w:pPr>
         <w:pStyle w:val="Heading1"/>
       </w:pPr>
-      <w:bookmarkStart w:id="4" w:name="_Toc226495504"/>
+      <w:bookmarkStart w:id="4" w:name="_Toc226757935"/>
       <w:r>
         <w:t>Problem and Data Description</w:t>
       </w:r>
@@ -3742,7 +3718,7 @@
           <w:numId w:val="32"/>
         </w:numPr>
       </w:pPr>
-      <w:bookmarkStart w:id="5" w:name="_Toc226495505"/>
+      <w:bookmarkStart w:id="5" w:name="_Toc226757936"/>
       <w:r>
         <w:t>Problem Context and Formal Statement</w:t>
       </w:r>
@@ -3873,7 +3849,7 @@
           <w:numId w:val="0"/>
         </w:numPr>
       </w:pPr>
-      <w:bookmarkStart w:id="6" w:name="_Toc226495506"/>
+      <w:bookmarkStart w:id="6" w:name="_Toc226757937"/>
       <w:r>
         <w:t>2.2</w:t>
       </w:r>
@@ -3990,7 +3966,7 @@
         </w:numPr>
         <w:ind w:left="360" w:hanging="360"/>
       </w:pPr>
-      <w:bookmarkStart w:id="7" w:name="_Toc226495507"/>
+      <w:bookmarkStart w:id="7" w:name="_Toc226757938"/>
       <w:r>
         <w:t xml:space="preserve">2.3 </w:t>
       </w:r>
@@ -4175,7 +4151,7 @@
         </w:numPr>
         <w:ind w:left="360" w:hanging="360"/>
       </w:pPr>
-      <w:bookmarkStart w:id="8" w:name="_Toc226495508"/>
+      <w:bookmarkStart w:id="8" w:name="_Toc226757939"/>
       <w:r>
         <w:lastRenderedPageBreak/>
         <w:t xml:space="preserve">2.4 </w:t>
@@ -4427,7 +4403,7 @@
         </w:numPr>
         <w:ind w:left="360" w:hanging="360"/>
       </w:pPr>
-      <w:bookmarkStart w:id="9" w:name="_Toc226495509"/>
+      <w:bookmarkStart w:id="9" w:name="_Toc226757940"/>
       <w:r>
         <w:t>2.5 Dataset Justification</w:t>
       </w:r>
@@ -4453,7 +4429,7 @@
       <w:pPr>
         <w:pStyle w:val="Heading1"/>
       </w:pPr>
-      <w:bookmarkStart w:id="10" w:name="_Toc226495510"/>
+      <w:bookmarkStart w:id="10" w:name="_Toc226757941"/>
       <w:r>
         <w:t>Mathematical Formulation</w:t>
       </w:r>
@@ -4468,7 +4444,7 @@
         </w:numPr>
         <w:ind w:left="360" w:hanging="360"/>
       </w:pPr>
-      <w:bookmarkStart w:id="11" w:name="_Toc226495511"/>
+      <w:bookmarkStart w:id="11" w:name="_Toc226757942"/>
       <w:r>
         <w:t>3.1 Decision Variables</w:t>
       </w:r>
@@ -4811,7 +4787,7 @@
               <w:ind w:left="360" w:hanging="360"/>
               <w:cnfStyle w:val="000000000000" w:firstRow="0" w:lastRow="0" w:firstColumn="0" w:lastColumn="0" w:oddVBand="0" w:evenVBand="0" w:oddHBand="0" w:evenHBand="0" w:firstRowFirstColumn="0" w:firstRowLastColumn="0" w:lastRowFirstColumn="0" w:lastRowLastColumn="0"/>
             </w:pPr>
-            <w:bookmarkStart w:id="12" w:name="_Toc226495512"/>
+            <w:bookmarkStart w:id="12" w:name="_Toc226757943"/>
             <w:r>
               <w:lastRenderedPageBreak/>
               <w:t>3.</w:t>
@@ -5152,7 +5128,7 @@
         </w:numPr>
         <w:ind w:left="360" w:hanging="360"/>
       </w:pPr>
-      <w:bookmarkStart w:id="13" w:name="_Toc226495513"/>
+      <w:bookmarkStart w:id="13" w:name="_Toc226757944"/>
       <w:r>
         <w:t>3.</w:t>
       </w:r>
@@ -5587,7 +5563,7 @@
           <w:numId w:val="17"/>
         </w:numPr>
       </w:pPr>
-      <w:bookmarkStart w:id="14" w:name="_Toc226495514"/>
+      <w:bookmarkStart w:id="14" w:name="_Toc226757945"/>
       <w:r>
         <w:lastRenderedPageBreak/>
         <w:t>Equivalent Reformulation for the Exact Method</w:t>
@@ -6085,7 +6061,7 @@
           <w:numId w:val="17"/>
         </w:numPr>
       </w:pPr>
-      <w:bookmarkStart w:id="15" w:name="_Toc226495515"/>
+      <w:bookmarkStart w:id="15" w:name="_Toc226757946"/>
       <w:r>
         <w:t>NP-Hardness and Motivation for Heuristics</w:t>
       </w:r>
@@ -6114,7 +6090,7 @@
       <w:pPr>
         <w:pStyle w:val="Heading1"/>
       </w:pPr>
-      <w:bookmarkStart w:id="16" w:name="_Toc226495516"/>
+      <w:bookmarkStart w:id="16" w:name="_Toc226757947"/>
       <w:r>
         <w:t>Optimization</w:t>
       </w:r>
@@ -6131,7 +6107,7 @@
           <w:numId w:val="27"/>
         </w:numPr>
       </w:pPr>
-      <w:bookmarkStart w:id="17" w:name="_Toc226495517"/>
+      <w:bookmarkStart w:id="17" w:name="_Toc226757948"/>
       <w:r>
         <w:t>Method 1 — Branch and Bound (Exact)</w:t>
       </w:r>
@@ -6298,7 +6274,7 @@
           <w:numId w:val="27"/>
         </w:numPr>
       </w:pPr>
-      <w:bookmarkStart w:id="18" w:name="_Toc226495518"/>
+      <w:bookmarkStart w:id="18" w:name="_Toc226757949"/>
       <w:r>
         <w:t xml:space="preserve">Method </w:t>
       </w:r>
@@ -6678,7 +6654,7 @@
           <w:numId w:val="27"/>
         </w:numPr>
       </w:pPr>
-      <w:bookmarkStart w:id="19" w:name="_Toc226495519"/>
+      <w:bookmarkStart w:id="19" w:name="_Toc226757950"/>
       <w:r>
         <w:t>Complementarity of the Two Methods</w:t>
       </w:r>
@@ -6703,7 +6679,7 @@
           <w:numId w:val="27"/>
         </w:numPr>
       </w:pPr>
-      <w:bookmarkStart w:id="20" w:name="_Toc226495520"/>
+      <w:bookmarkStart w:id="20" w:name="_Toc226757951"/>
       <w:r>
         <w:t>Implementation</w:t>
       </w:r>
@@ -6717,7 +6693,7 @@
           <w:numId w:val="27"/>
         </w:numPr>
       </w:pPr>
-      <w:bookmarkStart w:id="21" w:name="_Toc226495521"/>
+      <w:bookmarkStart w:id="21" w:name="_Toc226757952"/>
       <w:r>
         <w:t>Environment and Dependencies</w:t>
       </w:r>
@@ -6836,7 +6812,7 @@
           <w:numId w:val="27"/>
         </w:numPr>
       </w:pPr>
-      <w:bookmarkStart w:id="22" w:name="_Toc226495522"/>
+      <w:bookmarkStart w:id="22" w:name="_Toc226757953"/>
       <w:r>
         <w:lastRenderedPageBreak/>
         <w:t>Data Pipeline Implementation notebook</w:t>
@@ -7090,7 +7066,7 @@
           <w:numId w:val="27"/>
         </w:numPr>
       </w:pPr>
-      <w:bookmarkStart w:id="23" w:name="_Toc226495523"/>
+      <w:bookmarkStart w:id="23" w:name="_Toc226757954"/>
       <w:r>
         <w:lastRenderedPageBreak/>
         <w:t>Branch and Bound — Key Implementation Details</w:t>
@@ -7101,6 +7077,9 @@
       </w:r>
     </w:p>
     <w:p>
+      <w:r>
+        <w:br/>
+      </w:r>
       <w:r>
         <w:t>The B&amp;B class maintains three state variables: the best incumbent Sharpe (</w:t>
       </w:r>
@@ -7287,7 +7266,7 @@
           <w:numId w:val="27"/>
         </w:numPr>
       </w:pPr>
-      <w:bookmarkStart w:id="24" w:name="_Toc226495524"/>
+      <w:bookmarkStart w:id="24" w:name="_Toc226757955"/>
       <w:r>
         <w:t>Genetic Algorithm — Key Implementation Details</w:t>
       </w:r>
@@ -7298,7 +7277,18 @@
     </w:p>
     <w:p>
       <w:r>
-        <w:t xml:space="preserve">The fitness evaluation function is the computational bottleneck: for each individual in the population, SLSQP is invoked to find the optimal weights for the selected subset. The DEAP library handles all population management, selection, crossover, and mutation operators. Only invalid individuals (those whose fitness has been invalidated by crossover or mutation) are re-evaluated, exploiting DEAP's lazy evaluation mechanism to </w:t>
+        <w:br/>
+      </w:r>
+      <w:r>
+        <w:t xml:space="preserve">The fitness evaluation function is the computational bottleneck: for </w:t>
+      </w:r>
+      <w:proofErr w:type="gramStart"/>
+      <w:r>
+        <w:t>each individual</w:t>
+      </w:r>
+      <w:proofErr w:type="gramEnd"/>
+      <w:r>
+        <w:t xml:space="preserve"> in the population, SLSQP is invoked to find the optimal weights for the selected subset. The DEAP library handles all population management, selection, crossover, and mutation operators. Only invalid individuals (those whose fitness has been invalidated by crossover or mutation) are re-evaluated, exploiting DEAP's lazy evaluation mechanism to </w:t>
       </w:r>
       <w:r>
         <w:t>minimize</w:t>
@@ -7311,7 +7301,6 @@
     <w:p/>
     <w:p>
       <w:r>
-        <w:lastRenderedPageBreak/>
         <w:drawing>
           <wp:anchor distT="0" distB="0" distL="114300" distR="114300" simplePos="0" relativeHeight="251667456" behindDoc="0" locked="0" layoutInCell="1" allowOverlap="1" wp14:anchorId="49CB8516" wp14:editId="69512FFE">
             <wp:simplePos x="0" y="0"/>
@@ -7380,7 +7369,7 @@
       <w:pPr>
         <w:pStyle w:val="Heading1"/>
       </w:pPr>
-      <w:bookmarkStart w:id="25" w:name="_Toc226495525"/>
+      <w:bookmarkStart w:id="25" w:name="_Toc226757956"/>
       <w:r>
         <w:t>Results and Comparative Evaluation</w:t>
       </w:r>
@@ -7395,7 +7384,7 @@
         </w:numPr>
         <w:ind w:left="360" w:hanging="360"/>
       </w:pPr>
-      <w:bookmarkStart w:id="26" w:name="_Toc226495526"/>
+      <w:bookmarkStart w:id="26" w:name="_Toc226757957"/>
       <w:r>
         <w:t>6.1 Primary Results Summary</w:t>
       </w:r>
@@ -7403,13 +7392,49 @@
     </w:p>
     <w:p>
       <w:r>
+        <w:br/>
+      </w:r>
+      <w:r>
         <w:t xml:space="preserve">Both methods were executed on the full CSE dataset (N = 30 curated assets with confirmed data quality, K = 8, wₘᵢₙ = 3%, wₘₐₓ = 40%, rₙ = 10%). The results are </w:t>
       </w:r>
       <w:r>
         <w:t>summarized</w:t>
       </w:r>
       <w:r>
-        <w:t xml:space="preserve"> below:</w:t>
+        <w:t xml:space="preserve"> below</w:t>
+      </w:r>
+      <w:r>
+        <w:t xml:space="preserve"> (</w:t>
+      </w:r>
+      <w:r>
+        <w:t>Optimality Gap (GA vs B&amp;B</w:t>
+      </w:r>
+      <w:proofErr w:type="gramStart"/>
+      <w:r>
+        <w:t>) :</w:t>
+      </w:r>
+      <w:proofErr w:type="gramEnd"/>
+      <w:r>
+        <w:t xml:space="preserve"> 5.02%</w:t>
+      </w:r>
+      <w:r>
+        <w:t>:</w:t>
+      </w:r>
+      <w:r>
+        <w:t xml:space="preserve"> </w:t>
+      </w:r>
+    </w:p>
+    <w:p>
+      <w:r>
+        <w:t>Optimality Gap (GA vs B&amp;B</w:t>
+      </w:r>
+      <w:proofErr w:type="gramStart"/>
+      <w:r>
+        <w:t>) :</w:t>
+      </w:r>
+      <w:proofErr w:type="gramEnd"/>
+      <w:r>
+        <w:t xml:space="preserve"> 5.02%</w:t>
       </w:r>
     </w:p>
     <w:tbl>
@@ -7497,7 +7522,10 @@
               <w:cnfStyle w:val="000000100000" w:firstRow="0" w:lastRow="0" w:firstColumn="0" w:lastColumn="0" w:oddVBand="0" w:evenVBand="0" w:oddHBand="1" w:evenHBand="0" w:firstRowFirstColumn="0" w:firstRowLastColumn="0" w:lastRowFirstColumn="0" w:lastRowLastColumn="0"/>
             </w:pPr>
             <w:r>
-              <w:t>1.0143</w:t>
+              <w:t>1.</w:t>
+            </w:r>
+            <w:r>
+              <w:t>8160</w:t>
             </w:r>
           </w:p>
         </w:tc>
@@ -7510,7 +7538,7 @@
               <w:cnfStyle w:val="000000100000" w:firstRow="0" w:lastRow="0" w:firstColumn="0" w:lastColumn="0" w:oddVBand="0" w:evenVBand="0" w:oddHBand="1" w:evenHBand="0" w:firstRowFirstColumn="0" w:firstRowLastColumn="0" w:lastRowFirstColumn="0" w:lastRowLastColumn="0"/>
             </w:pPr>
             <w:r>
-              <w:t>1.5978</w:t>
+              <w:t>1.9072</w:t>
             </w:r>
           </w:p>
         </w:tc>
@@ -7544,7 +7572,7 @@
               <w:cnfStyle w:val="000000000000" w:firstRow="0" w:lastRow="0" w:firstColumn="0" w:lastColumn="0" w:oddVBand="0" w:evenVBand="0" w:oddHBand="0" w:evenHBand="0" w:firstRowFirstColumn="0" w:firstRowLastColumn="0" w:lastRowFirstColumn="0" w:lastRowLastColumn="0"/>
             </w:pPr>
             <w:r>
-              <w:t>`8.83%</w:t>
+              <w:t>48.66%</w:t>
             </w:r>
           </w:p>
         </w:tc>
@@ -7557,7 +7585,7 @@
               <w:cnfStyle w:val="000000000000" w:firstRow="0" w:lastRow="0" w:firstColumn="0" w:lastColumn="0" w:oddVBand="0" w:evenVBand="0" w:oddHBand="0" w:evenHBand="0" w:firstRowFirstColumn="0" w:firstRowLastColumn="0" w:lastRowFirstColumn="0" w:lastRowLastColumn="0"/>
             </w:pPr>
             <w:r>
-              <w:t>17.13%</w:t>
+              <w:t>45.29%</w:t>
             </w:r>
           </w:p>
         </w:tc>
@@ -7592,7 +7620,7 @@
               <w:cnfStyle w:val="000000100000" w:firstRow="0" w:lastRow="0" w:firstColumn="0" w:lastColumn="0" w:oddVBand="0" w:evenVBand="0" w:oddHBand="1" w:evenHBand="0" w:firstRowFirstColumn="0" w:firstRowLastColumn="0" w:lastRowFirstColumn="0" w:lastRowLastColumn="0"/>
             </w:pPr>
             <w:r>
-              <w:t>8.71%</w:t>
+              <w:t>21.29%</w:t>
             </w:r>
           </w:p>
         </w:tc>
@@ -7605,7 +7633,7 @@
               <w:cnfStyle w:val="000000100000" w:firstRow="0" w:lastRow="0" w:firstColumn="0" w:lastColumn="0" w:oddVBand="0" w:evenVBand="0" w:oddHBand="1" w:evenHBand="0" w:firstRowFirstColumn="0" w:firstRowLastColumn="0" w:lastRowFirstColumn="0" w:lastRowLastColumn="0"/>
             </w:pPr>
             <w:r>
-              <w:t>4.46%</w:t>
+              <w:t>18.5%</w:t>
             </w:r>
           </w:p>
         </w:tc>
@@ -7618,6 +7646,7 @@
           </w:tcPr>
           <w:p>
             <w:r>
+              <w:lastRenderedPageBreak/>
               <w:t>Assets Selected</w:t>
             </w:r>
           </w:p>
@@ -7673,7 +7702,10 @@
               <w:cnfStyle w:val="000000100000" w:firstRow="0" w:lastRow="0" w:firstColumn="0" w:lastColumn="0" w:oddVBand="0" w:evenVBand="0" w:oddHBand="1" w:evenHBand="0" w:firstRowFirstColumn="0" w:firstRowLastColumn="0" w:lastRowFirstColumn="0" w:lastRowLastColumn="0"/>
             </w:pPr>
             <w:r>
-              <w:t>0.02 s</w:t>
+              <w:t xml:space="preserve">120.09 </w:t>
+            </w:r>
+            <w:r>
+              <w:t>s</w:t>
             </w:r>
           </w:p>
         </w:tc>
@@ -7686,7 +7718,7 @@
               <w:cnfStyle w:val="000000100000" w:firstRow="0" w:lastRow="0" w:firstColumn="0" w:lastColumn="0" w:oddVBand="0" w:evenVBand="0" w:oddHBand="1" w:evenHBand="0" w:firstRowFirstColumn="0" w:firstRowLastColumn="0" w:lastRowFirstColumn="0" w:lastRowLastColumn="0"/>
             </w:pPr>
             <w:r>
-              <w:t>110.63%</w:t>
+              <w:t>452.26 s</w:t>
             </w:r>
           </w:p>
         </w:tc>
@@ -7712,7 +7744,7 @@
               <w:cnfStyle w:val="000000000000" w:firstRow="0" w:lastRow="0" w:firstColumn="0" w:lastColumn="0" w:oddVBand="0" w:evenVBand="0" w:oddHBand="0" w:evenHBand="0" w:firstRowFirstColumn="0" w:firstRowLastColumn="0" w:lastRowFirstColumn="0" w:lastRowLastColumn="0"/>
             </w:pPr>
             <w:r>
-              <w:t>1</w:t>
+              <w:t>743</w:t>
             </w:r>
           </w:p>
         </w:tc>
@@ -7725,7 +7757,132 @@
               <w:cnfStyle w:val="000000000000" w:firstRow="0" w:lastRow="0" w:firstColumn="0" w:lastColumn="0" w:oddVBand="0" w:evenVBand="0" w:oddHBand="0" w:evenHBand="0" w:firstRowFirstColumn="0" w:firstRowLastColumn="0" w:lastRowFirstColumn="0" w:lastRowLastColumn="0"/>
             </w:pPr>
             <w:r>
-              <w:t>9600</w:t>
+              <w:t>12080</w:t>
+            </w:r>
+          </w:p>
+        </w:tc>
+      </w:tr>
+    </w:tbl>
+    <w:p/>
+    <w:p>
+      <w:r>
+        <w:t>A key observation from Table 5 merits careful interpretation: the GA achieves a higher Sharpe ratio (1.5978) than the B&amp;B warm-start solution (1.0143). This is not a contradiction of the B&amp;B guarantee</w:t>
+      </w:r>
+      <w:r>
+        <w:t xml:space="preserve"> as</w:t>
+      </w:r>
+      <w:r>
+        <w:t xml:space="preserve"> it reflects the fact that the B&amp;B implementation uses a greedy warm-start as its initial incumbent, and with the 120-second time limit and the branching depth cap imposed for tractability on this N = 30 instance, the tree was fully pruned after the first node. The GA, by contrast, performed 9,600 function evaluations, allowing it to explore a far wider region of the search space and discover a superior solution. This outcome perfectly illustrates the fundamental trade-off: B&amp;B is optimal in theory but requires </w:t>
+      </w:r>
+      <w:r>
+        <w:t>complete</w:t>
+      </w:r>
+      <w:r>
+        <w:t xml:space="preserve"> enumeration; the GA finds better solutions in practice when evaluation budgets are constrained.</w:t>
+      </w:r>
+    </w:p>
+    <w:p>
+      <w:pPr>
+        <w:pStyle w:val="Heading2"/>
+        <w:numPr>
+          <w:ilvl w:val="0"/>
+          <w:numId w:val="0"/>
+        </w:numPr>
+        <w:ind w:left="360" w:hanging="360"/>
+      </w:pPr>
+      <w:bookmarkStart w:id="27" w:name="_Toc226757958"/>
+      <w:r>
+        <w:t>6.2 Portfolio Composition Analysis</w:t>
+      </w:r>
+      <w:bookmarkEnd w:id="27"/>
+      <w:r>
+        <w:t xml:space="preserve"> </w:t>
+      </w:r>
+    </w:p>
+    <w:p>
+      <w:r>
+        <w:br/>
+      </w:r>
+      <w:r>
+        <w:t>The two methods select overlapping but distinct asset sets</w:t>
+      </w:r>
+      <w:r>
+        <w:t>:</w:t>
+      </w:r>
+    </w:p>
+    <w:tbl>
+      <w:tblPr>
+        <w:tblStyle w:val="GridTable4-Accent2"/>
+        <w:tblW w:w="0" w:type="auto"/>
+        <w:tblLook w:val="04A0" w:firstRow="1" w:lastRow="0" w:firstColumn="1" w:lastColumn="0" w:noHBand="0" w:noVBand="1"/>
+      </w:tblPr>
+      <w:tblGrid>
+        <w:gridCol w:w="2007"/>
+        <w:gridCol w:w="2504"/>
+        <w:gridCol w:w="2614"/>
+        <w:gridCol w:w="2225"/>
+      </w:tblGrid>
+      <w:tr>
+        <w:trPr>
+          <w:cnfStyle w:val="100000000000" w:firstRow="1" w:lastRow="0" w:firstColumn="0" w:lastColumn="0" w:oddVBand="0" w:evenVBand="0" w:oddHBand="0" w:evenHBand="0" w:firstRowFirstColumn="0" w:firstRowLastColumn="0" w:lastRowFirstColumn="0" w:lastRowLastColumn="0"/>
+        </w:trPr>
+        <w:tc>
+          <w:tcPr>
+            <w:cnfStyle w:val="001000000000" w:firstRow="0" w:lastRow="0" w:firstColumn="1" w:lastColumn="0" w:oddVBand="0" w:evenVBand="0" w:oddHBand="0" w:evenHBand="0" w:firstRowFirstColumn="0" w:firstRowLastColumn="0" w:lastRowFirstColumn="0" w:lastRowLastColumn="0"/>
+            <w:tcW w:w="2007" w:type="dxa"/>
+            <w:vAlign w:val="center"/>
+          </w:tcPr>
+          <w:p>
+            <w:pPr>
+              <w:jc w:val="center"/>
+            </w:pPr>
+            <w:r>
+              <w:t>Ticker</w:t>
+            </w:r>
+          </w:p>
+        </w:tc>
+        <w:tc>
+          <w:tcPr>
+            <w:tcW w:w="2504" w:type="dxa"/>
+            <w:vAlign w:val="center"/>
+          </w:tcPr>
+          <w:p>
+            <w:pPr>
+              <w:jc w:val="center"/>
+              <w:cnfStyle w:val="100000000000" w:firstRow="1" w:lastRow="0" w:firstColumn="0" w:lastColumn="0" w:oddVBand="0" w:evenVBand="0" w:oddHBand="0" w:evenHBand="0" w:firstRowFirstColumn="0" w:firstRowLastColumn="0" w:lastRowFirstColumn="0" w:lastRowLastColumn="0"/>
+            </w:pPr>
+            <w:r>
+              <w:t>Sector</w:t>
+            </w:r>
+          </w:p>
+        </w:tc>
+        <w:tc>
+          <w:tcPr>
+            <w:tcW w:w="2614" w:type="dxa"/>
+            <w:vAlign w:val="center"/>
+          </w:tcPr>
+          <w:p>
+            <w:pPr>
+              <w:jc w:val="center"/>
+              <w:cnfStyle w:val="100000000000" w:firstRow="1" w:lastRow="0" w:firstColumn="0" w:lastColumn="0" w:oddVBand="0" w:evenVBand="0" w:oddHBand="0" w:evenHBand="0" w:firstRowFirstColumn="0" w:firstRowLastColumn="0" w:lastRowFirstColumn="0" w:lastRowLastColumn="0"/>
+            </w:pPr>
+            <w:r>
+              <w:t>B&amp;B Weight</w:t>
+            </w:r>
+          </w:p>
+        </w:tc>
+        <w:tc>
+          <w:tcPr>
+            <w:tcW w:w="2225" w:type="dxa"/>
+            <w:vAlign w:val="center"/>
+          </w:tcPr>
+          <w:p>
+            <w:pPr>
+              <w:jc w:val="center"/>
+              <w:cnfStyle w:val="100000000000" w:firstRow="1" w:lastRow="0" w:firstColumn="0" w:lastColumn="0" w:oddVBand="0" w:evenVBand="0" w:oddHBand="0" w:evenHBand="0" w:firstRowFirstColumn="0" w:firstRowLastColumn="0" w:lastRowFirstColumn="0" w:lastRowLastColumn="0"/>
+            </w:pPr>
+            <w:r>
+              <w:t>GA Weight</w:t>
             </w:r>
           </w:p>
         </w:tc>
@@ -7737,38 +7894,54 @@
         <w:tc>
           <w:tcPr>
             <w:cnfStyle w:val="001000000000" w:firstRow="0" w:lastRow="0" w:firstColumn="1" w:lastColumn="0" w:oddVBand="0" w:evenVBand="0" w:oddHBand="0" w:evenHBand="0" w:firstRowFirstColumn="0" w:firstRowLastColumn="0" w:lastRowFirstColumn="0" w:lastRowLastColumn="0"/>
-            <w:tcW w:w="2875" w:type="dxa"/>
+            <w:tcW w:w="2007" w:type="dxa"/>
+            <w:vAlign w:val="center"/>
           </w:tcPr>
           <w:p>
             <w:r>
-              <w:lastRenderedPageBreak/>
-              <w:t>Nodes Explored</w:t>
+              <w:t>CFVF</w:t>
             </w:r>
           </w:p>
         </w:tc>
         <w:tc>
           <w:tcPr>
-            <w:tcW w:w="3150" w:type="dxa"/>
+            <w:tcW w:w="2504" w:type="dxa"/>
+            <w:vAlign w:val="center"/>
           </w:tcPr>
           <w:p>
             <w:pPr>
               <w:cnfStyle w:val="000000100000" w:firstRow="0" w:lastRow="0" w:firstColumn="0" w:lastColumn="0" w:oddVBand="0" w:evenVBand="0" w:oddHBand="1" w:evenHBand="0" w:firstRowFirstColumn="0" w:firstRowLastColumn="0" w:lastRowFirstColumn="0" w:lastRowLastColumn="0"/>
             </w:pPr>
             <w:r>
-              <w:t>1</w:t>
+              <w:t>Banking &amp; Finance</w:t>
             </w:r>
           </w:p>
         </w:tc>
         <w:tc>
           <w:tcPr>
-            <w:tcW w:w="3325" w:type="dxa"/>
+            <w:tcW w:w="2614" w:type="dxa"/>
+            <w:vAlign w:val="center"/>
           </w:tcPr>
           <w:p>
             <w:pPr>
               <w:cnfStyle w:val="000000100000" w:firstRow="0" w:lastRow="0" w:firstColumn="0" w:lastColumn="0" w:oddVBand="0" w:evenVBand="0" w:oddHBand="1" w:evenHBand="0" w:firstRowFirstColumn="0" w:firstRowLastColumn="0" w:lastRowFirstColumn="0" w:lastRowLastColumn="0"/>
             </w:pPr>
             <w:r>
-              <w:t>N/A</w:t>
+              <w:t>14.20%</w:t>
+            </w:r>
+          </w:p>
+        </w:tc>
+        <w:tc>
+          <w:tcPr>
+            <w:tcW w:w="2225" w:type="dxa"/>
+            <w:vAlign w:val="center"/>
+          </w:tcPr>
+          <w:p>
+            <w:pPr>
+              <w:cnfStyle w:val="000000100000" w:firstRow="0" w:lastRow="0" w:firstColumn="0" w:lastColumn="0" w:oddVBand="0" w:evenVBand="0" w:oddHBand="1" w:evenHBand="0" w:firstRowFirstColumn="0" w:firstRowLastColumn="0" w:lastRowFirstColumn="0" w:lastRowLastColumn="0"/>
+            </w:pPr>
+            <w:r>
+              <w:t>11.97%</w:t>
             </w:r>
           </w:p>
         </w:tc>
@@ -7777,154 +7950,54 @@
         <w:tc>
           <w:tcPr>
             <w:cnfStyle w:val="001000000000" w:firstRow="0" w:lastRow="0" w:firstColumn="1" w:lastColumn="0" w:oddVBand="0" w:evenVBand="0" w:oddHBand="0" w:evenHBand="0" w:firstRowFirstColumn="0" w:firstRowLastColumn="0" w:lastRowFirstColumn="0" w:lastRowLastColumn="0"/>
-            <w:tcW w:w="2875" w:type="dxa"/>
+            <w:tcW w:w="2007" w:type="dxa"/>
+            <w:vAlign w:val="center"/>
           </w:tcPr>
           <w:p>
             <w:r>
-              <w:t>Optimality Gap</w:t>
+              <w:t>SFCL</w:t>
             </w:r>
           </w:p>
         </w:tc>
         <w:tc>
           <w:tcPr>
-            <w:tcW w:w="3150" w:type="dxa"/>
+            <w:tcW w:w="2504" w:type="dxa"/>
+            <w:vAlign w:val="center"/>
           </w:tcPr>
           <w:p>
             <w:pPr>
               <w:cnfStyle w:val="000000000000" w:firstRow="0" w:lastRow="0" w:firstColumn="0" w:lastColumn="0" w:oddVBand="0" w:evenVBand="0" w:oddHBand="0" w:evenHBand="0" w:firstRowFirstColumn="0" w:firstRowLastColumn="0" w:lastRowFirstColumn="0" w:lastRowLastColumn="0"/>
             </w:pPr>
             <w:r>
-              <w:t>-</w:t>
+              <w:t>Banking &amp; Finance</w:t>
             </w:r>
           </w:p>
         </w:tc>
         <w:tc>
           <w:tcPr>
-            <w:tcW w:w="3325" w:type="dxa"/>
+            <w:tcW w:w="2614" w:type="dxa"/>
+            <w:vAlign w:val="center"/>
           </w:tcPr>
           <w:p>
             <w:pPr>
               <w:cnfStyle w:val="000000000000" w:firstRow="0" w:lastRow="0" w:firstColumn="0" w:lastColumn="0" w:oddVBand="0" w:evenVBand="0" w:oddHBand="0" w:evenHBand="0" w:firstRowFirstColumn="0" w:firstRowLastColumn="0" w:lastRowFirstColumn="0" w:lastRowLastColumn="0"/>
             </w:pPr>
             <w:r>
-              <w:t>57.5% above B&amp;B warm start</w:t>
-            </w:r>
-          </w:p>
-        </w:tc>
-      </w:tr>
-    </w:tbl>
-    <w:p/>
-    <w:p>
-      <w:r>
-        <w:t>A key observation from Table 5 merits careful interpretation: the GA achieves a higher Sharpe ratio (1.5978) than the B&amp;B warm-start solution (1.0143). This is not a contradiction of the B&amp;B guarantee</w:t>
-      </w:r>
-      <w:r>
-        <w:t xml:space="preserve"> as</w:t>
-      </w:r>
-      <w:r>
-        <w:t xml:space="preserve"> it reflects the fact that the B&amp;B implementation uses a greedy warm-start as its initial incumbent, and with the 120-second time limit and the branching depth cap imposed for tractability on this N = 30 instance, the tree was fully pruned after the first node. The GA, by contrast, performed 9,600 function evaluations, allowing it to explore a far wider region of the search space and discover a superior solution. This outcome perfectly illustrates the fundamental trade-off: B&amp;B is optimal in theory but requires </w:t>
-      </w:r>
-      <w:r>
-        <w:t>complete</w:t>
-      </w:r>
-      <w:r>
-        <w:t xml:space="preserve"> enumeration; the GA finds better solutions in practice when evaluation budgets are constrained.</w:t>
-      </w:r>
-    </w:p>
-    <w:p>
-      <w:pPr>
-        <w:pStyle w:val="Heading2"/>
-        <w:numPr>
-          <w:ilvl w:val="0"/>
-          <w:numId w:val="0"/>
-        </w:numPr>
-        <w:ind w:left="360" w:hanging="360"/>
-      </w:pPr>
-      <w:bookmarkStart w:id="27" w:name="_Toc226495527"/>
-      <w:r>
-        <w:t>6.2 Portfolio Composition Analysis</w:t>
-      </w:r>
-      <w:bookmarkEnd w:id="27"/>
-      <w:r>
-        <w:t xml:space="preserve"> </w:t>
-      </w:r>
-    </w:p>
-    <w:p>
-      <w:r>
-        <w:t>The two methods select overlapping but distinct asset sets</w:t>
-      </w:r>
-      <w:r>
-        <w:t>:</w:t>
-      </w:r>
-    </w:p>
-    <w:tbl>
-      <w:tblPr>
-        <w:tblStyle w:val="GridTable4-Accent2"/>
-        <w:tblW w:w="0" w:type="auto"/>
-        <w:tblLook w:val="04A0" w:firstRow="1" w:lastRow="0" w:firstColumn="1" w:lastColumn="0" w:noHBand="0" w:noVBand="1"/>
-      </w:tblPr>
-      <w:tblGrid>
-        <w:gridCol w:w="2695"/>
-        <w:gridCol w:w="3240"/>
-        <w:gridCol w:w="3415"/>
-      </w:tblGrid>
-      <w:tr>
-        <w:trPr>
-          <w:cnfStyle w:val="100000000000" w:firstRow="1" w:lastRow="0" w:firstColumn="0" w:lastColumn="0" w:oddVBand="0" w:evenVBand="0" w:oddHBand="0" w:evenHBand="0" w:firstRowFirstColumn="0" w:firstRowLastColumn="0" w:lastRowFirstColumn="0" w:lastRowLastColumn="0"/>
-        </w:trPr>
-        <w:tc>
-          <w:tcPr>
-            <w:cnfStyle w:val="001000000000" w:firstRow="0" w:lastRow="0" w:firstColumn="1" w:lastColumn="0" w:oddVBand="0" w:evenVBand="0" w:oddHBand="0" w:evenHBand="0" w:firstRowFirstColumn="0" w:firstRowLastColumn="0" w:lastRowFirstColumn="0" w:lastRowLastColumn="0"/>
-            <w:tcW w:w="2695" w:type="dxa"/>
-          </w:tcPr>
-          <w:p>
-            <w:r>
-              <w:rPr>
-                <w:b w:val="0"/>
-              </w:rPr>
-              <w:t>Ticker</w:t>
+              <w:t>13.70%</w:t>
             </w:r>
           </w:p>
         </w:tc>
         <w:tc>
           <w:tcPr>
-            <w:tcW w:w="3240" w:type="dxa"/>
+            <w:tcW w:w="2225" w:type="dxa"/>
+            <w:vAlign w:val="center"/>
           </w:tcPr>
           <w:p>
             <w:pPr>
-              <w:cnfStyle w:val="100000000000" w:firstRow="1" w:lastRow="0" w:firstColumn="0" w:lastColumn="0" w:oddVBand="0" w:evenVBand="0" w:oddHBand="0" w:evenHBand="0" w:firstRowFirstColumn="0" w:firstRowLastColumn="0" w:lastRowFirstColumn="0" w:lastRowLastColumn="0"/>
+              <w:cnfStyle w:val="000000000000" w:firstRow="0" w:lastRow="0" w:firstColumn="0" w:lastColumn="0" w:oddVBand="0" w:evenVBand="0" w:oddHBand="0" w:evenHBand="0" w:firstRowFirstColumn="0" w:firstRowLastColumn="0" w:lastRowFirstColumn="0" w:lastRowLastColumn="0"/>
             </w:pPr>
             <w:r>
-              <w:t xml:space="preserve">Branch &amp; Bound </w:t>
-            </w:r>
-            <w:proofErr w:type="gramStart"/>
-            <w:r>
-              <w:t>Weight(</w:t>
-            </w:r>
-            <w:proofErr w:type="gramEnd"/>
-            <w:r>
-              <w:t>%)</w:t>
-            </w:r>
-          </w:p>
-        </w:tc>
-        <w:tc>
-          <w:tcPr>
-            <w:tcW w:w="3415" w:type="dxa"/>
-          </w:tcPr>
-          <w:p>
-            <w:pPr>
-              <w:cnfStyle w:val="100000000000" w:firstRow="1" w:lastRow="0" w:firstColumn="0" w:lastColumn="0" w:oddVBand="0" w:evenVBand="0" w:oddHBand="0" w:evenHBand="0" w:firstRowFirstColumn="0" w:firstRowLastColumn="0" w:lastRowFirstColumn="0" w:lastRowLastColumn="0"/>
-            </w:pPr>
-            <w:r>
-              <w:t xml:space="preserve">Genetic Algorithm </w:t>
-            </w:r>
-            <w:proofErr w:type="gramStart"/>
-            <w:r>
-              <w:t>Weight(</w:t>
-            </w:r>
-            <w:proofErr w:type="gramEnd"/>
-            <w:r>
-              <w:t>%)</w:t>
+              <w:t>10.70%</w:t>
             </w:r>
           </w:p>
         </w:tc>
@@ -7936,37 +8009,54 @@
         <w:tc>
           <w:tcPr>
             <w:cnfStyle w:val="001000000000" w:firstRow="0" w:lastRow="0" w:firstColumn="1" w:lastColumn="0" w:oddVBand="0" w:evenVBand="0" w:oddHBand="0" w:evenHBand="0" w:firstRowFirstColumn="0" w:firstRowLastColumn="0" w:lastRowFirstColumn="0" w:lastRowLastColumn="0"/>
-            <w:tcW w:w="2695" w:type="dxa"/>
+            <w:tcW w:w="2007" w:type="dxa"/>
+            <w:vAlign w:val="center"/>
           </w:tcPr>
           <w:p>
             <w:r>
-              <w:t>COMB</w:t>
+              <w:t>GREG</w:t>
             </w:r>
           </w:p>
         </w:tc>
         <w:tc>
           <w:tcPr>
-            <w:tcW w:w="3240" w:type="dxa"/>
+            <w:tcW w:w="2504" w:type="dxa"/>
+            <w:vAlign w:val="center"/>
           </w:tcPr>
           <w:p>
             <w:pPr>
               <w:cnfStyle w:val="000000100000" w:firstRow="0" w:lastRow="0" w:firstColumn="0" w:lastColumn="0" w:oddVBand="0" w:evenVBand="0" w:oddHBand="1" w:evenHBand="0" w:firstRowFirstColumn="0" w:firstRowLastColumn="0" w:lastRowFirstColumn="0" w:lastRowLastColumn="0"/>
             </w:pPr>
             <w:r>
-              <w:t>8.35%</w:t>
+              <w:t>Diversified</w:t>
             </w:r>
           </w:p>
         </w:tc>
         <w:tc>
           <w:tcPr>
-            <w:tcW w:w="3415" w:type="dxa"/>
+            <w:tcW w:w="2614" w:type="dxa"/>
+            <w:vAlign w:val="center"/>
           </w:tcPr>
           <w:p>
             <w:pPr>
               <w:cnfStyle w:val="000000100000" w:firstRow="0" w:lastRow="0" w:firstColumn="0" w:lastColumn="0" w:oddVBand="0" w:evenVBand="0" w:oddHBand="1" w:evenHBand="0" w:firstRowFirstColumn="0" w:firstRowLastColumn="0" w:lastRowFirstColumn="0" w:lastRowLastColumn="0"/>
             </w:pPr>
             <w:r>
-              <w:t>8.36%</w:t>
+              <w:t>12.21%</w:t>
+            </w:r>
+          </w:p>
+        </w:tc>
+        <w:tc>
+          <w:tcPr>
+            <w:tcW w:w="2225" w:type="dxa"/>
+            <w:vAlign w:val="center"/>
+          </w:tcPr>
+          <w:p>
+            <w:pPr>
+              <w:cnfStyle w:val="000000100000" w:firstRow="0" w:lastRow="0" w:firstColumn="0" w:lastColumn="0" w:oddVBand="0" w:evenVBand="0" w:oddHBand="1" w:evenHBand="0" w:firstRowFirstColumn="0" w:firstRowLastColumn="0" w:lastRowFirstColumn="0" w:lastRowLastColumn="0"/>
+            </w:pPr>
+            <w:r>
+              <w:t>10.99%</w:t>
             </w:r>
           </w:p>
         </w:tc>
@@ -7975,37 +8065,54 @@
         <w:tc>
           <w:tcPr>
             <w:cnfStyle w:val="001000000000" w:firstRow="0" w:lastRow="0" w:firstColumn="1" w:lastColumn="0" w:oddVBand="0" w:evenVBand="0" w:oddHBand="0" w:evenHBand="0" w:firstRowFirstColumn="0" w:firstRowLastColumn="0" w:lastRowFirstColumn="0" w:lastRowLastColumn="0"/>
-            <w:tcW w:w="2695" w:type="dxa"/>
+            <w:tcW w:w="2007" w:type="dxa"/>
+            <w:vAlign w:val="center"/>
           </w:tcPr>
           <w:p>
             <w:r>
-              <w:t>HNB</w:t>
+              <w:t>GLAS</w:t>
             </w:r>
           </w:p>
         </w:tc>
         <w:tc>
           <w:tcPr>
-            <w:tcW w:w="3240" w:type="dxa"/>
+            <w:tcW w:w="2504" w:type="dxa"/>
+            <w:vAlign w:val="center"/>
           </w:tcPr>
           <w:p>
             <w:pPr>
               <w:cnfStyle w:val="000000000000" w:firstRow="0" w:lastRow="0" w:firstColumn="0" w:lastColumn="0" w:oddVBand="0" w:evenVBand="0" w:oddHBand="0" w:evenHBand="0" w:firstRowFirstColumn="0" w:firstRowLastColumn="0" w:lastRowFirstColumn="0" w:lastRowLastColumn="0"/>
             </w:pPr>
             <w:r>
-              <w:t>-</w:t>
+              <w:t>Manufacturing</w:t>
             </w:r>
           </w:p>
         </w:tc>
         <w:tc>
           <w:tcPr>
-            <w:tcW w:w="3415" w:type="dxa"/>
+            <w:tcW w:w="2614" w:type="dxa"/>
+            <w:vAlign w:val="center"/>
           </w:tcPr>
           <w:p>
             <w:pPr>
               <w:cnfStyle w:val="000000000000" w:firstRow="0" w:lastRow="0" w:firstColumn="0" w:lastColumn="0" w:oddVBand="0" w:evenVBand="0" w:oddHBand="0" w:evenHBand="0" w:firstRowFirstColumn="0" w:firstRowLastColumn="0" w:lastRowFirstColumn="0" w:lastRowLastColumn="0"/>
             </w:pPr>
             <w:r>
-              <w:t>23.16%</w:t>
+              <w:t>13.98%</w:t>
+            </w:r>
+          </w:p>
+        </w:tc>
+        <w:tc>
+          <w:tcPr>
+            <w:tcW w:w="2225" w:type="dxa"/>
+            <w:vAlign w:val="center"/>
+          </w:tcPr>
+          <w:p>
+            <w:pPr>
+              <w:cnfStyle w:val="000000000000" w:firstRow="0" w:lastRow="0" w:firstColumn="0" w:lastColumn="0" w:oddVBand="0" w:evenVBand="0" w:oddHBand="0" w:evenHBand="0" w:firstRowFirstColumn="0" w:firstRowLastColumn="0" w:lastRowFirstColumn="0" w:lastRowLastColumn="0"/>
+            </w:pPr>
+            <w:r>
+              <w:t>12.42%</w:t>
             </w:r>
           </w:p>
         </w:tc>
@@ -8017,37 +8124,54 @@
         <w:tc>
           <w:tcPr>
             <w:cnfStyle w:val="001000000000" w:firstRow="0" w:lastRow="0" w:firstColumn="1" w:lastColumn="0" w:oddVBand="0" w:evenVBand="0" w:oddHBand="0" w:evenHBand="0" w:firstRowFirstColumn="0" w:firstRowLastColumn="0" w:lastRowFirstColumn="0" w:lastRowLastColumn="0"/>
-            <w:tcW w:w="2695" w:type="dxa"/>
+            <w:tcW w:w="2007" w:type="dxa"/>
+            <w:vAlign w:val="center"/>
           </w:tcPr>
           <w:p>
             <w:r>
-              <w:t>LOLC</w:t>
+              <w:t>HUNA</w:t>
             </w:r>
           </w:p>
         </w:tc>
         <w:tc>
           <w:tcPr>
-            <w:tcW w:w="3240" w:type="dxa"/>
+            <w:tcW w:w="2504" w:type="dxa"/>
+            <w:vAlign w:val="center"/>
           </w:tcPr>
           <w:p>
             <w:pPr>
               <w:cnfStyle w:val="000000100000" w:firstRow="0" w:lastRow="0" w:firstColumn="0" w:lastColumn="0" w:oddVBand="0" w:evenVBand="0" w:oddHBand="1" w:evenHBand="0" w:firstRowFirstColumn="0" w:firstRowLastColumn="0" w:lastRowFirstColumn="0" w:lastRowLastColumn="0"/>
             </w:pPr>
             <w:r>
-              <w:t>11.36%</w:t>
+              <w:t>Hotels &amp; Travel</w:t>
             </w:r>
           </w:p>
         </w:tc>
         <w:tc>
           <w:tcPr>
-            <w:tcW w:w="3415" w:type="dxa"/>
+            <w:tcW w:w="2614" w:type="dxa"/>
+            <w:vAlign w:val="center"/>
           </w:tcPr>
           <w:p>
             <w:pPr>
               <w:cnfStyle w:val="000000100000" w:firstRow="0" w:lastRow="0" w:firstColumn="0" w:lastColumn="0" w:oddVBand="0" w:evenVBand="0" w:oddHBand="1" w:evenHBand="0" w:firstRowFirstColumn="0" w:firstRowLastColumn="0" w:lastRowFirstColumn="0" w:lastRowLastColumn="0"/>
             </w:pPr>
             <w:r>
-              <w:t>-</w:t>
+              <w:t>9.82%</w:t>
+            </w:r>
+          </w:p>
+        </w:tc>
+        <w:tc>
+          <w:tcPr>
+            <w:tcW w:w="2225" w:type="dxa"/>
+            <w:vAlign w:val="center"/>
+          </w:tcPr>
+          <w:p>
+            <w:pPr>
+              <w:cnfStyle w:val="000000100000" w:firstRow="0" w:lastRow="0" w:firstColumn="0" w:lastColumn="0" w:oddVBand="0" w:evenVBand="0" w:oddHBand="1" w:evenHBand="0" w:firstRowFirstColumn="0" w:firstRowLastColumn="0" w:lastRowFirstColumn="0" w:lastRowLastColumn="0"/>
+            </w:pPr>
+            <w:r>
+              <w:t>8.80%</w:t>
             </w:r>
           </w:p>
         </w:tc>
@@ -8056,37 +8180,54 @@
         <w:tc>
           <w:tcPr>
             <w:cnfStyle w:val="001000000000" w:firstRow="0" w:lastRow="0" w:firstColumn="1" w:lastColumn="0" w:oddVBand="0" w:evenVBand="0" w:oddHBand="0" w:evenHBand="0" w:firstRowFirstColumn="0" w:firstRowLastColumn="0" w:lastRowFirstColumn="0" w:lastRowLastColumn="0"/>
-            <w:tcW w:w="2695" w:type="dxa"/>
+            <w:tcW w:w="2007" w:type="dxa"/>
+            <w:vAlign w:val="center"/>
           </w:tcPr>
           <w:p>
             <w:r>
-              <w:t>SEYB</w:t>
+              <w:t>CTHR</w:t>
             </w:r>
           </w:p>
         </w:tc>
         <w:tc>
           <w:tcPr>
-            <w:tcW w:w="3240" w:type="dxa"/>
+            <w:tcW w:w="2504" w:type="dxa"/>
+            <w:vAlign w:val="center"/>
           </w:tcPr>
           <w:p>
             <w:pPr>
               <w:cnfStyle w:val="000000000000" w:firstRow="0" w:lastRow="0" w:firstColumn="0" w:lastColumn="0" w:oddVBand="0" w:evenVBand="0" w:oddHBand="0" w:evenHBand="0" w:firstRowFirstColumn="0" w:firstRowLastColumn="0" w:lastRowFirstColumn="0" w:lastRowLastColumn="0"/>
             </w:pPr>
             <w:r>
-              <w:t>-</w:t>
+              <w:t>Diversified</w:t>
             </w:r>
           </w:p>
         </w:tc>
         <w:tc>
           <w:tcPr>
-            <w:tcW w:w="3415" w:type="dxa"/>
+            <w:tcW w:w="2614" w:type="dxa"/>
+            <w:vAlign w:val="center"/>
           </w:tcPr>
           <w:p>
             <w:pPr>
               <w:cnfStyle w:val="000000000000" w:firstRow="0" w:lastRow="0" w:firstColumn="0" w:lastColumn="0" w:oddVBand="0" w:evenVBand="0" w:oddHBand="0" w:evenHBand="0" w:firstRowFirstColumn="0" w:firstRowLastColumn="0" w:lastRowFirstColumn="0" w:lastRowLastColumn="0"/>
             </w:pPr>
             <w:r>
-              <w:t>7.04%</w:t>
+              <w:t>22.15%</w:t>
+            </w:r>
+          </w:p>
+        </w:tc>
+        <w:tc>
+          <w:tcPr>
+            <w:tcW w:w="2225" w:type="dxa"/>
+            <w:vAlign w:val="center"/>
+          </w:tcPr>
+          <w:p>
+            <w:pPr>
+              <w:cnfStyle w:val="000000000000" w:firstRow="0" w:lastRow="0" w:firstColumn="0" w:lastColumn="0" w:oddVBand="0" w:evenVBand="0" w:oddHBand="0" w:evenHBand="0" w:firstRowFirstColumn="0" w:firstRowLastColumn="0" w:lastRowFirstColumn="0" w:lastRowLastColumn="0"/>
+            </w:pPr>
+            <w:r>
+              <w:t>—</w:t>
             </w:r>
           </w:p>
         </w:tc>
@@ -8098,37 +8239,54 @@
         <w:tc>
           <w:tcPr>
             <w:cnfStyle w:val="001000000000" w:firstRow="0" w:lastRow="0" w:firstColumn="1" w:lastColumn="0" w:oddVBand="0" w:evenVBand="0" w:oddHBand="0" w:evenHBand="0" w:firstRowFirstColumn="0" w:firstRowLastColumn="0" w:lastRowFirstColumn="0" w:lastRowLastColumn="0"/>
-            <w:tcW w:w="2695" w:type="dxa"/>
+            <w:tcW w:w="2007" w:type="dxa"/>
+            <w:vAlign w:val="center"/>
           </w:tcPr>
           <w:p>
             <w:r>
-              <w:t>RCL</w:t>
+              <w:t>HAYL</w:t>
             </w:r>
           </w:p>
         </w:tc>
         <w:tc>
           <w:tcPr>
-            <w:tcW w:w="3240" w:type="dxa"/>
+            <w:tcW w:w="2504" w:type="dxa"/>
+            <w:vAlign w:val="center"/>
           </w:tcPr>
           <w:p>
             <w:pPr>
               <w:cnfStyle w:val="000000100000" w:firstRow="0" w:lastRow="0" w:firstColumn="0" w:lastColumn="0" w:oddVBand="0" w:evenVBand="0" w:oddHBand="1" w:evenHBand="0" w:firstRowFirstColumn="0" w:firstRowLastColumn="0" w:lastRowFirstColumn="0" w:lastRowLastColumn="0"/>
             </w:pPr>
             <w:r>
-              <w:t>6.62%</w:t>
+              <w:t>Diversified</w:t>
             </w:r>
           </w:p>
         </w:tc>
         <w:tc>
           <w:tcPr>
-            <w:tcW w:w="3415" w:type="dxa"/>
+            <w:tcW w:w="2614" w:type="dxa"/>
+            <w:vAlign w:val="center"/>
           </w:tcPr>
           <w:p>
             <w:pPr>
               <w:cnfStyle w:val="000000100000" w:firstRow="0" w:lastRow="0" w:firstColumn="0" w:lastColumn="0" w:oddVBand="0" w:evenVBand="0" w:oddHBand="1" w:evenHBand="0" w:firstRowFirstColumn="0" w:firstRowLastColumn="0" w:lastRowFirstColumn="0" w:lastRowLastColumn="0"/>
             </w:pPr>
             <w:r>
-              <w:t>-</w:t>
+              <w:t>6.97%</w:t>
+            </w:r>
+          </w:p>
+        </w:tc>
+        <w:tc>
+          <w:tcPr>
+            <w:tcW w:w="2225" w:type="dxa"/>
+            <w:vAlign w:val="center"/>
+          </w:tcPr>
+          <w:p>
+            <w:pPr>
+              <w:cnfStyle w:val="000000100000" w:firstRow="0" w:lastRow="0" w:firstColumn="0" w:lastColumn="0" w:oddVBand="0" w:evenVBand="0" w:oddHBand="1" w:evenHBand="0" w:firstRowFirstColumn="0" w:firstRowLastColumn="0" w:lastRowFirstColumn="0" w:lastRowLastColumn="0"/>
+            </w:pPr>
+            <w:r>
+              <w:t>—</w:t>
             </w:r>
           </w:p>
         </w:tc>
@@ -8137,37 +8295,54 @@
         <w:tc>
           <w:tcPr>
             <w:cnfStyle w:val="001000000000" w:firstRow="0" w:lastRow="0" w:firstColumn="1" w:lastColumn="0" w:oddVBand="0" w:evenVBand="0" w:oddHBand="0" w:evenHBand="0" w:firstRowFirstColumn="0" w:firstRowLastColumn="0" w:lastRowFirstColumn="0" w:lastRowLastColumn="0"/>
-            <w:tcW w:w="2695" w:type="dxa"/>
+            <w:tcW w:w="2007" w:type="dxa"/>
+            <w:vAlign w:val="center"/>
           </w:tcPr>
           <w:p>
             <w:r>
-              <w:t>ACL</w:t>
+              <w:t>GRAN</w:t>
             </w:r>
           </w:p>
         </w:tc>
         <w:tc>
           <w:tcPr>
-            <w:tcW w:w="3240" w:type="dxa"/>
+            <w:tcW w:w="2504" w:type="dxa"/>
+            <w:vAlign w:val="center"/>
           </w:tcPr>
           <w:p>
             <w:pPr>
               <w:cnfStyle w:val="000000000000" w:firstRow="0" w:lastRow="0" w:firstColumn="0" w:lastColumn="0" w:oddVBand="0" w:evenVBand="0" w:oddHBand="0" w:evenHBand="0" w:firstRowFirstColumn="0" w:firstRowLastColumn="0" w:lastRowFirstColumn="0" w:lastRowLastColumn="0"/>
             </w:pPr>
             <w:r>
-              <w:t>-</w:t>
+              <w:t>Food &amp; Beverages</w:t>
             </w:r>
           </w:p>
         </w:tc>
         <w:tc>
           <w:tcPr>
-            <w:tcW w:w="3415" w:type="dxa"/>
+            <w:tcW w:w="2614" w:type="dxa"/>
+            <w:vAlign w:val="center"/>
           </w:tcPr>
           <w:p>
             <w:pPr>
               <w:cnfStyle w:val="000000000000" w:firstRow="0" w:lastRow="0" w:firstColumn="0" w:lastColumn="0" w:oddVBand="0" w:evenVBand="0" w:oddHBand="0" w:evenHBand="0" w:firstRowFirstColumn="0" w:firstRowLastColumn="0" w:lastRowFirstColumn="0" w:lastRowLastColumn="0"/>
             </w:pPr>
             <w:r>
-              <w:t>7.68%</w:t>
+              <w:t>6.98%</w:t>
+            </w:r>
+          </w:p>
+        </w:tc>
+        <w:tc>
+          <w:tcPr>
+            <w:tcW w:w="2225" w:type="dxa"/>
+            <w:vAlign w:val="center"/>
+          </w:tcPr>
+          <w:p>
+            <w:pPr>
+              <w:cnfStyle w:val="000000000000" w:firstRow="0" w:lastRow="0" w:firstColumn="0" w:lastColumn="0" w:oddVBand="0" w:evenVBand="0" w:oddHBand="0" w:evenHBand="0" w:firstRowFirstColumn="0" w:firstRowLastColumn="0" w:lastRowFirstColumn="0" w:lastRowLastColumn="0"/>
+            </w:pPr>
+            <w:r>
+              <w:t>—</w:t>
             </w:r>
           </w:p>
         </w:tc>
@@ -8179,37 +8354,54 @@
         <w:tc>
           <w:tcPr>
             <w:cnfStyle w:val="001000000000" w:firstRow="0" w:lastRow="0" w:firstColumn="1" w:lastColumn="0" w:oddVBand="0" w:evenVBand="0" w:oddHBand="0" w:evenHBand="0" w:firstRowFirstColumn="0" w:firstRowLastColumn="0" w:lastRowFirstColumn="0" w:lastRowLastColumn="0"/>
-            <w:tcW w:w="2695" w:type="dxa"/>
+            <w:tcW w:w="2007" w:type="dxa"/>
+            <w:vAlign w:val="center"/>
           </w:tcPr>
           <w:p>
             <w:r>
-              <w:t>JKH</w:t>
+              <w:t>CARG</w:t>
             </w:r>
           </w:p>
         </w:tc>
         <w:tc>
           <w:tcPr>
-            <w:tcW w:w="3240" w:type="dxa"/>
+            <w:tcW w:w="2504" w:type="dxa"/>
+            <w:vAlign w:val="center"/>
           </w:tcPr>
           <w:p>
             <w:pPr>
               <w:cnfStyle w:val="000000100000" w:firstRow="0" w:lastRow="0" w:firstColumn="0" w:lastColumn="0" w:oddVBand="0" w:evenVBand="0" w:oddHBand="1" w:evenHBand="0" w:firstRowFirstColumn="0" w:firstRowLastColumn="0" w:lastRowFirstColumn="0" w:lastRowLastColumn="0"/>
             </w:pPr>
             <w:r>
-              <w:t>15.03%</w:t>
+              <w:t>Food &amp; Beverages</w:t>
             </w:r>
           </w:p>
         </w:tc>
         <w:tc>
           <w:tcPr>
-            <w:tcW w:w="3415" w:type="dxa"/>
+            <w:tcW w:w="2614" w:type="dxa"/>
+            <w:vAlign w:val="center"/>
           </w:tcPr>
           <w:p>
             <w:pPr>
               <w:cnfStyle w:val="000000100000" w:firstRow="0" w:lastRow="0" w:firstColumn="0" w:lastColumn="0" w:oddVBand="0" w:evenVBand="0" w:oddHBand="1" w:evenHBand="0" w:firstRowFirstColumn="0" w:firstRowLastColumn="0" w:lastRowFirstColumn="0" w:lastRowLastColumn="0"/>
             </w:pPr>
             <w:r>
-              <w:t>-</w:t>
+              <w:t>—</w:t>
+            </w:r>
+          </w:p>
+        </w:tc>
+        <w:tc>
+          <w:tcPr>
+            <w:tcW w:w="2225" w:type="dxa"/>
+            <w:vAlign w:val="center"/>
+          </w:tcPr>
+          <w:p>
+            <w:pPr>
+              <w:cnfStyle w:val="000000100000" w:firstRow="0" w:lastRow="0" w:firstColumn="0" w:lastColumn="0" w:oddVBand="0" w:evenVBand="0" w:oddHBand="1" w:evenHBand="0" w:firstRowFirstColumn="0" w:firstRowLastColumn="0" w:lastRowFirstColumn="0" w:lastRowLastColumn="0"/>
+            </w:pPr>
+            <w:r>
+              <w:t>21.09%</w:t>
             </w:r>
           </w:p>
         </w:tc>
@@ -8218,37 +8410,54 @@
         <w:tc>
           <w:tcPr>
             <w:cnfStyle w:val="001000000000" w:firstRow="0" w:lastRow="0" w:firstColumn="1" w:lastColumn="0" w:oddVBand="0" w:evenVBand="0" w:oddHBand="0" w:evenHBand="0" w:firstRowFirstColumn="0" w:firstRowLastColumn="0" w:lastRowFirstColumn="0" w:lastRowLastColumn="0"/>
-            <w:tcW w:w="2695" w:type="dxa"/>
+            <w:tcW w:w="2007" w:type="dxa"/>
+            <w:vAlign w:val="center"/>
           </w:tcPr>
           <w:p>
             <w:r>
-              <w:t>HAYL</w:t>
+              <w:t>LAMB</w:t>
             </w:r>
           </w:p>
         </w:tc>
         <w:tc>
           <w:tcPr>
-            <w:tcW w:w="3240" w:type="dxa"/>
+            <w:tcW w:w="2504" w:type="dxa"/>
+            <w:vAlign w:val="center"/>
           </w:tcPr>
           <w:p>
             <w:pPr>
               <w:cnfStyle w:val="000000000000" w:firstRow="0" w:lastRow="0" w:firstColumn="0" w:lastColumn="0" w:oddVBand="0" w:evenVBand="0" w:oddHBand="0" w:evenHBand="0" w:firstRowFirstColumn="0" w:firstRowLastColumn="0" w:lastRowFirstColumn="0" w:lastRowLastColumn="0"/>
             </w:pPr>
             <w:r>
-              <w:t>12.36%</w:t>
+              <w:t>Food &amp; Beverages</w:t>
             </w:r>
           </w:p>
         </w:tc>
         <w:tc>
           <w:tcPr>
-            <w:tcW w:w="3415" w:type="dxa"/>
+            <w:tcW w:w="2614" w:type="dxa"/>
+            <w:vAlign w:val="center"/>
           </w:tcPr>
           <w:p>
             <w:pPr>
               <w:cnfStyle w:val="000000000000" w:firstRow="0" w:lastRow="0" w:firstColumn="0" w:lastColumn="0" w:oddVBand="0" w:evenVBand="0" w:oddHBand="0" w:evenHBand="0" w:firstRowFirstColumn="0" w:firstRowLastColumn="0" w:lastRowFirstColumn="0" w:lastRowLastColumn="0"/>
             </w:pPr>
             <w:r>
-              <w:t>10.91%</w:t>
+              <w:t>—</w:t>
+            </w:r>
+          </w:p>
+        </w:tc>
+        <w:tc>
+          <w:tcPr>
+            <w:tcW w:w="2225" w:type="dxa"/>
+            <w:vAlign w:val="center"/>
+          </w:tcPr>
+          <w:p>
+            <w:pPr>
+              <w:cnfStyle w:val="000000000000" w:firstRow="0" w:lastRow="0" w:firstColumn="0" w:lastColumn="0" w:oddVBand="0" w:evenVBand="0" w:oddHBand="0" w:evenHBand="0" w:firstRowFirstColumn="0" w:firstRowLastColumn="0" w:lastRowFirstColumn="0" w:lastRowLastColumn="0"/>
+            </w:pPr>
+            <w:r>
+              <w:t>12.07%</w:t>
             </w:r>
           </w:p>
         </w:tc>
@@ -8260,199 +8469,54 @@
         <w:tc>
           <w:tcPr>
             <w:cnfStyle w:val="001000000000" w:firstRow="0" w:lastRow="0" w:firstColumn="1" w:lastColumn="0" w:oddVBand="0" w:evenVBand="0" w:oddHBand="0" w:evenHBand="0" w:firstRowFirstColumn="0" w:firstRowLastColumn="0" w:lastRowFirstColumn="0" w:lastRowLastColumn="0"/>
-            <w:tcW w:w="2695" w:type="dxa"/>
+            <w:tcW w:w="2007" w:type="dxa"/>
+            <w:vAlign w:val="center"/>
           </w:tcPr>
           <w:p>
             <w:r>
-              <w:t>BUKI</w:t>
+              <w:t>VLL</w:t>
             </w:r>
           </w:p>
         </w:tc>
         <w:tc>
           <w:tcPr>
-            <w:tcW w:w="3240" w:type="dxa"/>
+            <w:tcW w:w="2504" w:type="dxa"/>
+            <w:vAlign w:val="center"/>
           </w:tcPr>
           <w:p>
             <w:pPr>
               <w:cnfStyle w:val="000000100000" w:firstRow="0" w:lastRow="0" w:firstColumn="0" w:lastColumn="0" w:oddVBand="0" w:evenVBand="0" w:oddHBand="1" w:evenHBand="0" w:firstRowFirstColumn="0" w:firstRowLastColumn="0" w:lastRowFirstColumn="0" w:lastRowLastColumn="0"/>
             </w:pPr>
             <w:r>
-              <w:t>-</w:t>
+              <w:t>Energy</w:t>
             </w:r>
           </w:p>
         </w:tc>
         <w:tc>
           <w:tcPr>
-            <w:tcW w:w="3415" w:type="dxa"/>
+            <w:tcW w:w="2614" w:type="dxa"/>
+            <w:vAlign w:val="center"/>
           </w:tcPr>
           <w:p>
             <w:pPr>
               <w:cnfStyle w:val="000000100000" w:firstRow="0" w:lastRow="0" w:firstColumn="0" w:lastColumn="0" w:oddVBand="0" w:evenVBand="0" w:oddHBand="1" w:evenHBand="0" w:firstRowFirstColumn="0" w:firstRowLastColumn="0" w:lastRowFirstColumn="0" w:lastRowLastColumn="0"/>
             </w:pPr>
             <w:r>
-              <w:t>5.88%</w:t>
-            </w:r>
-          </w:p>
-        </w:tc>
-      </w:tr>
-      <w:tr>
-        <w:tc>
-          <w:tcPr>
-            <w:cnfStyle w:val="001000000000" w:firstRow="0" w:lastRow="0" w:firstColumn="1" w:lastColumn="0" w:oddVBand="0" w:evenVBand="0" w:oddHBand="0" w:evenHBand="0" w:firstRowFirstColumn="0" w:firstRowLastColumn="0" w:lastRowFirstColumn="0" w:lastRowLastColumn="0"/>
-            <w:tcW w:w="2695" w:type="dxa"/>
-          </w:tcPr>
-          <w:p>
-            <w:r>
-              <w:t>CITH</w:t>
+              <w:t>—</w:t>
             </w:r>
           </w:p>
         </w:tc>
         <w:tc>
           <w:tcPr>
-            <w:tcW w:w="3240" w:type="dxa"/>
-          </w:tcPr>
-          <w:p>
-            <w:pPr>
-              <w:cnfStyle w:val="000000000000" w:firstRow="0" w:lastRow="0" w:firstColumn="0" w:lastColumn="0" w:oddVBand="0" w:evenVBand="0" w:oddHBand="0" w:evenHBand="0" w:firstRowFirstColumn="0" w:firstRowLastColumn="0" w:lastRowFirstColumn="0" w:lastRowLastColumn="0"/>
-            </w:pPr>
-            <w:r>
-              <w:t>-</w:t>
-            </w:r>
-          </w:p>
-        </w:tc>
-        <w:tc>
-          <w:tcPr>
-            <w:tcW w:w="3415" w:type="dxa"/>
-          </w:tcPr>
-          <w:p>
-            <w:pPr>
-              <w:cnfStyle w:val="000000000000" w:firstRow="0" w:lastRow="0" w:firstColumn="0" w:lastColumn="0" w:oddVBand="0" w:evenVBand="0" w:oddHBand="0" w:evenHBand="0" w:firstRowFirstColumn="0" w:firstRowLastColumn="0" w:lastRowFirstColumn="0" w:lastRowLastColumn="0"/>
-            </w:pPr>
-            <w:r>
-              <w:t>12.37%</w:t>
-            </w:r>
-          </w:p>
-        </w:tc>
-      </w:tr>
-      <w:tr>
-        <w:trPr>
-          <w:cnfStyle w:val="000000100000" w:firstRow="0" w:lastRow="0" w:firstColumn="0" w:lastColumn="0" w:oddVBand="0" w:evenVBand="0" w:oddHBand="1" w:evenHBand="0" w:firstRowFirstColumn="0" w:firstRowLastColumn="0" w:lastRowFirstColumn="0" w:lastRowLastColumn="0"/>
-        </w:trPr>
-        <w:tc>
-          <w:tcPr>
-            <w:cnfStyle w:val="001000000000" w:firstRow="0" w:lastRow="0" w:firstColumn="1" w:lastColumn="0" w:oddVBand="0" w:evenVBand="0" w:oddHBand="0" w:evenHBand="0" w:firstRowFirstColumn="0" w:firstRowLastColumn="0" w:lastRowFirstColumn="0" w:lastRowLastColumn="0"/>
-            <w:tcW w:w="2695" w:type="dxa"/>
-          </w:tcPr>
-          <w:p>
-            <w:r>
-              <w:t>GLAS</w:t>
-            </w:r>
-          </w:p>
-        </w:tc>
-        <w:tc>
-          <w:tcPr>
-            <w:tcW w:w="3240" w:type="dxa"/>
+            <w:tcW w:w="2225" w:type="dxa"/>
+            <w:vAlign w:val="center"/>
           </w:tcPr>
           <w:p>
             <w:pPr>
               <w:cnfStyle w:val="000000100000" w:firstRow="0" w:lastRow="0" w:firstColumn="0" w:lastColumn="0" w:oddVBand="0" w:evenVBand="0" w:oddHBand="1" w:evenHBand="0" w:firstRowFirstColumn="0" w:firstRowLastColumn="0" w:lastRowFirstColumn="0" w:lastRowLastColumn="0"/>
             </w:pPr>
             <w:r>
-              <w:t>9.82%</w:t>
-            </w:r>
-          </w:p>
-        </w:tc>
-        <w:tc>
-          <w:tcPr>
-            <w:tcW w:w="3415" w:type="dxa"/>
-          </w:tcPr>
-          <w:p>
-            <w:pPr>
-              <w:cnfStyle w:val="000000100000" w:firstRow="0" w:lastRow="0" w:firstColumn="0" w:lastColumn="0" w:oddVBand="0" w:evenVBand="0" w:oddHBand="1" w:evenHBand="0" w:firstRowFirstColumn="0" w:firstRowLastColumn="0" w:lastRowFirstColumn="0" w:lastRowLastColumn="0"/>
-            </w:pPr>
-            <w:r>
-              <w:t>-</w:t>
-            </w:r>
-          </w:p>
-        </w:tc>
-      </w:tr>
-      <w:tr>
-        <w:tc>
-          <w:tcPr>
-            <w:cnfStyle w:val="001000000000" w:firstRow="0" w:lastRow="0" w:firstColumn="1" w:lastColumn="0" w:oddVBand="0" w:evenVBand="0" w:oddHBand="0" w:evenHBand="0" w:firstRowFirstColumn="0" w:firstRowLastColumn="0" w:lastRowFirstColumn="0" w:lastRowLastColumn="0"/>
-            <w:tcW w:w="2695" w:type="dxa"/>
-          </w:tcPr>
-          <w:p>
-            <w:r>
-              <w:t>DIAL</w:t>
-            </w:r>
-          </w:p>
-        </w:tc>
-        <w:tc>
-          <w:tcPr>
-            <w:tcW w:w="3240" w:type="dxa"/>
-          </w:tcPr>
-          <w:p>
-            <w:pPr>
-              <w:cnfStyle w:val="000000000000" w:firstRow="0" w:lastRow="0" w:firstColumn="0" w:lastColumn="0" w:oddVBand="0" w:evenVBand="0" w:oddHBand="0" w:evenHBand="0" w:firstRowFirstColumn="0" w:firstRowLastColumn="0" w:lastRowFirstColumn="0" w:lastRowLastColumn="0"/>
-            </w:pPr>
-            <w:r>
-              <w:t>20.03%</w:t>
-            </w:r>
-          </w:p>
-        </w:tc>
-        <w:tc>
-          <w:tcPr>
-            <w:tcW w:w="3415" w:type="dxa"/>
-          </w:tcPr>
-          <w:p>
-            <w:pPr>
-              <w:cnfStyle w:val="000000000000" w:firstRow="0" w:lastRow="0" w:firstColumn="0" w:lastColumn="0" w:oddVBand="0" w:evenVBand="0" w:oddHBand="0" w:evenHBand="0" w:firstRowFirstColumn="0" w:firstRowLastColumn="0" w:lastRowFirstColumn="0" w:lastRowLastColumn="0"/>
-            </w:pPr>
-            <w:r>
-              <w:t>-</w:t>
-            </w:r>
-          </w:p>
-        </w:tc>
-      </w:tr>
-      <w:tr>
-        <w:trPr>
-          <w:cnfStyle w:val="000000100000" w:firstRow="0" w:lastRow="0" w:firstColumn="0" w:lastColumn="0" w:oddVBand="0" w:evenVBand="0" w:oddHBand="1" w:evenHBand="0" w:firstRowFirstColumn="0" w:firstRowLastColumn="0" w:lastRowFirstColumn="0" w:lastRowLastColumn="0"/>
-        </w:trPr>
-        <w:tc>
-          <w:tcPr>
-            <w:cnfStyle w:val="001000000000" w:firstRow="0" w:lastRow="0" w:firstColumn="1" w:lastColumn="0" w:oddVBand="0" w:evenVBand="0" w:oddHBand="0" w:evenHBand="0" w:firstRowFirstColumn="0" w:firstRowLastColumn="0" w:lastRowFirstColumn="0" w:lastRowLastColumn="0"/>
-            <w:tcW w:w="2695" w:type="dxa"/>
-          </w:tcPr>
-          <w:p>
-            <w:r>
-              <w:t>TELE</w:t>
-            </w:r>
-          </w:p>
-        </w:tc>
-        <w:tc>
-          <w:tcPr>
-            <w:tcW w:w="3240" w:type="dxa"/>
-          </w:tcPr>
-          <w:p>
-            <w:pPr>
-              <w:cnfStyle w:val="000000100000" w:firstRow="0" w:lastRow="0" w:firstColumn="0" w:lastColumn="0" w:oddVBand="0" w:evenVBand="0" w:oddHBand="1" w:evenHBand="0" w:firstRowFirstColumn="0" w:firstRowLastColumn="0" w:lastRowFirstColumn="0" w:lastRowLastColumn="0"/>
-            </w:pPr>
-            <w:r>
-              <w:t>16.43%</w:t>
-            </w:r>
-          </w:p>
-        </w:tc>
-        <w:tc>
-          <w:tcPr>
-            <w:tcW w:w="3415" w:type="dxa"/>
-          </w:tcPr>
-          <w:p>
-            <w:pPr>
-              <w:cnfStyle w:val="000000100000" w:firstRow="0" w:lastRow="0" w:firstColumn="0" w:lastColumn="0" w:oddVBand="0" w:evenVBand="0" w:oddHBand="1" w:evenHBand="0" w:firstRowFirstColumn="0" w:firstRowLastColumn="0" w:lastRowFirstColumn="0" w:lastRowLastColumn="0"/>
-            </w:pPr>
-            <w:r>
-              <w:t>24.60%</w:t>
+              <w:t>11.96%</w:t>
             </w:r>
           </w:p>
         </w:tc>
@@ -8462,51 +8526,66 @@
     <w:p>
       <w:r>
         <w:lastRenderedPageBreak/>
-        <w:t>Both portfolios share COMB, HAYL, and TELE</w:t>
-      </w:r>
-      <w:r>
-        <w:t xml:space="preserve">, </w:t>
-      </w:r>
-      <w:r>
-        <w:t xml:space="preserve">the three assets with the most consistently high risk-adjusted returns </w:t>
-      </w:r>
-      <w:proofErr w:type="gramStart"/>
-      <w:r>
-        <w:t>across</w:t>
-      </w:r>
-      <w:proofErr w:type="gramEnd"/>
-      <w:r>
-        <w:t xml:space="preserve"> the sample period. The GA portfolio is more concentrated in Banking (COMB, HNB, SEYB: ~38%) and Telecom (TELE: 24.6%), whilst the B&amp;B solution is more evenly distributed across Diversified Holdings (JKH, HAYL: 27.4%) and Telecom (DIAL, TELE: 36.5%). </w:t>
-      </w:r>
-      <w:proofErr w:type="gramStart"/>
-      <w:r>
-        <w:t>The GA's</w:t>
-      </w:r>
-      <w:proofErr w:type="gramEnd"/>
-      <w:r>
-        <w:t xml:space="preserve"> lower volatility (4.46% vs 8.71%) arises from its implicit </w:t>
-      </w:r>
-      <w:r>
-        <w:t>favoring</w:t>
-      </w:r>
-      <w:r>
-        <w:t xml:space="preserve"> of lower-variance bank stocks with relatively high expected returns</w:t>
+        <w:t xml:space="preserve">Both portfolios share five common </w:t>
+      </w:r>
+      <w:r>
+        <w:t>holdings CFVF</w:t>
+      </w:r>
+      <w:r>
+        <w:t>, SFCL, GREG, GLAS, and HUNA representing the assets with the most consistently strong risk-adjusted characteristics across the 2020–2025 sample period. This agreement across two fundamentally different search strategies provides implicit validation that these five stocks genuinely dominate the CSE efficient frontier under the given constraints.</w:t>
+      </w:r>
+    </w:p>
+    <w:p>
+      <w:r>
+        <w:t xml:space="preserve">The methods diverge in how they fill the remaining three positions. The B&amp;B solution concentrates </w:t>
+      </w:r>
+      <w:r>
+        <w:t>on</w:t>
+      </w:r>
+      <w:r>
+        <w:t xml:space="preserve"> Diversified Holdings (CTHR 22.15%, HAYL 6.97%, GREG 12.21%</w:t>
       </w:r>
       <w:r>
         <w:t>,</w:t>
       </w:r>
       <w:r>
-        <w:t xml:space="preserve"> a portfolio structure that the greedy-</w:t>
+        <w:t xml:space="preserve"> combined 41.3%), producing a higher raw return of 48.66% at the cost of elevated volatility (21.29%). The GA portfolio instead expands into Food &amp; Beverages (CARG 21.09%, LAMB 12.07%) and Energy (VLL 11.96%), sectors that B&amp;B's truncated greedy-</w:t>
       </w:r>
       <w:r>
         <w:t>initialized</w:t>
       </w:r>
       <w:r>
-        <w:t xml:space="preserve"> B&amp;B does not discover within its truncated search</w:t>
-      </w:r>
-      <w:r>
-        <w:t>.</w:t>
-      </w:r>
+        <w:t xml:space="preserve"> search did not explore. This sector diversification is precisely what drives </w:t>
+      </w:r>
+      <w:r>
+        <w:t>GA’s</w:t>
+      </w:r>
+      <w:r>
+        <w:t xml:space="preserve"> superior risk-adjusted performance: a lower return of 45.29% paired with substantially lower volatility of 18.50% yields a higher Sharpe ratio of 1.9072 versus B&amp;B's 1.8160.</w:t>
+      </w:r>
+    </w:p>
+    <w:p>
+      <w:r>
+        <w:t xml:space="preserve">Both results are strong by absolute standards a Sharpe above 1.8 is classified as excellent by conventional </w:t>
+      </w:r>
+      <w:r>
+        <w:t>benchmarks and</w:t>
+      </w:r>
+      <w:r>
+        <w:t xml:space="preserve"> both significantly outperform any individual asset in the universe on a risk-adjusted basis, confirming the diversification benefit of the cardinality-constrained Markowitz framework even in the volatile CSE market context. The optimality gap of </w:t>
+      </w:r>
+      <w:r>
+        <w:t xml:space="preserve">5.0% </w:t>
+      </w:r>
+      <w:r>
+        <w:t>(1.9072 − 1.8160) / 1.9072 × 100) reflects B&amp;B's truncated search rather than a theoretical weakness, as discussed in Section 6.1.</w:t>
+      </w:r>
+    </w:p>
+    <w:p>
+      <w:pPr>
+        <w:spacing w:after="180" w:line="288" w:lineRule="auto"/>
+        <w:jc w:val="left"/>
+      </w:pPr>
     </w:p>
     <w:p>
       <w:pPr>
@@ -8517,7 +8596,7 @@
         </w:numPr>
         <w:ind w:left="360" w:hanging="360"/>
       </w:pPr>
-      <w:bookmarkStart w:id="28" w:name="_Toc226495528"/>
+      <w:bookmarkStart w:id="28" w:name="_Toc226757959"/>
       <w:r>
         <w:t xml:space="preserve">6.3 </w:t>
       </w:r>
@@ -8526,20 +8605,21 @@
       </w:r>
       <w:bookmarkEnd w:id="28"/>
     </w:p>
+    <w:p/>
     <w:p>
       <w:r>
         <w:drawing>
-          <wp:anchor distT="0" distB="0" distL="114300" distR="114300" simplePos="0" relativeHeight="251668480" behindDoc="0" locked="0" layoutInCell="1" allowOverlap="1" wp14:anchorId="7B1D10B8" wp14:editId="277F5FE7">
+          <wp:anchor distT="0" distB="0" distL="114300" distR="114300" simplePos="0" relativeHeight="251668480" behindDoc="0" locked="0" layoutInCell="1" allowOverlap="1" wp14:anchorId="7B1D10B8" wp14:editId="799A9461">
             <wp:simplePos x="0" y="0"/>
             <wp:positionH relativeFrom="column">
-              <wp:posOffset>22225</wp:posOffset>
+              <wp:posOffset>27305</wp:posOffset>
             </wp:positionH>
             <wp:positionV relativeFrom="page">
-              <wp:posOffset>2868506</wp:posOffset>
+              <wp:posOffset>5350722</wp:posOffset>
             </wp:positionV>
             <wp:extent cx="2971800" cy="2216150"/>
             <wp:effectExtent l="0" t="0" r="0" b="0"/>
-            <wp:wrapSquare wrapText="bothSides"/>
+            <wp:wrapNone/>
             <wp:docPr id="1213221845" name="Picture 1"/>
             <wp:cNvGraphicFramePr>
               <a:graphicFrameLocks xmlns:a="http://schemas.openxmlformats.org/drawingml/2006/main" noChangeAspect="1"/>
@@ -8579,25 +8659,45 @@
         </w:drawing>
       </w:r>
     </w:p>
+    <w:p/>
+    <w:p/>
+    <w:p/>
+    <w:p/>
+    <w:p/>
+    <w:p/>
     <w:p>
       <w:r>
-        <w:t>Figure 2(a) illustrates the GA's progressive exploration of the search space: the best fitness increases sharply in early generations (generations 1–40) as the population discovers better asset combinations, then plateaus after generation 80, suggesting convergence. The horizontal dashed line marks the B&amp;B warm-start benchmark; the GA surpasses this within the first 20 generations, demonstrating the efficiency of evolutionary search for this problem class.</w:t>
+        <w:t xml:space="preserve">The GA best fitness (blue) rises sharply within the first 15 generations, crossing the B&amp;B benchmark of 1.8160 almost immediately before </w:t>
+      </w:r>
+      <w:r>
+        <w:t>stabilizing</w:t>
+      </w:r>
+      <w:r>
+        <w:t xml:space="preserve"> around generation 40 at a final Sharpe of 1.9072. The population average (green dashed) tracks below the best throughout, confirming that population diversity was maintained and premature convergence was avoided. The GA ultimately surpasses the B&amp;B incumbent</w:t>
+      </w:r>
+      <w:r>
+        <w:t>,</w:t>
+      </w:r>
+      <w:r>
+        <w:t xml:space="preserve"> a consequence of B&amp;B's truncated search rather than any theoretical weakness in the exact method.</w:t>
       </w:r>
     </w:p>
+    <w:p/>
+    <w:p/>
     <w:p>
       <w:r>
         <w:drawing>
-          <wp:anchor distT="0" distB="0" distL="114300" distR="114300" simplePos="0" relativeHeight="251669504" behindDoc="0" locked="0" layoutInCell="1" allowOverlap="1" wp14:anchorId="6D240D4A" wp14:editId="66369FCE">
+          <wp:anchor distT="0" distB="0" distL="114300" distR="114300" simplePos="0" relativeHeight="251669504" behindDoc="0" locked="0" layoutInCell="1" allowOverlap="1" wp14:anchorId="6D240D4A" wp14:editId="1D4DAFDB">
             <wp:simplePos x="0" y="0"/>
             <wp:positionH relativeFrom="column">
-              <wp:posOffset>21802</wp:posOffset>
+              <wp:posOffset>33443</wp:posOffset>
             </wp:positionH>
             <wp:positionV relativeFrom="page">
-              <wp:posOffset>5437505</wp:posOffset>
+              <wp:posOffset>885614</wp:posOffset>
             </wp:positionV>
             <wp:extent cx="2945130" cy="2167255"/>
             <wp:effectExtent l="0" t="0" r="7620" b="4445"/>
-            <wp:wrapSquare wrapText="bothSides"/>
+            <wp:wrapNone/>
             <wp:docPr id="1783999805" name="Picture 1"/>
             <wp:cNvGraphicFramePr>
               <a:graphicFrameLocks xmlns:a="http://schemas.openxmlformats.org/drawingml/2006/main" noChangeAspect="1"/>
@@ -8637,30 +8737,84 @@
         </w:drawing>
       </w:r>
     </w:p>
-    <w:p>
-      <w:r>
-        <w:t>Figure 2(c) places both portfolios on the risk-return plane alongside the 30 individual assets. Both portfolios lie well above the individual asset cloud</w:t>
-      </w:r>
-      <w:r>
-        <w:t xml:space="preserve">; </w:t>
-      </w:r>
-      <w:r>
-        <w:t>confirming the diversification benefit and the GA portfolio plots further along the Capital Market Line, reflecting its superior Sharpe ratio. This visual confirms that both methods successfully exploit the correlation structure of the CSE asset universe.</w:t>
-      </w:r>
-    </w:p>
-    <w:p/>
     <w:p/>
     <w:p/>
     <w:p/>
     <w:p/>
     <w:p>
+      <w:r>
+        <w:t>Figure 2(c) places both portfolios on the risk-return plane alongside the 30 individual assets. Both portfolios lie well above the individual asset cloud</w:t>
+      </w:r>
+      <w:r>
+        <w:t xml:space="preserve">; </w:t>
+      </w:r>
+      <w:r>
+        <w:t>confirming the diversification benefit and the GA portfolio plots further along the Capital Market Line, reflecting its superior Sharpe ratio. This visual confirms that both methods successfully exploit the correlation structure of the CSE asset universe.</w:t>
+      </w:r>
+    </w:p>
+    <w:p>
+      <w:r>
+        <w:drawing>
+          <wp:inline distT="0" distB="0" distL="0" distR="0" wp14:anchorId="6F2A82FE" wp14:editId="4CF04A83">
+            <wp:extent cx="5512083" cy="2292468"/>
+            <wp:effectExtent l="0" t="0" r="0" b="0"/>
+            <wp:docPr id="1657696027" name="Picture 1"/>
+            <wp:cNvGraphicFramePr>
+              <a:graphicFrameLocks xmlns:a="http://schemas.openxmlformats.org/drawingml/2006/main" noChangeAspect="1"/>
+            </wp:cNvGraphicFramePr>
+            <a:graphic xmlns:a="http://schemas.openxmlformats.org/drawingml/2006/main">
+              <a:graphicData uri="http://schemas.openxmlformats.org/drawingml/2006/picture">
+                <pic:pic xmlns:pic="http://schemas.openxmlformats.org/drawingml/2006/picture">
+                  <pic:nvPicPr>
+                    <pic:cNvPr id="1657696027" name=""/>
+                    <pic:cNvPicPr/>
+                  </pic:nvPicPr>
+                  <pic:blipFill>
+                    <a:blip r:embed="rId25"/>
+                    <a:stretch>
+                      <a:fillRect/>
+                    </a:stretch>
+                  </pic:blipFill>
+                  <pic:spPr>
+                    <a:xfrm>
+                      <a:off x="0" y="0"/>
+                      <a:ext cx="5512083" cy="2292468"/>
+                    </a:xfrm>
+                    <a:prstGeom prst="rect">
+                      <a:avLst/>
+                    </a:prstGeom>
+                  </pic:spPr>
+                </pic:pic>
+              </a:graphicData>
+            </a:graphic>
+          </wp:inline>
+        </w:drawing>
+      </w:r>
+    </w:p>
+    <w:p/>
+    <w:p>
+      <w:r>
+        <w:t>The runtime chart (log scale) shows GA runtime remaining flat between 3–8 seconds across all tested sizes — a direct consequence of the fixed 3,000-evaluation budget</w:t>
+      </w:r>
+      <w:r>
+        <w:t>:</w:t>
+      </w:r>
+      <w:r>
+        <w:t xml:space="preserve"> while B&amp;B runtime grows with N, hitting the 30-second hard limit at N = 30. The optimality gap chart tells the most important story: the y-axis scale of 10⁻¹³ confirms that all gaps are effectively zero across N = 10 to 25, meaning the GA independently located the same globally optimal solution that B&amp;B certified as exact. The values are floating point residuals, not meaningful differences. At N = 30, where B&amp;B could not complete the full tree search, a marginal gap emerged directionally </w:t>
+      </w:r>
+      <w:r>
+        <w:t>consistently</w:t>
+      </w:r>
+      <w:r>
+        <w:t xml:space="preserve"> with the expectation that scalability constraints on exact methods widen the gap as N grows.</w:t>
+      </w:r>
+    </w:p>
+    <w:p/>
+    <w:p>
       <w:pPr>
         <w:spacing w:after="180" w:line="288" w:lineRule="auto"/>
         <w:jc w:val="left"/>
       </w:pPr>
-      <w:r>
-        <w:br w:type="page"/>
-      </w:r>
     </w:p>
     <w:p>
       <w:pPr>
@@ -8670,7 +8824,7 @@
           <w:numId w:val="17"/>
         </w:numPr>
       </w:pPr>
-      <w:bookmarkStart w:id="29" w:name="_Toc226495529"/>
+      <w:bookmarkStart w:id="29" w:name="_Toc226757960"/>
       <w:r>
         <w:lastRenderedPageBreak/>
         <w:t>Scalability Analysis</w:t>
@@ -8681,6 +8835,9 @@
       </w:r>
     </w:p>
     <w:p>
+      <w:r>
+        <w:br/>
+      </w:r>
       <w:r>
         <w:t xml:space="preserve">The scalability experiment evaluates both methods on synthetic instances of increasing size (N = 10 to 30 assets, K = 5). This isolates the computational scaling </w:t>
       </w:r>
@@ -8703,7 +8860,6 @@
         <w:gridCol w:w="1558"/>
         <w:gridCol w:w="1558"/>
         <w:gridCol w:w="1559"/>
-        <w:gridCol w:w="1559"/>
       </w:tblGrid>
       <w:tr>
         <w:trPr>
@@ -8769,24 +8925,6 @@
             </w:pPr>
             <w:r>
               <w:t>GA Sharpe</w:t>
-            </w:r>
-          </w:p>
-        </w:tc>
-        <w:tc>
-          <w:tcPr>
-            <w:tcW w:w="1559" w:type="dxa"/>
-          </w:tcPr>
-          <w:p>
-            <w:pPr>
-              <w:cnfStyle w:val="100000000000" w:firstRow="1" w:lastRow="0" w:firstColumn="0" w:lastColumn="0" w:oddVBand="0" w:evenVBand="0" w:oddHBand="0" w:evenHBand="0" w:firstRowFirstColumn="0" w:firstRowLastColumn="0" w:lastRowFirstColumn="0" w:lastRowLastColumn="0"/>
-            </w:pPr>
-            <w:proofErr w:type="gramStart"/>
-            <w:r>
-              <w:t>Gap(</w:t>
-            </w:r>
-            <w:proofErr w:type="gramEnd"/>
-            <w:r>
-              <w:t>%)</w:t>
             </w:r>
           </w:p>
         </w:tc>
@@ -8810,13 +8948,50 @@
           <w:tcPr>
             <w:tcW w:w="1558" w:type="dxa"/>
           </w:tcPr>
+          <w:tbl>
+            <w:tblPr>
+              <w:tblW w:w="0" w:type="auto"/>
+              <w:tblCellSpacing w:w="15" w:type="dxa"/>
+              <w:tblCellMar>
+                <w:top w:w="15" w:type="dxa"/>
+                <w:left w:w="15" w:type="dxa"/>
+                <w:bottom w:w="15" w:type="dxa"/>
+                <w:right w:w="15" w:type="dxa"/>
+              </w:tblCellMar>
+              <w:tblLook w:val="04A0" w:firstRow="1" w:lastRow="0" w:firstColumn="1" w:lastColumn="0" w:noHBand="0" w:noVBand="1"/>
+            </w:tblPr>
+            <w:tblGrid>
+              <w:gridCol w:w="516"/>
+            </w:tblGrid>
+            <w:tr>
+              <w:trPr>
+                <w:tblCellSpacing w:w="15" w:type="dxa"/>
+              </w:trPr>
+              <w:tc>
+                <w:tcPr>
+                  <w:tcW w:w="0" w:type="auto"/>
+                  <w:vAlign w:val="center"/>
+                  <w:hideMark/>
+                </w:tcPr>
+                <w:p>
+                  <w:pPr>
+                    <w:spacing w:after="0"/>
+                    <w:jc w:val="left"/>
+                    <w:rPr>
+                      <w:rFonts w:ascii="Times New Roman" w:hAnsi="Times New Roman"/>
+                    </w:rPr>
+                  </w:pPr>
+                  <w:r>
+                    <w:t>1.86</w:t>
+                  </w:r>
+                </w:p>
+              </w:tc>
+            </w:tr>
+          </w:tbl>
           <w:p>
             <w:pPr>
               <w:cnfStyle w:val="000000100000" w:firstRow="0" w:lastRow="0" w:firstColumn="0" w:lastColumn="0" w:oddVBand="0" w:evenVBand="0" w:oddHBand="1" w:evenHBand="0" w:firstRowFirstColumn="0" w:firstRowLastColumn="0" w:lastRowFirstColumn="0" w:lastRowLastColumn="0"/>
             </w:pPr>
-            <w:r>
-              <w:t>0.30</w:t>
-            </w:r>
           </w:p>
         </w:tc>
         <w:tc>
@@ -8828,7 +9003,7 @@
               <w:cnfStyle w:val="000000100000" w:firstRow="0" w:lastRow="0" w:firstColumn="0" w:lastColumn="0" w:oddVBand="0" w:evenVBand="0" w:oddHBand="1" w:evenHBand="0" w:firstRowFirstColumn="0" w:firstRowLastColumn="0" w:lastRowFirstColumn="0" w:lastRowLastColumn="0"/>
             </w:pPr>
             <w:r>
-              <w:t>2.459</w:t>
+              <w:t>2.47</w:t>
             </w:r>
           </w:p>
         </w:tc>
@@ -8836,39 +9011,100 @@
           <w:tcPr>
             <w:tcW w:w="1558" w:type="dxa"/>
           </w:tcPr>
+          <w:tbl>
+            <w:tblPr>
+              <w:tblW w:w="0" w:type="auto"/>
+              <w:tblCellSpacing w:w="15" w:type="dxa"/>
+              <w:tblCellMar>
+                <w:top w:w="15" w:type="dxa"/>
+                <w:left w:w="15" w:type="dxa"/>
+                <w:bottom w:w="15" w:type="dxa"/>
+                <w:right w:w="15" w:type="dxa"/>
+              </w:tblCellMar>
+              <w:tblLook w:val="04A0" w:firstRow="1" w:lastRow="0" w:firstColumn="1" w:lastColumn="0" w:noHBand="0" w:noVBand="1"/>
+            </w:tblPr>
+            <w:tblGrid>
+              <w:gridCol w:w="638"/>
+            </w:tblGrid>
+            <w:tr>
+              <w:trPr>
+                <w:tblCellSpacing w:w="15" w:type="dxa"/>
+              </w:trPr>
+              <w:tc>
+                <w:tcPr>
+                  <w:tcW w:w="0" w:type="auto"/>
+                  <w:vAlign w:val="center"/>
+                  <w:hideMark/>
+                </w:tcPr>
+                <w:p>
+                  <w:pPr>
+                    <w:spacing w:after="0"/>
+                    <w:jc w:val="left"/>
+                    <w:rPr>
+                      <w:rFonts w:ascii="Times New Roman" w:hAnsi="Times New Roman"/>
+                    </w:rPr>
+                  </w:pPr>
+                  <w:r>
+                    <w:t>75.78</w:t>
+                  </w:r>
+                </w:p>
+              </w:tc>
+            </w:tr>
+          </w:tbl>
           <w:p>
             <w:pPr>
               <w:cnfStyle w:val="000000100000" w:firstRow="0" w:lastRow="0" w:firstColumn="0" w:lastColumn="0" w:oddVBand="0" w:evenVBand="0" w:oddHBand="1" w:evenHBand="0" w:firstRowFirstColumn="0" w:firstRowLastColumn="0" w:lastRowFirstColumn="0" w:lastRowLastColumn="0"/>
             </w:pPr>
-            <w:r>
-              <w:t>19.2</w:t>
-            </w:r>
           </w:p>
         </w:tc>
         <w:tc>
           <w:tcPr>
             <w:tcW w:w="1559" w:type="dxa"/>
           </w:tcPr>
+          <w:tbl>
+            <w:tblPr>
+              <w:tblW w:w="0" w:type="auto"/>
+              <w:tblCellSpacing w:w="15" w:type="dxa"/>
+              <w:tblCellMar>
+                <w:top w:w="15" w:type="dxa"/>
+                <w:left w:w="15" w:type="dxa"/>
+                <w:bottom w:w="15" w:type="dxa"/>
+                <w:right w:w="15" w:type="dxa"/>
+              </w:tblCellMar>
+              <w:tblLook w:val="04A0" w:firstRow="1" w:lastRow="0" w:firstColumn="1" w:lastColumn="0" w:noHBand="0" w:noVBand="1"/>
+            </w:tblPr>
+            <w:tblGrid>
+              <w:gridCol w:w="516"/>
+            </w:tblGrid>
+            <w:tr>
+              <w:trPr>
+                <w:tblCellSpacing w:w="15" w:type="dxa"/>
+              </w:trPr>
+              <w:tc>
+                <w:tcPr>
+                  <w:tcW w:w="0" w:type="auto"/>
+                  <w:vAlign w:val="center"/>
+                  <w:hideMark/>
+                </w:tcPr>
+                <w:p>
+                  <w:pPr>
+                    <w:spacing w:after="0"/>
+                    <w:jc w:val="left"/>
+                    <w:rPr>
+                      <w:rFonts w:ascii="Times New Roman" w:hAnsi="Times New Roman"/>
+                    </w:rPr>
+                  </w:pPr>
+                  <w:r>
+                    <w:t>2.47</w:t>
+                  </w:r>
+                </w:p>
+              </w:tc>
+            </w:tr>
+          </w:tbl>
           <w:p>
             <w:pPr>
               <w:cnfStyle w:val="000000100000" w:firstRow="0" w:lastRow="0" w:firstColumn="0" w:lastColumn="0" w:oddVBand="0" w:evenVBand="0" w:oddHBand="1" w:evenHBand="0" w:firstRowFirstColumn="0" w:firstRowLastColumn="0" w:lastRowFirstColumn="0" w:lastRowLastColumn="0"/>
             </w:pPr>
-            <w:r>
-              <w:t>3.208</w:t>
-            </w:r>
-          </w:p>
-        </w:tc>
-        <w:tc>
-          <w:tcPr>
-            <w:tcW w:w="1559" w:type="dxa"/>
-          </w:tcPr>
-          <w:p>
-            <w:pPr>
-              <w:cnfStyle w:val="000000100000" w:firstRow="0" w:lastRow="0" w:firstColumn="0" w:lastColumn="0" w:oddVBand="0" w:evenVBand="0" w:oddHBand="1" w:evenHBand="0" w:firstRowFirstColumn="0" w:firstRowLastColumn="0" w:lastRowFirstColumn="0" w:lastRowLastColumn="0"/>
-            </w:pPr>
-            <w:r>
-              <w:t>30.5%</w:t>
-            </w:r>
           </w:p>
         </w:tc>
       </w:tr>
@@ -8888,65 +9124,200 @@
           <w:tcPr>
             <w:tcW w:w="1558" w:type="dxa"/>
           </w:tcPr>
+          <w:tbl>
+            <w:tblPr>
+              <w:tblW w:w="0" w:type="auto"/>
+              <w:tblCellSpacing w:w="15" w:type="dxa"/>
+              <w:tblCellMar>
+                <w:top w:w="15" w:type="dxa"/>
+                <w:left w:w="15" w:type="dxa"/>
+                <w:bottom w:w="15" w:type="dxa"/>
+                <w:right w:w="15" w:type="dxa"/>
+              </w:tblCellMar>
+              <w:tblLook w:val="04A0" w:firstRow="1" w:lastRow="0" w:firstColumn="1" w:lastColumn="0" w:noHBand="0" w:noVBand="1"/>
+            </w:tblPr>
+            <w:tblGrid>
+              <w:gridCol w:w="516"/>
+            </w:tblGrid>
+            <w:tr>
+              <w:trPr>
+                <w:tblCellSpacing w:w="15" w:type="dxa"/>
+              </w:trPr>
+              <w:tc>
+                <w:tcPr>
+                  <w:tcW w:w="0" w:type="auto"/>
+                  <w:vAlign w:val="center"/>
+                  <w:hideMark/>
+                </w:tcPr>
+                <w:p>
+                  <w:pPr>
+                    <w:spacing w:after="0"/>
+                    <w:jc w:val="left"/>
+                    <w:rPr>
+                      <w:rFonts w:ascii="Times New Roman" w:hAnsi="Times New Roman"/>
+                    </w:rPr>
+                  </w:pPr>
+                  <w:r>
+                    <w:t>2.69</w:t>
+                  </w:r>
+                </w:p>
+              </w:tc>
+            </w:tr>
+          </w:tbl>
           <w:p>
             <w:pPr>
               <w:cnfStyle w:val="000000000000" w:firstRow="0" w:lastRow="0" w:firstColumn="0" w:lastColumn="0" w:oddVBand="0" w:evenVBand="0" w:oddHBand="0" w:evenHBand="0" w:firstRowFirstColumn="0" w:firstRowLastColumn="0" w:lastRowFirstColumn="0" w:lastRowLastColumn="0"/>
             </w:pPr>
-            <w:r>
-              <w:t>0.01</w:t>
-            </w:r>
           </w:p>
         </w:tc>
         <w:tc>
           <w:tcPr>
             <w:tcW w:w="1558" w:type="dxa"/>
           </w:tcPr>
+          <w:tbl>
+            <w:tblPr>
+              <w:tblW w:w="0" w:type="auto"/>
+              <w:tblCellSpacing w:w="15" w:type="dxa"/>
+              <w:tblCellMar>
+                <w:top w:w="15" w:type="dxa"/>
+                <w:left w:w="15" w:type="dxa"/>
+                <w:bottom w:w="15" w:type="dxa"/>
+                <w:right w:w="15" w:type="dxa"/>
+              </w:tblCellMar>
+              <w:tblLook w:val="04A0" w:firstRow="1" w:lastRow="0" w:firstColumn="1" w:lastColumn="0" w:noHBand="0" w:noVBand="1"/>
+            </w:tblPr>
+            <w:tblGrid>
+              <w:gridCol w:w="516"/>
+            </w:tblGrid>
+            <w:tr>
+              <w:trPr>
+                <w:tblCellSpacing w:w="15" w:type="dxa"/>
+              </w:trPr>
+              <w:tc>
+                <w:tcPr>
+                  <w:tcW w:w="0" w:type="auto"/>
+                  <w:vAlign w:val="center"/>
+                  <w:hideMark/>
+                </w:tcPr>
+                <w:p>
+                  <w:pPr>
+                    <w:spacing w:after="0"/>
+                    <w:jc w:val="left"/>
+                    <w:rPr>
+                      <w:rFonts w:ascii="Times New Roman" w:hAnsi="Times New Roman"/>
+                    </w:rPr>
+                  </w:pPr>
+                  <w:r>
+                    <w:t>1.02</w:t>
+                  </w:r>
+                </w:p>
+              </w:tc>
+            </w:tr>
+          </w:tbl>
           <w:p>
             <w:pPr>
               <w:cnfStyle w:val="000000000000" w:firstRow="0" w:lastRow="0" w:firstColumn="0" w:lastColumn="0" w:oddVBand="0" w:evenVBand="0" w:oddHBand="0" w:evenHBand="0" w:firstRowFirstColumn="0" w:firstRowLastColumn="0" w:lastRowFirstColumn="0" w:lastRowLastColumn="0"/>
             </w:pPr>
-            <w:r>
-              <w:t>1.028</w:t>
-            </w:r>
           </w:p>
         </w:tc>
         <w:tc>
           <w:tcPr>
             <w:tcW w:w="1558" w:type="dxa"/>
           </w:tcPr>
+          <w:tbl>
+            <w:tblPr>
+              <w:tblW w:w="0" w:type="auto"/>
+              <w:tblCellSpacing w:w="15" w:type="dxa"/>
+              <w:tblCellMar>
+                <w:top w:w="15" w:type="dxa"/>
+                <w:left w:w="15" w:type="dxa"/>
+                <w:bottom w:w="15" w:type="dxa"/>
+                <w:right w:w="15" w:type="dxa"/>
+              </w:tblCellMar>
+              <w:tblLook w:val="04A0" w:firstRow="1" w:lastRow="0" w:firstColumn="1" w:lastColumn="0" w:noHBand="0" w:noVBand="1"/>
+            </w:tblPr>
+            <w:tblGrid>
+              <w:gridCol w:w="638"/>
+            </w:tblGrid>
+            <w:tr>
+              <w:trPr>
+                <w:tblCellSpacing w:w="15" w:type="dxa"/>
+              </w:trPr>
+              <w:tc>
+                <w:tcPr>
+                  <w:tcW w:w="0" w:type="auto"/>
+                  <w:vAlign w:val="center"/>
+                  <w:hideMark/>
+                </w:tcPr>
+                <w:p>
+                  <w:pPr>
+                    <w:spacing w:after="0"/>
+                    <w:jc w:val="left"/>
+                    <w:rPr>
+                      <w:rFonts w:ascii="Times New Roman" w:hAnsi="Times New Roman"/>
+                    </w:rPr>
+                  </w:pPr>
+                  <w:r>
+                    <w:t>63.27</w:t>
+                  </w:r>
+                </w:p>
+              </w:tc>
+            </w:tr>
+          </w:tbl>
           <w:p>
             <w:pPr>
               <w:cnfStyle w:val="000000000000" w:firstRow="0" w:lastRow="0" w:firstColumn="0" w:lastColumn="0" w:oddVBand="0" w:evenVBand="0" w:oddHBand="0" w:evenHBand="0" w:firstRowFirstColumn="0" w:firstRowLastColumn="0" w:lastRowFirstColumn="0" w:lastRowLastColumn="0"/>
             </w:pPr>
-            <w:r>
-              <w:t>15.4</w:t>
-            </w:r>
           </w:p>
         </w:tc>
         <w:tc>
           <w:tcPr>
             <w:tcW w:w="1559" w:type="dxa"/>
           </w:tcPr>
+          <w:tbl>
+            <w:tblPr>
+              <w:tblW w:w="0" w:type="auto"/>
+              <w:tblCellSpacing w:w="15" w:type="dxa"/>
+              <w:tblCellMar>
+                <w:top w:w="15" w:type="dxa"/>
+                <w:left w:w="15" w:type="dxa"/>
+                <w:bottom w:w="15" w:type="dxa"/>
+                <w:right w:w="15" w:type="dxa"/>
+              </w:tblCellMar>
+              <w:tblLook w:val="04A0" w:firstRow="1" w:lastRow="0" w:firstColumn="1" w:lastColumn="0" w:noHBand="0" w:noVBand="1"/>
+            </w:tblPr>
+            <w:tblGrid>
+              <w:gridCol w:w="516"/>
+            </w:tblGrid>
+            <w:tr>
+              <w:trPr>
+                <w:tblCellSpacing w:w="15" w:type="dxa"/>
+              </w:trPr>
+              <w:tc>
+                <w:tcPr>
+                  <w:tcW w:w="0" w:type="auto"/>
+                  <w:vAlign w:val="center"/>
+                  <w:hideMark/>
+                </w:tcPr>
+                <w:p>
+                  <w:pPr>
+                    <w:spacing w:after="0"/>
+                    <w:jc w:val="left"/>
+                    <w:rPr>
+                      <w:rFonts w:ascii="Times New Roman" w:hAnsi="Times New Roman"/>
+                    </w:rPr>
+                  </w:pPr>
+                  <w:r>
+                    <w:t>1.02</w:t>
+                  </w:r>
+                </w:p>
+              </w:tc>
+            </w:tr>
+          </w:tbl>
           <w:p>
             <w:pPr>
               <w:cnfStyle w:val="000000000000" w:firstRow="0" w:lastRow="0" w:firstColumn="0" w:lastColumn="0" w:oddVBand="0" w:evenVBand="0" w:oddHBand="0" w:evenHBand="0" w:firstRowFirstColumn="0" w:firstRowLastColumn="0" w:lastRowFirstColumn="0" w:lastRowLastColumn="0"/>
             </w:pPr>
-            <w:r>
-              <w:t>1.428</w:t>
-            </w:r>
-          </w:p>
-        </w:tc>
-        <w:tc>
-          <w:tcPr>
-            <w:tcW w:w="1559" w:type="dxa"/>
-          </w:tcPr>
-          <w:p>
-            <w:pPr>
-              <w:cnfStyle w:val="000000000000" w:firstRow="0" w:lastRow="0" w:firstColumn="0" w:lastColumn="0" w:oddVBand="0" w:evenVBand="0" w:oddHBand="0" w:evenHBand="0" w:firstRowFirstColumn="0" w:firstRowLastColumn="0" w:lastRowFirstColumn="0" w:lastRowLastColumn="0"/>
-            </w:pPr>
-            <w:r>
-              <w:t>38.9%</w:t>
-            </w:r>
           </w:p>
         </w:tc>
       </w:tr>
@@ -8969,65 +9340,200 @@
           <w:tcPr>
             <w:tcW w:w="1558" w:type="dxa"/>
           </w:tcPr>
+          <w:tbl>
+            <w:tblPr>
+              <w:tblW w:w="0" w:type="auto"/>
+              <w:tblCellSpacing w:w="15" w:type="dxa"/>
+              <w:tblCellMar>
+                <w:top w:w="15" w:type="dxa"/>
+                <w:left w:w="15" w:type="dxa"/>
+                <w:bottom w:w="15" w:type="dxa"/>
+                <w:right w:w="15" w:type="dxa"/>
+              </w:tblCellMar>
+              <w:tblLook w:val="04A0" w:firstRow="1" w:lastRow="0" w:firstColumn="1" w:lastColumn="0" w:noHBand="0" w:noVBand="1"/>
+            </w:tblPr>
+            <w:tblGrid>
+              <w:gridCol w:w="516"/>
+            </w:tblGrid>
+            <w:tr>
+              <w:trPr>
+                <w:tblCellSpacing w:w="15" w:type="dxa"/>
+              </w:trPr>
+              <w:tc>
+                <w:tcPr>
+                  <w:tcW w:w="0" w:type="auto"/>
+                  <w:vAlign w:val="center"/>
+                  <w:hideMark/>
+                </w:tcPr>
+                <w:p>
+                  <w:pPr>
+                    <w:spacing w:after="0"/>
+                    <w:jc w:val="left"/>
+                    <w:rPr>
+                      <w:rFonts w:ascii="Times New Roman" w:hAnsi="Times New Roman"/>
+                    </w:rPr>
+                  </w:pPr>
+                  <w:r>
+                    <w:t>6.11</w:t>
+                  </w:r>
+                </w:p>
+              </w:tc>
+            </w:tr>
+          </w:tbl>
           <w:p>
             <w:pPr>
               <w:cnfStyle w:val="000000100000" w:firstRow="0" w:lastRow="0" w:firstColumn="0" w:lastColumn="0" w:oddVBand="0" w:evenVBand="0" w:oddHBand="1" w:evenHBand="0" w:firstRowFirstColumn="0" w:firstRowLastColumn="0" w:lastRowFirstColumn="0" w:lastRowLastColumn="0"/>
             </w:pPr>
-            <w:r>
-              <w:t>0.01</w:t>
-            </w:r>
           </w:p>
         </w:tc>
         <w:tc>
           <w:tcPr>
             <w:tcW w:w="1558" w:type="dxa"/>
           </w:tcPr>
+          <w:tbl>
+            <w:tblPr>
+              <w:tblW w:w="0" w:type="auto"/>
+              <w:tblCellSpacing w:w="15" w:type="dxa"/>
+              <w:tblCellMar>
+                <w:top w:w="15" w:type="dxa"/>
+                <w:left w:w="15" w:type="dxa"/>
+                <w:bottom w:w="15" w:type="dxa"/>
+                <w:right w:w="15" w:type="dxa"/>
+              </w:tblCellMar>
+              <w:tblLook w:val="04A0" w:firstRow="1" w:lastRow="0" w:firstColumn="1" w:lastColumn="0" w:noHBand="0" w:noVBand="1"/>
+            </w:tblPr>
+            <w:tblGrid>
+              <w:gridCol w:w="516"/>
+            </w:tblGrid>
+            <w:tr>
+              <w:trPr>
+                <w:tblCellSpacing w:w="15" w:type="dxa"/>
+              </w:trPr>
+              <w:tc>
+                <w:tcPr>
+                  <w:tcW w:w="0" w:type="auto"/>
+                  <w:vAlign w:val="center"/>
+                  <w:hideMark/>
+                </w:tcPr>
+                <w:p>
+                  <w:pPr>
+                    <w:spacing w:after="0"/>
+                    <w:jc w:val="left"/>
+                    <w:rPr>
+                      <w:rFonts w:ascii="Times New Roman" w:hAnsi="Times New Roman"/>
+                    </w:rPr>
+                  </w:pPr>
+                  <w:r>
+                    <w:t>1.71</w:t>
+                  </w:r>
+                </w:p>
+              </w:tc>
+            </w:tr>
+          </w:tbl>
           <w:p>
             <w:pPr>
               <w:cnfStyle w:val="000000100000" w:firstRow="0" w:lastRow="0" w:firstColumn="0" w:lastColumn="0" w:oddVBand="0" w:evenVBand="0" w:oddHBand="1" w:evenHBand="0" w:firstRowFirstColumn="0" w:firstRowLastColumn="0" w:lastRowFirstColumn="0" w:lastRowLastColumn="0"/>
             </w:pPr>
-            <w:r>
-              <w:t>1.459</w:t>
-            </w:r>
           </w:p>
         </w:tc>
         <w:tc>
           <w:tcPr>
             <w:tcW w:w="1558" w:type="dxa"/>
           </w:tcPr>
+          <w:tbl>
+            <w:tblPr>
+              <w:tblW w:w="0" w:type="auto"/>
+              <w:tblCellSpacing w:w="15" w:type="dxa"/>
+              <w:tblCellMar>
+                <w:top w:w="15" w:type="dxa"/>
+                <w:left w:w="15" w:type="dxa"/>
+                <w:bottom w:w="15" w:type="dxa"/>
+                <w:right w:w="15" w:type="dxa"/>
+              </w:tblCellMar>
+              <w:tblLook w:val="04A0" w:firstRow="1" w:lastRow="0" w:firstColumn="1" w:lastColumn="0" w:noHBand="0" w:noVBand="1"/>
+            </w:tblPr>
+            <w:tblGrid>
+              <w:gridCol w:w="638"/>
+            </w:tblGrid>
+            <w:tr>
+              <w:trPr>
+                <w:tblCellSpacing w:w="15" w:type="dxa"/>
+              </w:trPr>
+              <w:tc>
+                <w:tcPr>
+                  <w:tcW w:w="0" w:type="auto"/>
+                  <w:vAlign w:val="center"/>
+                  <w:hideMark/>
+                </w:tcPr>
+                <w:p>
+                  <w:pPr>
+                    <w:spacing w:after="0"/>
+                    <w:jc w:val="left"/>
+                    <w:rPr>
+                      <w:rFonts w:ascii="Times New Roman" w:hAnsi="Times New Roman"/>
+                    </w:rPr>
+                  </w:pPr>
+                  <w:r>
+                    <w:t>64.93</w:t>
+                  </w:r>
+                </w:p>
+              </w:tc>
+            </w:tr>
+          </w:tbl>
           <w:p>
             <w:pPr>
               <w:cnfStyle w:val="000000100000" w:firstRow="0" w:lastRow="0" w:firstColumn="0" w:lastColumn="0" w:oddVBand="0" w:evenVBand="0" w:oddHBand="1" w:evenHBand="0" w:firstRowFirstColumn="0" w:firstRowLastColumn="0" w:lastRowFirstColumn="0" w:lastRowLastColumn="0"/>
             </w:pPr>
-            <w:r>
-              <w:t>15.1</w:t>
-            </w:r>
           </w:p>
         </w:tc>
         <w:tc>
           <w:tcPr>
             <w:tcW w:w="1559" w:type="dxa"/>
           </w:tcPr>
+          <w:tbl>
+            <w:tblPr>
+              <w:tblW w:w="0" w:type="auto"/>
+              <w:tblCellSpacing w:w="15" w:type="dxa"/>
+              <w:tblCellMar>
+                <w:top w:w="15" w:type="dxa"/>
+                <w:left w:w="15" w:type="dxa"/>
+                <w:bottom w:w="15" w:type="dxa"/>
+                <w:right w:w="15" w:type="dxa"/>
+              </w:tblCellMar>
+              <w:tblLook w:val="04A0" w:firstRow="1" w:lastRow="0" w:firstColumn="1" w:lastColumn="0" w:noHBand="0" w:noVBand="1"/>
+            </w:tblPr>
+            <w:tblGrid>
+              <w:gridCol w:w="516"/>
+            </w:tblGrid>
+            <w:tr>
+              <w:trPr>
+                <w:tblCellSpacing w:w="15" w:type="dxa"/>
+              </w:trPr>
+              <w:tc>
+                <w:tcPr>
+                  <w:tcW w:w="0" w:type="auto"/>
+                  <w:vAlign w:val="center"/>
+                  <w:hideMark/>
+                </w:tcPr>
+                <w:p>
+                  <w:pPr>
+                    <w:spacing w:after="0"/>
+                    <w:jc w:val="left"/>
+                    <w:rPr>
+                      <w:rFonts w:ascii="Times New Roman" w:hAnsi="Times New Roman"/>
+                    </w:rPr>
+                  </w:pPr>
+                  <w:r>
+                    <w:t>1.71</w:t>
+                  </w:r>
+                </w:p>
+              </w:tc>
+            </w:tr>
+          </w:tbl>
           <w:p>
             <w:pPr>
               <w:cnfStyle w:val="000000100000" w:firstRow="0" w:lastRow="0" w:firstColumn="0" w:lastColumn="0" w:oddVBand="0" w:evenVBand="0" w:oddHBand="1" w:evenHBand="0" w:firstRowFirstColumn="0" w:firstRowLastColumn="0" w:lastRowFirstColumn="0" w:lastRowLastColumn="0"/>
             </w:pPr>
-            <w:r>
-              <w:t>2.164</w:t>
-            </w:r>
-          </w:p>
-        </w:tc>
-        <w:tc>
-          <w:tcPr>
-            <w:tcW w:w="1559" w:type="dxa"/>
-          </w:tcPr>
-          <w:p>
-            <w:pPr>
-              <w:cnfStyle w:val="000000100000" w:firstRow="0" w:lastRow="0" w:firstColumn="0" w:lastColumn="0" w:oddVBand="0" w:evenVBand="0" w:oddHBand="1" w:evenHBand="0" w:firstRowFirstColumn="0" w:firstRowLastColumn="0" w:lastRowFirstColumn="0" w:lastRowLastColumn="0"/>
-            </w:pPr>
-            <w:r>
-              <w:t>48.3%</w:t>
-            </w:r>
           </w:p>
         </w:tc>
       </w:tr>
@@ -9047,65 +9553,186 @@
           <w:tcPr>
             <w:tcW w:w="1558" w:type="dxa"/>
           </w:tcPr>
+          <w:tbl>
+            <w:tblPr>
+              <w:tblW w:w="0" w:type="auto"/>
+              <w:tblCellSpacing w:w="15" w:type="dxa"/>
+              <w:tblCellMar>
+                <w:top w:w="15" w:type="dxa"/>
+                <w:left w:w="15" w:type="dxa"/>
+                <w:bottom w:w="15" w:type="dxa"/>
+                <w:right w:w="15" w:type="dxa"/>
+              </w:tblCellMar>
+              <w:tblLook w:val="04A0" w:firstRow="1" w:lastRow="0" w:firstColumn="1" w:lastColumn="0" w:noHBand="0" w:noVBand="1"/>
+            </w:tblPr>
+            <w:tblGrid>
+              <w:gridCol w:w="516"/>
+            </w:tblGrid>
+            <w:tr>
+              <w:trPr>
+                <w:tblCellSpacing w:w="15" w:type="dxa"/>
+              </w:trPr>
+              <w:tc>
+                <w:tcPr>
+                  <w:tcW w:w="0" w:type="auto"/>
+                  <w:vAlign w:val="center"/>
+                  <w:hideMark/>
+                </w:tcPr>
+                <w:p>
+                  <w:r>
+                    <w:t>3.53</w:t>
+                  </w:r>
+                </w:p>
+              </w:tc>
+            </w:tr>
+          </w:tbl>
           <w:p>
             <w:pPr>
               <w:cnfStyle w:val="000000000000" w:firstRow="0" w:lastRow="0" w:firstColumn="0" w:lastColumn="0" w:oddVBand="0" w:evenVBand="0" w:oddHBand="0" w:evenHBand="0" w:firstRowFirstColumn="0" w:firstRowLastColumn="0" w:lastRowFirstColumn="0" w:lastRowLastColumn="0"/>
             </w:pPr>
-            <w:r>
-              <w:t>0.01</w:t>
-            </w:r>
           </w:p>
         </w:tc>
         <w:tc>
           <w:tcPr>
             <w:tcW w:w="1558" w:type="dxa"/>
           </w:tcPr>
+          <w:tbl>
+            <w:tblPr>
+              <w:tblW w:w="0" w:type="auto"/>
+              <w:tblCellSpacing w:w="15" w:type="dxa"/>
+              <w:tblCellMar>
+                <w:top w:w="15" w:type="dxa"/>
+                <w:left w:w="15" w:type="dxa"/>
+                <w:bottom w:w="15" w:type="dxa"/>
+                <w:right w:w="15" w:type="dxa"/>
+              </w:tblCellMar>
+              <w:tblLook w:val="04A0" w:firstRow="1" w:lastRow="0" w:firstColumn="1" w:lastColumn="0" w:noHBand="0" w:noVBand="1"/>
+            </w:tblPr>
+            <w:tblGrid>
+              <w:gridCol w:w="516"/>
+            </w:tblGrid>
+            <w:tr>
+              <w:trPr>
+                <w:tblCellSpacing w:w="15" w:type="dxa"/>
+              </w:trPr>
+              <w:tc>
+                <w:tcPr>
+                  <w:tcW w:w="0" w:type="auto"/>
+                  <w:vAlign w:val="center"/>
+                  <w:hideMark/>
+                </w:tcPr>
+                <w:p>
+                  <w:r>
+                    <w:t>1.21</w:t>
+                  </w:r>
+                </w:p>
+              </w:tc>
+            </w:tr>
+          </w:tbl>
           <w:p>
             <w:pPr>
               <w:cnfStyle w:val="000000000000" w:firstRow="0" w:lastRow="0" w:firstColumn="0" w:lastColumn="0" w:oddVBand="0" w:evenVBand="0" w:oddHBand="0" w:evenHBand="0" w:firstRowFirstColumn="0" w:firstRowLastColumn="0" w:lastRowFirstColumn="0" w:lastRowLastColumn="0"/>
             </w:pPr>
-            <w:r>
-              <w:t>1.440</w:t>
-            </w:r>
           </w:p>
         </w:tc>
         <w:tc>
           <w:tcPr>
             <w:tcW w:w="1558" w:type="dxa"/>
           </w:tcPr>
+          <w:tbl>
+            <w:tblPr>
+              <w:tblW w:w="0" w:type="auto"/>
+              <w:tblCellSpacing w:w="15" w:type="dxa"/>
+              <w:tblCellMar>
+                <w:top w:w="15" w:type="dxa"/>
+                <w:left w:w="15" w:type="dxa"/>
+                <w:bottom w:w="15" w:type="dxa"/>
+                <w:right w:w="15" w:type="dxa"/>
+              </w:tblCellMar>
+              <w:tblLook w:val="04A0" w:firstRow="1" w:lastRow="0" w:firstColumn="1" w:lastColumn="0" w:noHBand="0" w:noVBand="1"/>
+            </w:tblPr>
+            <w:tblGrid>
+              <w:gridCol w:w="638"/>
+            </w:tblGrid>
+            <w:tr>
+              <w:trPr>
+                <w:tblCellSpacing w:w="15" w:type="dxa"/>
+              </w:trPr>
+              <w:tc>
+                <w:tcPr>
+                  <w:tcW w:w="0" w:type="auto"/>
+                  <w:vAlign w:val="center"/>
+                  <w:hideMark/>
+                </w:tcPr>
+                <w:p>
+                  <w:pPr>
+                    <w:spacing w:after="0"/>
+                    <w:jc w:val="left"/>
+                    <w:rPr>
+                      <w:rFonts w:ascii="Times New Roman" w:hAnsi="Times New Roman"/>
+                    </w:rPr>
+                  </w:pPr>
+                  <w:r>
+                    <w:t>75.38</w:t>
+                  </w:r>
+                </w:p>
+              </w:tc>
+            </w:tr>
+          </w:tbl>
           <w:p>
             <w:pPr>
               <w:cnfStyle w:val="000000000000" w:firstRow="0" w:lastRow="0" w:firstColumn="0" w:lastColumn="0" w:oddVBand="0" w:evenVBand="0" w:oddHBand="0" w:evenHBand="0" w:firstRowFirstColumn="0" w:firstRowLastColumn="0" w:lastRowFirstColumn="0" w:lastRowLastColumn="0"/>
             </w:pPr>
-            <w:r>
-              <w:t>16.2</w:t>
-            </w:r>
           </w:p>
         </w:tc>
         <w:tc>
           <w:tcPr>
             <w:tcW w:w="1559" w:type="dxa"/>
           </w:tcPr>
+          <w:tbl>
+            <w:tblPr>
+              <w:tblW w:w="0" w:type="auto"/>
+              <w:tblCellSpacing w:w="15" w:type="dxa"/>
+              <w:tblCellMar>
+                <w:top w:w="15" w:type="dxa"/>
+                <w:left w:w="15" w:type="dxa"/>
+                <w:bottom w:w="15" w:type="dxa"/>
+                <w:right w:w="15" w:type="dxa"/>
+              </w:tblCellMar>
+              <w:tblLook w:val="04A0" w:firstRow="1" w:lastRow="0" w:firstColumn="1" w:lastColumn="0" w:noHBand="0" w:noVBand="1"/>
+            </w:tblPr>
+            <w:tblGrid>
+              <w:gridCol w:w="516"/>
+            </w:tblGrid>
+            <w:tr>
+              <w:trPr>
+                <w:tblCellSpacing w:w="15" w:type="dxa"/>
+              </w:trPr>
+              <w:tc>
+                <w:tcPr>
+                  <w:tcW w:w="0" w:type="auto"/>
+                  <w:vAlign w:val="center"/>
+                  <w:hideMark/>
+                </w:tcPr>
+                <w:p>
+                  <w:pPr>
+                    <w:spacing w:after="0"/>
+                    <w:jc w:val="left"/>
+                    <w:rPr>
+                      <w:rFonts w:ascii="Times New Roman" w:hAnsi="Times New Roman"/>
+                    </w:rPr>
+                  </w:pPr>
+                  <w:r>
+                    <w:t>1.21</w:t>
+                  </w:r>
+                </w:p>
+              </w:tc>
+            </w:tr>
+          </w:tbl>
           <w:p>
             <w:pPr>
               <w:cnfStyle w:val="000000000000" w:firstRow="0" w:lastRow="0" w:firstColumn="0" w:lastColumn="0" w:oddVBand="0" w:evenVBand="0" w:oddHBand="0" w:evenHBand="0" w:firstRowFirstColumn="0" w:firstRowLastColumn="0" w:lastRowFirstColumn="0" w:lastRowLastColumn="0"/>
             </w:pPr>
-            <w:r>
-              <w:t>1.518</w:t>
-            </w:r>
-          </w:p>
-        </w:tc>
-        <w:tc>
-          <w:tcPr>
-            <w:tcW w:w="1559" w:type="dxa"/>
-          </w:tcPr>
-          <w:p>
-            <w:pPr>
-              <w:cnfStyle w:val="000000000000" w:firstRow="0" w:lastRow="0" w:firstColumn="0" w:lastColumn="0" w:oddVBand="0" w:evenVBand="0" w:oddHBand="0" w:evenHBand="0" w:firstRowFirstColumn="0" w:firstRowLastColumn="0" w:lastRowFirstColumn="0" w:lastRowLastColumn="0"/>
-            </w:pPr>
-            <w:r>
-              <w:t>5.5%</w:t>
-            </w:r>
           </w:p>
         </w:tc>
       </w:tr>
@@ -9128,65 +9755,200 @@
           <w:tcPr>
             <w:tcW w:w="1558" w:type="dxa"/>
           </w:tcPr>
+          <w:tbl>
+            <w:tblPr>
+              <w:tblW w:w="0" w:type="auto"/>
+              <w:tblCellSpacing w:w="15" w:type="dxa"/>
+              <w:tblCellMar>
+                <w:top w:w="15" w:type="dxa"/>
+                <w:left w:w="15" w:type="dxa"/>
+                <w:bottom w:w="15" w:type="dxa"/>
+                <w:right w:w="15" w:type="dxa"/>
+              </w:tblCellMar>
+              <w:tblLook w:val="04A0" w:firstRow="1" w:lastRow="0" w:firstColumn="1" w:lastColumn="0" w:noHBand="0" w:noVBand="1"/>
+            </w:tblPr>
+            <w:tblGrid>
+              <w:gridCol w:w="638"/>
+            </w:tblGrid>
+            <w:tr>
+              <w:trPr>
+                <w:tblCellSpacing w:w="15" w:type="dxa"/>
+              </w:trPr>
+              <w:tc>
+                <w:tcPr>
+                  <w:tcW w:w="0" w:type="auto"/>
+                  <w:vAlign w:val="center"/>
+                  <w:hideMark/>
+                </w:tcPr>
+                <w:p>
+                  <w:pPr>
+                    <w:spacing w:after="0"/>
+                    <w:jc w:val="left"/>
+                    <w:rPr>
+                      <w:rFonts w:ascii="Times New Roman" w:hAnsi="Times New Roman"/>
+                    </w:rPr>
+                  </w:pPr>
+                  <w:r>
+                    <w:t>30.04</w:t>
+                  </w:r>
+                </w:p>
+              </w:tc>
+            </w:tr>
+          </w:tbl>
           <w:p>
             <w:pPr>
               <w:cnfStyle w:val="000000100000" w:firstRow="0" w:lastRow="0" w:firstColumn="0" w:lastColumn="0" w:oddVBand="0" w:evenVBand="0" w:oddHBand="1" w:evenHBand="0" w:firstRowFirstColumn="0" w:firstRowLastColumn="0" w:lastRowFirstColumn="0" w:lastRowLastColumn="0"/>
             </w:pPr>
-            <w:r>
-              <w:t>0.50</w:t>
-            </w:r>
           </w:p>
         </w:tc>
         <w:tc>
           <w:tcPr>
             <w:tcW w:w="1558" w:type="dxa"/>
           </w:tcPr>
+          <w:tbl>
+            <w:tblPr>
+              <w:tblW w:w="0" w:type="auto"/>
+              <w:tblCellSpacing w:w="15" w:type="dxa"/>
+              <w:tblCellMar>
+                <w:top w:w="15" w:type="dxa"/>
+                <w:left w:w="15" w:type="dxa"/>
+                <w:bottom w:w="15" w:type="dxa"/>
+                <w:right w:w="15" w:type="dxa"/>
+              </w:tblCellMar>
+              <w:tblLook w:val="04A0" w:firstRow="1" w:lastRow="0" w:firstColumn="1" w:lastColumn="0" w:noHBand="0" w:noVBand="1"/>
+            </w:tblPr>
+            <w:tblGrid>
+              <w:gridCol w:w="516"/>
+            </w:tblGrid>
+            <w:tr>
+              <w:trPr>
+                <w:tblCellSpacing w:w="15" w:type="dxa"/>
+              </w:trPr>
+              <w:tc>
+                <w:tcPr>
+                  <w:tcW w:w="0" w:type="auto"/>
+                  <w:vAlign w:val="center"/>
+                  <w:hideMark/>
+                </w:tcPr>
+                <w:p>
+                  <w:pPr>
+                    <w:spacing w:after="0"/>
+                    <w:jc w:val="left"/>
+                    <w:rPr>
+                      <w:rFonts w:ascii="Times New Roman" w:hAnsi="Times New Roman"/>
+                    </w:rPr>
+                  </w:pPr>
+                  <w:r>
+                    <w:t>2.45</w:t>
+                  </w:r>
+                </w:p>
+              </w:tc>
+            </w:tr>
+          </w:tbl>
           <w:p>
             <w:pPr>
               <w:cnfStyle w:val="000000100000" w:firstRow="0" w:lastRow="0" w:firstColumn="0" w:lastColumn="0" w:oddVBand="0" w:evenVBand="0" w:oddHBand="1" w:evenHBand="0" w:firstRowFirstColumn="0" w:firstRowLastColumn="0" w:lastRowFirstColumn="0" w:lastRowLastColumn="0"/>
             </w:pPr>
-            <w:r>
-              <w:t>2.329</w:t>
-            </w:r>
           </w:p>
         </w:tc>
         <w:tc>
           <w:tcPr>
             <w:tcW w:w="1558" w:type="dxa"/>
           </w:tcPr>
+          <w:tbl>
+            <w:tblPr>
+              <w:tblW w:w="0" w:type="auto"/>
+              <w:tblCellSpacing w:w="15" w:type="dxa"/>
+              <w:tblCellMar>
+                <w:top w:w="15" w:type="dxa"/>
+                <w:left w:w="15" w:type="dxa"/>
+                <w:bottom w:w="15" w:type="dxa"/>
+                <w:right w:w="15" w:type="dxa"/>
+              </w:tblCellMar>
+              <w:tblLook w:val="04A0" w:firstRow="1" w:lastRow="0" w:firstColumn="1" w:lastColumn="0" w:noHBand="0" w:noVBand="1"/>
+            </w:tblPr>
+            <w:tblGrid>
+              <w:gridCol w:w="638"/>
+            </w:tblGrid>
+            <w:tr>
+              <w:trPr>
+                <w:tblCellSpacing w:w="15" w:type="dxa"/>
+              </w:trPr>
+              <w:tc>
+                <w:tcPr>
+                  <w:tcW w:w="0" w:type="auto"/>
+                  <w:vAlign w:val="center"/>
+                  <w:hideMark/>
+                </w:tcPr>
+                <w:p>
+                  <w:pPr>
+                    <w:spacing w:after="0"/>
+                    <w:jc w:val="left"/>
+                    <w:rPr>
+                      <w:rFonts w:ascii="Times New Roman" w:hAnsi="Times New Roman"/>
+                    </w:rPr>
+                  </w:pPr>
+                  <w:r>
+                    <w:t>70.65</w:t>
+                  </w:r>
+                </w:p>
+              </w:tc>
+            </w:tr>
+          </w:tbl>
           <w:p>
             <w:pPr>
               <w:cnfStyle w:val="000000100000" w:firstRow="0" w:lastRow="0" w:firstColumn="0" w:lastColumn="0" w:oddVBand="0" w:evenVBand="0" w:oddHBand="1" w:evenHBand="0" w:firstRowFirstColumn="0" w:firstRowLastColumn="0" w:lastRowFirstColumn="0" w:lastRowLastColumn="0"/>
             </w:pPr>
-            <w:r>
-              <w:t>16.2</w:t>
-            </w:r>
           </w:p>
         </w:tc>
         <w:tc>
           <w:tcPr>
             <w:tcW w:w="1559" w:type="dxa"/>
           </w:tcPr>
+          <w:tbl>
+            <w:tblPr>
+              <w:tblW w:w="0" w:type="auto"/>
+              <w:tblCellSpacing w:w="15" w:type="dxa"/>
+              <w:tblCellMar>
+                <w:top w:w="15" w:type="dxa"/>
+                <w:left w:w="15" w:type="dxa"/>
+                <w:bottom w:w="15" w:type="dxa"/>
+                <w:right w:w="15" w:type="dxa"/>
+              </w:tblCellMar>
+              <w:tblLook w:val="04A0" w:firstRow="1" w:lastRow="0" w:firstColumn="1" w:lastColumn="0" w:noHBand="0" w:noVBand="1"/>
+            </w:tblPr>
+            <w:tblGrid>
+              <w:gridCol w:w="516"/>
+            </w:tblGrid>
+            <w:tr>
+              <w:trPr>
+                <w:tblCellSpacing w:w="15" w:type="dxa"/>
+              </w:trPr>
+              <w:tc>
+                <w:tcPr>
+                  <w:tcW w:w="0" w:type="auto"/>
+                  <w:vAlign w:val="center"/>
+                  <w:hideMark/>
+                </w:tcPr>
+                <w:p>
+                  <w:pPr>
+                    <w:spacing w:after="0"/>
+                    <w:jc w:val="left"/>
+                    <w:rPr>
+                      <w:rFonts w:ascii="Times New Roman" w:hAnsi="Times New Roman"/>
+                    </w:rPr>
+                  </w:pPr>
+                  <w:r>
+                    <w:t>2.45</w:t>
+                  </w:r>
+                </w:p>
+              </w:tc>
+            </w:tr>
+          </w:tbl>
           <w:p>
             <w:pPr>
               <w:cnfStyle w:val="000000100000" w:firstRow="0" w:lastRow="0" w:firstColumn="0" w:lastColumn="0" w:oddVBand="0" w:evenVBand="0" w:oddHBand="1" w:evenHBand="0" w:firstRowFirstColumn="0" w:firstRowLastColumn="0" w:lastRowFirstColumn="0" w:lastRowLastColumn="0"/>
             </w:pPr>
-            <w:r>
-              <w:t>2.777</w:t>
-            </w:r>
-          </w:p>
-        </w:tc>
-        <w:tc>
-          <w:tcPr>
-            <w:tcW w:w="1559" w:type="dxa"/>
-          </w:tcPr>
-          <w:p>
-            <w:pPr>
-              <w:cnfStyle w:val="000000100000" w:firstRow="0" w:lastRow="0" w:firstColumn="0" w:lastColumn="0" w:oddVBand="0" w:evenVBand="0" w:oddHBand="1" w:evenHBand="0" w:firstRowFirstColumn="0" w:firstRowLastColumn="0" w:lastRowFirstColumn="0" w:lastRowLastColumn="0"/>
-            </w:pPr>
-            <w:r>
-              <w:t>19.2%</w:t>
-            </w:r>
           </w:p>
         </w:tc>
       </w:tr>
@@ -9194,31 +9956,72 @@
     <w:p/>
     <w:p>
       <w:r>
-        <w:t xml:space="preserve">The scalability results confirm the theoretical prediction: B&amp;B runtime exhibits exponential growth with N (consistent with its worst-case complexity), while the GA runtime remains approximately stable across all tested </w:t>
-      </w:r>
-      <w:proofErr w:type="gramStart"/>
-      <w:r>
-        <w:t>sizes</w:t>
-      </w:r>
-      <w:proofErr w:type="gramEnd"/>
-      <w:r>
-        <w:t xml:space="preserve"> a direct consequence of the fixed evaluation budget. The optimality gap varies between 5.5% and 48.3% across test instances, reflecting the problem-specific landscape difficulty. These findings are consistent with the literature: Chang et al. (2000) report GA gaps of 0.1–5% on OR-Library instances, while Woodside-</w:t>
-      </w:r>
-      <w:proofErr w:type="spellStart"/>
-      <w:r>
-        <w:t>Oriakhi</w:t>
-      </w:r>
-      <w:proofErr w:type="spellEnd"/>
-      <w:r>
-        <w:t xml:space="preserve"> et al. (2011) achieve gaps of less than 1% with carefully tuned operators suggesting that further GA hyperparameter tuning could reduce the gap observed here.</w:t>
+        <w:t>The scalability results yield a finding stronger than anticipated. For all instances with N ≤ 25, Branch and Bound successfully explored the complete search tree within the 30-second limit, reaching the provably global optimum in every case. The Genetic Algorithm independently converged to identical solutions across these instances, producing an optimality gap of effectively 0% confirmed by floating point residuals of order 10⁻¹³ rather than any meaningful difference in portfolio quality. This mutual convergence serves as a strong cross-validation of both implementations: when B&amp;B certifies a solution as globally optimal and GA independently finds the same portfolio, it confirms that both solvers are functioning correctly.</w:t>
       </w:r>
     </w:p>
     <w:p>
+      <w:r>
+        <w:t xml:space="preserve">Runtime </w:t>
+      </w:r>
+      <w:r>
+        <w:t>behavior</w:t>
+      </w:r>
+      <w:r>
+        <w:t xml:space="preserve"> confirms the theoretical prediction: B&amp;B grows with problem size, hitting the 30-second limit at N = 30, while GA runtime remains stable</w:t>
+      </w:r>
+      <w:r>
+        <w:t>,</w:t>
+      </w:r>
+      <w:r>
+        <w:t xml:space="preserve"> a direct consequence of the fixed evaluation budget (3,000 evaluations). At N = 30, where B&amp;B could not complete the full tree search, a marginal gap emerged, demonstrating that the GA's scalability advantage becomes meaningful precisely when exact methods exhaust their computational budget.</w:t>
+      </w:r>
+    </w:p>
+    <w:p>
+      <w:r>
+        <w:t>The 0% gap differs from the 0.1–5% figures reported by Chang et al. (2000) and Woodside-</w:t>
+      </w:r>
+      <w:proofErr w:type="spellStart"/>
+      <w:r>
+        <w:t>Oriakhi</w:t>
+      </w:r>
+      <w:proofErr w:type="spellEnd"/>
+      <w:r>
+        <w:t xml:space="preserve"> et al. (2011), which is attributable to the relatively small N tested here. For the full CSE universe (N = 96), where B&amp;B becomes computationally intractable, the optimality gap would be expected to </w:t>
+      </w:r>
+      <w:proofErr w:type="gramStart"/>
+      <w:r>
+        <w:t>widen</w:t>
+      </w:r>
+      <w:proofErr w:type="gramEnd"/>
+      <w:r>
+        <w:t xml:space="preserve"> making GA hyperparameter </w:t>
+      </w:r>
+      <w:proofErr w:type="gramStart"/>
+      <w:r>
+        <w:t>tuning</w:t>
+      </w:r>
+      <w:proofErr w:type="gramEnd"/>
+      <w:r>
+        <w:t xml:space="preserve"> a meaningful direction for future work.</w:t>
+      </w:r>
+    </w:p>
+    <w:p/>
+    <w:p>
+      <w:pPr>
+        <w:spacing w:after="180" w:line="288" w:lineRule="auto"/>
+        <w:jc w:val="left"/>
+      </w:pPr>
+      <w:r>
+        <w:br w:type="page"/>
+      </w:r>
+    </w:p>
+    <w:p>
       <w:pPr>
         <w:pStyle w:val="Heading1"/>
       </w:pPr>
-      <w:bookmarkStart w:id="30" w:name="_Toc226495530"/>
-      <w:r>
+      <w:bookmarkStart w:id="30" w:name="_Toc226757961"/>
+      <w:r>
+        <w:lastRenderedPageBreak/>
         <w:t>Discussion</w:t>
       </w:r>
       <w:bookmarkEnd w:id="30"/>
@@ -9232,7 +10035,7 @@
         </w:numPr>
         <w:ind w:left="360" w:hanging="360"/>
       </w:pPr>
-      <w:bookmarkStart w:id="31" w:name="_Toc226495531"/>
+      <w:bookmarkStart w:id="31" w:name="_Toc226757962"/>
       <w:r>
         <w:t>7.1 Key Findings and Interpretation</w:t>
       </w:r>
@@ -9250,81 +10053,113 @@
       </w:r>
     </w:p>
     <w:p>
-      <w:r>
-        <w:t xml:space="preserve">• Finding 1. Solution Quality Trade-off: </w:t>
+      <w:pPr>
+        <w:rPr>
+          <w:b/>
+          <w:bCs/>
+        </w:rPr>
+      </w:pPr>
+      <w:r>
+        <w:t xml:space="preserve">• </w:t>
+      </w:r>
+      <w:r>
+        <w:rPr>
+          <w:b/>
+          <w:bCs/>
+        </w:rPr>
+        <w:t xml:space="preserve">Finding 1. Solution Quality Trade-off: </w:t>
       </w:r>
     </w:p>
     <w:p>
       <w:r>
-        <w:t xml:space="preserve">The GA discovered a superior portfolio (Sharpe 1.598 vs 1.014) within a constrained time budget. This is not an anomaly but a consequence of B&amp;B's sensitivity to the quality of its initial incumbent and the pruning depth. In production systems, a </w:t>
-      </w:r>
-      <w:proofErr w:type="gramStart"/>
-      <w:r>
-        <w:t>hybridization</w:t>
-      </w:r>
-      <w:r>
-        <w:t xml:space="preserve">  seeding</w:t>
-      </w:r>
-      <w:proofErr w:type="gramEnd"/>
-      <w:r>
-        <w:t xml:space="preserve"> B&amp;B with a GA-generated warm start</w:t>
-      </w:r>
-      <w:r>
-        <w:t xml:space="preserve">, </w:t>
-      </w:r>
-      <w:r>
-        <w:t>would likely combine the best of both approaches.</w:t>
+        <w:t>The GA achieved a superior Sharpe of 1.9072 versus B&amp;B's 1.8160 — a consequence of B&amp;B's time-limited tree traversal rather than any theoretical failure. The GA's 9,600 evaluations explored a wider search region, discovering Food &amp; Beverages and Energy sector combinations that B&amp;B's greedy-</w:t>
+      </w:r>
+      <w:r>
+        <w:t>initialized</w:t>
+      </w:r>
+      <w:r>
+        <w:t xml:space="preserve"> search missed. A hybrid approach seeding B&amp;B with a GA warm start would combine the strengths of both.</w:t>
       </w:r>
     </w:p>
     <w:p>
-      <w:r>
+      <w:pPr>
+        <w:rPr>
+          <w:b/>
+          <w:bCs/>
+        </w:rPr>
+      </w:pPr>
+      <w:r>
+        <w:rPr>
+          <w:b/>
+          <w:bCs/>
+        </w:rPr>
         <w:t xml:space="preserve">• Finding 2. Diversification Efficacy: </w:t>
       </w:r>
     </w:p>
     <w:p>
       <w:r>
-        <w:t xml:space="preserve">Both portfolios achieve a risk reduction relative to individual asset volatilities, confirming that the mean-variance </w:t>
-      </w:r>
-      <w:r>
-        <w:t>optimization</w:t>
-      </w:r>
-      <w:r>
-        <w:t xml:space="preserve"> framework remains applicable </w:t>
-      </w:r>
-      <w:proofErr w:type="gramStart"/>
-      <w:r>
-        <w:t>on</w:t>
-      </w:r>
-      <w:proofErr w:type="gramEnd"/>
-      <w:r>
-        <w:t xml:space="preserve"> the CSE despite its emerging-market characteristics. </w:t>
+        <w:t>Both portfolios lie well above the individual asset cloud on the risk-return plane, with the GA achieving 18.50% volatility at a 45.29% return</w:t>
+      </w:r>
+      <w:r>
+        <w:t>,</w:t>
+      </w:r>
+      <w:r>
+        <w:t xml:space="preserve"> unreachable by any single CSE stock. This confirms the mean-variance framework remains effective on the CSE despite its emerging-market characteristics.</w:t>
       </w:r>
     </w:p>
     <w:p>
       <w:r>
-        <w:lastRenderedPageBreak/>
-        <w:t xml:space="preserve">• Finding 3. Computational Scalability: </w:t>
+        <w:t xml:space="preserve">• </w:t>
+      </w:r>
+      <w:r>
+        <w:rPr>
+          <w:b/>
+          <w:bCs/>
+        </w:rPr>
+        <w:t>Finding 3. Computational Scalability:</w:t>
+      </w:r>
+      <w:r>
+        <w:t xml:space="preserve"> </w:t>
       </w:r>
     </w:p>
     <w:p>
       <w:r>
-        <w:t xml:space="preserve">For N &gt; 30, B&amp;B becomes impractical without supplementary cutting-plane constraints (e.g., valid inequalities, Lagrangian relaxations). The GA, however, can scale to the full 96-asset CSE universe with the same wall-clock budget, making it the practical choice for real time portfolio screening. </w:t>
+        <w:t xml:space="preserve">For N ≤ 25, both methods converge to identical solutions with an optimality gap of effectively 0% (floating point residuals of order 10⁻¹³), </w:t>
+      </w:r>
+      <w:r>
+        <w:t>cross validating</w:t>
+      </w:r>
+      <w:r>
+        <w:t xml:space="preserve"> both implementations. At N = 30, B&amp;B hit its time limit while the GA maintained solution quality. For the full 96-asset CSE universe, the GA is the only practical real-time option.</w:t>
       </w:r>
     </w:p>
     <w:p>
-      <w:r>
-        <w:t xml:space="preserve">• Finding 4. CSE Market Structure: </w:t>
+      <w:pPr>
+        <w:rPr>
+          <w:b/>
+          <w:bCs/>
+        </w:rPr>
+      </w:pPr>
+      <w:r>
+        <w:t xml:space="preserve">• </w:t>
+      </w:r>
+      <w:r>
+        <w:rPr>
+          <w:b/>
+          <w:bCs/>
+        </w:rPr>
+        <w:t xml:space="preserve">Finding 4. CSE Market Structure: </w:t>
       </w:r>
     </w:p>
     <w:p>
       <w:r>
-        <w:t>The prevalence of Banking &amp; Finance and Telecom stocks in both optimal portfolios reflects the structural dominance of these sectors on the CSE</w:t>
-      </w:r>
-      <w:r>
-        <w:t>:</w:t>
-      </w:r>
-      <w:r>
-        <w:t xml:space="preserve"> consistent with the exchange's historical composition and the relative liquidity of these blue-chip constituents.</w:t>
+        <w:t xml:space="preserve">Both portfolios share five common holdings </w:t>
+      </w:r>
+      <w:r>
+        <w:t>as</w:t>
+      </w:r>
+      <w:r>
+        <w:t xml:space="preserve"> CFVF, SFCL, GREG, GLAS, and HUNA spanning Banking, Diversified, Manufacturing, and Hotels sectors. Independent convergence across exact and heuristic methods confirms these assets genuinely dominate the CSE efficient frontier under the given constraints.</w:t>
       </w:r>
     </w:p>
     <w:p>
@@ -9336,7 +10171,7 @@
         </w:numPr>
         <w:ind w:left="360" w:hanging="360"/>
       </w:pPr>
-      <w:bookmarkStart w:id="32" w:name="_Toc226495532"/>
+      <w:bookmarkStart w:id="32" w:name="_Toc226757963"/>
       <w:r>
         <w:t>7.</w:t>
       </w:r>
@@ -9353,35 +10188,105 @@
     </w:p>
     <w:p/>
     <w:p>
-      <w:r>
-        <w:t>• Single-Period Model: the Markowitz framework assumes a static return distribution. In practice, CSE returns exhibit non-stationarity</w:t>
-      </w:r>
-      <w:r>
-        <w:t>,</w:t>
-      </w:r>
-      <w:r>
-        <w:t xml:space="preserve"> the post-crisis recovery of 2023–2024 represents a structural regime shift that a single-period model cannot capture. </w:t>
+      <w:pPr>
+        <w:rPr>
+          <w:b/>
+          <w:bCs/>
+        </w:rPr>
+      </w:pPr>
+      <w:r>
+        <w:rPr>
+          <w:b/>
+          <w:bCs/>
+        </w:rPr>
+        <w:t>• Single-Period Model:</w:t>
       </w:r>
     </w:p>
     <w:p>
       <w:r>
-        <w:t xml:space="preserve">• Historical Return Estimation: expected returns estimated from historical data are notoriously noisy. The Black-Litterman model (Black &amp; Litterman, 1992), which blends historical data with investor views, would provide more robust return estimates. </w:t>
+        <w:t>T</w:t>
+      </w:r>
+      <w:r>
+        <w:t>he Markowitz framework assumes a static return distribution. In practice, CSE returns exhibit non-stationarity</w:t>
+      </w:r>
+      <w:r>
+        <w:t>,</w:t>
+      </w:r>
+      <w:r>
+        <w:t xml:space="preserve"> the post-crisis recovery of 2023–2024 represents a structural regime shift that a single-period model cannot capture. </w:t>
       </w:r>
     </w:p>
     <w:p>
       <w:r>
-        <w:t xml:space="preserve">• Transaction Costs and Liquidity: the model does not </w:t>
-      </w:r>
-      <w:r>
-        <w:t>penalize</w:t>
-      </w:r>
-      <w:r>
-        <w:t xml:space="preserve"> turnover or account for bid-ask spreads. For the CSE, where several mid-cap stocks have limited daily trading volume, liquidity constraints are a material consideration. </w:t>
+        <w:t xml:space="preserve">• </w:t>
+      </w:r>
+      <w:r>
+        <w:rPr>
+          <w:b/>
+          <w:bCs/>
+        </w:rPr>
+        <w:t>Historical Return Estimation:</w:t>
+      </w:r>
+      <w:r>
+        <w:t xml:space="preserve"> </w:t>
       </w:r>
     </w:p>
     <w:p>
       <w:r>
-        <w:t>• Short-Selling Excluded: the long-only constraint (C5) prevents certain arbitrage and hedging strategies that sophisticated investors employ. Relaxing this constraint would expand the Pareto frontier but require margin account access unavailable to retail traders</w:t>
+        <w:lastRenderedPageBreak/>
+        <w:t>E</w:t>
+      </w:r>
+      <w:r>
+        <w:t xml:space="preserve">xpected returns estimated from historical data are notoriously noisy. The Black-Litterman model (Black &amp; Litterman, 1992), which blends historical data with investor views, would provide more robust return estimates. </w:t>
+      </w:r>
+    </w:p>
+    <w:p>
+      <w:r>
+        <w:t xml:space="preserve">• </w:t>
+      </w:r>
+      <w:r>
+        <w:rPr>
+          <w:b/>
+          <w:bCs/>
+        </w:rPr>
+        <w:t>Transaction Costs and Liquidity:</w:t>
+      </w:r>
+      <w:r>
+        <w:t xml:space="preserve"> </w:t>
+      </w:r>
+    </w:p>
+    <w:p>
+      <w:r>
+        <w:t>T</w:t>
+      </w:r>
+      <w:r>
+        <w:t xml:space="preserve">he model does not </w:t>
+      </w:r>
+      <w:r>
+        <w:t>penalize</w:t>
+      </w:r>
+      <w:r>
+        <w:t xml:space="preserve"> turnover or account for bid-ask spreads. For the CSE, where several mid-cap stocks have limited daily trading volume, liquidity constraints are a material consideration. </w:t>
+      </w:r>
+    </w:p>
+    <w:p>
+      <w:r>
+        <w:rPr>
+          <w:b/>
+          <w:bCs/>
+        </w:rPr>
+        <w:t>• Short-Selling Excluded:</w:t>
+      </w:r>
+      <w:r>
+        <w:t xml:space="preserve"> </w:t>
+      </w:r>
+    </w:p>
+    <w:p>
+      <w:r>
+        <w:t>T</w:t>
+      </w:r>
+      <w:r>
+        <w:t>he long-only constraint (C5) prevents certain arbitrage and hedging strategies that sophisticated investors employ. Relaxing this constraint would expand the Pareto frontier but require margin account access unavailable to retail traders</w:t>
       </w:r>
     </w:p>
     <w:p/>
@@ -9393,7 +10298,7 @@
           <w:numId w:val="30"/>
         </w:numPr>
       </w:pPr>
-      <w:bookmarkStart w:id="33" w:name="_Toc226495533"/>
+      <w:bookmarkStart w:id="33" w:name="_Toc226757964"/>
       <w:r>
         <w:t>Future Directions</w:t>
       </w:r>
@@ -9423,7 +10328,22 @@
         <w:t>Multi-Period Rebalancing</w:t>
       </w:r>
       <w:r>
-        <w:t>: extending the model to a multi-period setting with turnover costs would produce portfolios robust to transaction-cost drag</w:t>
+        <w:t xml:space="preserve">: </w:t>
+      </w:r>
+    </w:p>
+    <w:p>
+      <w:pPr>
+        <w:pStyle w:val="ListParagraph"/>
+      </w:pPr>
+      <w:r>
+        <w:rPr>
+          <w:b/>
+          <w:bCs/>
+        </w:rPr>
+        <w:t>E</w:t>
+      </w:r>
+      <w:r>
+        <w:t>xtending the model to a multi-period setting with turnover costs would produce portfolios robust to transaction-cost drag</w:t>
       </w:r>
       <w:r>
         <w:t>,</w:t>
@@ -9431,6 +10351,11 @@
       <w:r>
         <w:t xml:space="preserve"> a significant practical consideration for quarterly rebalancing on the CSE. </w:t>
       </w:r>
+    </w:p>
+    <w:p>
+      <w:pPr>
+        <w:pStyle w:val="ListParagraph"/>
+      </w:pPr>
     </w:p>
     <w:p>
       <w:pPr>
@@ -9455,8 +10380,28 @@
         <w:t>Optimization</w:t>
       </w:r>
       <w:r>
-        <w:t xml:space="preserve">: replacing point estimates of μ and Σ with uncertainty sets (e.g., ellipsoidal uncertainty, factor model shrinkage) would produce portfolios robust to estimation error, a major source of instability in classical Markowitz. </w:t>
-      </w:r>
+        <w:t xml:space="preserve">: </w:t>
+      </w:r>
+    </w:p>
+    <w:p>
+      <w:pPr>
+        <w:pStyle w:val="ListParagraph"/>
+      </w:pPr>
+      <w:r>
+        <w:rPr>
+          <w:b/>
+          <w:bCs/>
+        </w:rPr>
+        <w:t>R</w:t>
+      </w:r>
+      <w:r>
+        <w:t xml:space="preserve">eplacing point estimates of μ and Σ with uncertainty sets (e.g., ellipsoidal uncertainty, factor model shrinkage) would produce portfolios robust to estimation error, a major source of instability in classical Markowitz. </w:t>
+      </w:r>
+    </w:p>
+    <w:p>
+      <w:pPr>
+        <w:pStyle w:val="ListParagraph"/>
+      </w:pPr>
     </w:p>
     <w:p>
       <w:pPr>
@@ -9474,7 +10419,18 @@
         <w:t>Deep Learning Integration:</w:t>
       </w:r>
       <w:r>
-        <w:t xml:space="preserve"> a Temporal Convolutional Network or LSTM model could replace the historical mean estimator with a predictive return forecast, feeding into the </w:t>
+        <w:t xml:space="preserve"> </w:t>
+      </w:r>
+    </w:p>
+    <w:p>
+      <w:pPr>
+        <w:pStyle w:val="ListParagraph"/>
+      </w:pPr>
+      <w:r>
+        <w:t>A</w:t>
+      </w:r>
+      <w:r>
+        <w:t xml:space="preserve"> Temporal Convolutional Network or LSTM model could replace the historical mean estimator with a predictive return forecast, feeding into the </w:t>
       </w:r>
       <w:r>
         <w:t>optimization</w:t>
@@ -9482,6 +10438,11 @@
       <w:r>
         <w:t xml:space="preserve"> model as an improved μ vector. </w:t>
       </w:r>
+    </w:p>
+    <w:p>
+      <w:pPr>
+        <w:pStyle w:val="ListParagraph"/>
+      </w:pPr>
     </w:p>
     <w:p>
       <w:pPr>
@@ -9496,12 +10457,27 @@
           <w:b/>
           <w:bCs/>
         </w:rPr>
-        <w:lastRenderedPageBreak/>
         <w:t>Hybrid Exact-Heuristic Algorithm:</w:t>
       </w:r>
       <w:r>
-        <w:t xml:space="preserve"> seeding B&amp;B with a GA-generated incumbent and combining B&amp;B's pruning with GA's diversification could deliver near-optimal solutions orders of magnitude faster than pure B&amp;B</w:t>
-      </w:r>
+        <w:t xml:space="preserve"> </w:t>
+      </w:r>
+    </w:p>
+    <w:p>
+      <w:pPr>
+        <w:pStyle w:val="ListParagraph"/>
+      </w:pPr>
+      <w:r>
+        <w:t>S</w:t>
+      </w:r>
+      <w:r>
+        <w:t>eeding B&amp;B with a GA-generated incumbent and combining B&amp;B's pruning with GA's diversification could deliver near-optimal solutions orders of magnitude faster than pure B&amp;B</w:t>
+      </w:r>
+    </w:p>
+    <w:p>
+      <w:pPr>
+        <w:pStyle w:val="ListParagraph"/>
+      </w:pPr>
     </w:p>
     <w:p>
       <w:pPr>
@@ -9519,7 +10495,18 @@
         <w:t>Real-Time Deployment:</w:t>
       </w:r>
       <w:r>
-        <w:t xml:space="preserve"> packaging the pipeline as a RESTful API</w:t>
+        <w:t xml:space="preserve"> </w:t>
+      </w:r>
+    </w:p>
+    <w:p>
+      <w:pPr>
+        <w:pStyle w:val="ListParagraph"/>
+      </w:pPr>
+      <w:r>
+        <w:t>P</w:t>
+      </w:r>
+      <w:r>
+        <w:t>ackaging the pipeline as a RESTful API</w:t>
       </w:r>
       <w:r>
         <w:t>,</w:t>
@@ -9533,6 +10520,11 @@
       <w:r>
         <w:t xml:space="preserve"> would directly serve the intended audience of Sri Lankan retail investors. </w:t>
       </w:r>
+    </w:p>
+    <w:p>
+      <w:pPr>
+        <w:pStyle w:val="ListParagraph"/>
+      </w:pPr>
     </w:p>
     <w:p>
       <w:pPr>
@@ -9550,34 +10542,54 @@
         <w:t>Extended Metaheuristic Comparison:</w:t>
       </w:r>
       <w:r>
-        <w:t xml:space="preserve"> benchmarking the GA against Simulated Annealing, Particle Swarm </w:t>
-      </w:r>
-      <w:r>
-        <w:t>Optimization</w:t>
-      </w:r>
-      <w:r>
-        <w:t xml:space="preserve">, and Ant Colony </w:t>
-      </w:r>
-      <w:r>
-        <w:t>Optimization</w:t>
-      </w:r>
-      <w:r>
-        <w:t xml:space="preserve"> on the same CSE dataset would provide a comprehensive </w:t>
-      </w:r>
-      <w:r>
-        <w:t>characterization</w:t>
-      </w:r>
-      <w:r>
-        <w:t xml:space="preserve"> of the metaheuristic landscape for this problem class</w:t>
+        <w:t xml:space="preserve"> </w:t>
       </w:r>
     </w:p>
     <w:p>
       <w:pPr>
+        <w:pStyle w:val="ListParagraph"/>
+      </w:pPr>
+      <w:r>
+        <w:lastRenderedPageBreak/>
+        <w:t>B</w:t>
+      </w:r>
+      <w:r>
+        <w:t xml:space="preserve">enchmarking the GA against Simulated Annealing, Particle Swarm </w:t>
+      </w:r>
+      <w:r>
+        <w:t>Optimization</w:t>
+      </w:r>
+      <w:r>
+        <w:t xml:space="preserve">, and Ant Colony </w:t>
+      </w:r>
+      <w:r>
+        <w:t>Optimization</w:t>
+      </w:r>
+      <w:r>
+        <w:t xml:space="preserve"> on the same CSE dataset would provide a comprehensive </w:t>
+      </w:r>
+      <w:r>
+        <w:t>characterization</w:t>
+      </w:r>
+      <w:r>
+        <w:t xml:space="preserve"> of the metaheuristic landscape for this problem class</w:t>
+      </w:r>
+    </w:p>
+    <w:p>
+      <w:pPr>
+        <w:pStyle w:val="ListParagraph"/>
+      </w:pPr>
+    </w:p>
+    <w:p>
+      <w:pPr>
         <w:pStyle w:val="Heading1"/>
       </w:pPr>
-      <w:bookmarkStart w:id="34" w:name="_Toc226495534"/>
+      <w:bookmarkStart w:id="34" w:name="_Toc226757965"/>
       <w:r>
         <w:t>Contribution</w:t>
+      </w:r>
+      <w:r>
+        <w:t xml:space="preserve"> &amp; Git Repository</w:t>
       </w:r>
       <w:bookmarkEnd w:id="34"/>
     </w:p>
@@ -9604,8 +10616,24 @@
         <w:t xml:space="preserve"> dataset selection, data pipeline implementation, and report &amp; discussion.</w:t>
       </w:r>
     </w:p>
+    <w:p>
+      <w:r>
+        <w:t xml:space="preserve">Please find the Git Repository </w:t>
+      </w:r>
+      <w:hyperlink r:id="rId26" w:history="1">
+        <w:r>
+          <w:rPr>
+            <w:rStyle w:val="Hyperlink"/>
+          </w:rPr>
+          <w:t>here</w:t>
+        </w:r>
+      </w:hyperlink>
+      <w:r>
+        <w:t>.</w:t>
+      </w:r>
+    </w:p>
     <w:sectPr>
-      <w:footerReference w:type="default" r:id="rId25"/>
+      <w:footerReference w:type="default" r:id="rId27"/>
       <w:pgSz w:w="12240" w:h="15840" w:code="1"/>
       <w:pgMar w:top="1440" w:right="1440" w:bottom="720" w:left="1440" w:header="720" w:footer="288" w:gutter="0"/>
       <w:pgBorders w:offsetFrom="page">
@@ -12782,6 +13810,18 @@
         <w:shd w:val="clear" w:color="auto" w:fill="EAF8FB" w:themeFill="accent3" w:themeFillTint="33"/>
       </w:tcPr>
     </w:tblStylePr>
+  </w:style>
+  <w:style w:type="character" w:styleId="UnresolvedMention">
+    <w:name w:val="Unresolved Mention"/>
+    <w:basedOn w:val="DefaultParagraphFont"/>
+    <w:uiPriority w:val="99"/>
+    <w:semiHidden/>
+    <w:unhideWhenUsed/>
+    <w:rsid w:val="00CD65C9"/>
+    <w:rPr>
+      <w:color w:val="605E5C"/>
+      <w:shd w:val="clear" w:color="auto" w:fill="E1DFDD"/>
+    </w:rPr>
   </w:style>
 </w:styles>
 </file>

</xml_diff>